<commit_message>
Utworzenie pierwszego testu systemowego - sprawdzania poprawnego uruchomienia procesu aplikacji i kodu wyjścia
</commit_message>
<xml_diff>
--- a/Testowanie aplikacji - Marcin_Migacz_5P2.docx
+++ b/Testowanie aplikacji - Marcin_Migacz_5P2.docx
@@ -283,20 +283,8 @@
           <w:sz w:val="28"/>
           <w:szCs w:val="28"/>
         </w:rPr>
-        <w:t xml:space="preserve">NOWY SĄCZ </w:t>
-      </w:r>
-      <w:proofErr w:type="gramStart"/>
-      <w:r>
-        <w:rPr>
-          <w:rFonts w:asciiTheme="majorHAnsi" w:hAnsiTheme="majorHAnsi"/>
-          <w:b/>
-          <w:bCs/>
-          <w:sz w:val="28"/>
-          <w:szCs w:val="28"/>
-        </w:rPr>
-        <w:t>2026r.</w:t>
-      </w:r>
-      <w:proofErr w:type="gramEnd"/>
+        <w:t>NOWY SĄCZ 2026r.</w:t>
+      </w:r>
     </w:p>
     <w:p>
       <w:pPr>
@@ -1296,23 +1284,7 @@
         <w:ind w:firstLine="360"/>
       </w:pPr>
       <w:r>
-        <w:t xml:space="preserve">Testowanie oprogramowania to proces </w:t>
-      </w:r>
-      <w:proofErr w:type="gramStart"/>
-      <w:r>
-        <w:t>sprawdzania,</w:t>
-      </w:r>
-      <w:proofErr w:type="gramEnd"/>
-      <w:r>
-        <w:t xml:space="preserve"> czy program działa zgodnie z </w:t>
-      </w:r>
-      <w:proofErr w:type="gramStart"/>
-      <w:r>
-        <w:t>wymaganiami,</w:t>
-      </w:r>
-      <w:proofErr w:type="gramEnd"/>
-      <w:r>
-        <w:t xml:space="preserve"> oraz wykrywania w nim błędów przed przekazaniem go użytkownikom. Błąd (defekt) to wada w kodzie, która może doprowadzić do awarii, czyli widocznego niepoprawnego działania systemu. Celem testowania jest nie tylko znajdowanie usterek, ale też ograniczanie ryzyka jego wdrożenia. Ze względu na poziom wyróżnia się testy jednostkowe, integracyjne, systemowe i akceptacyjne, które sprawdzają kolejno pojedyncze elementy, ich współpracę, cały system oraz zgodność z oczekiwaniami klienta. Ze względu na cel dzielimy je na funkcjonalne (co system robi) i niefunkcjonalne (jak działa: wydajność, bezpieczeństwo, użyteczność), a osobną grupę stanowią testy regresyjne, które po zmianach w kodzie sprawdzają, czy nie zepsuto istniejących funkcji. Wyróżnia się też podejścia czarnej skrzynki (bez znajomości kodu), białej skrzynki (z analizą wnętrza programu) i szarej skrzynki (mieszane). Pierwsza zasada testowania mówi, że testy ujawniają obecność błędów, ale nie dowodzą ich braku. Druga głosi, że testowanie wyczerpujące jest niemożliwe, więc wysiłek kieruje się na obszary o największym ryzyku. Trzecia zasada to wczesne testowanie, bo błąd znaleziony na etapie projektu kosztuje znacznie mniej niż ten znaleziony po wdrożeniu. Kolejne zasady mówią, że defekty grupują się w niewielu modułach, a wielokrotne uruchamianie tych samych testów przestaje wykrywać nowe błędy. Ostatnie zasady to zależność testów od kontekstu oraz złudzenie braku błędów: program bez usterek nadal nie jest wartościowy, jeśli nie spełnia potrzeb użytkownika. Proces testowy zaczyna się od planowania i nadzoru, czyli określenia zakresu, zasobów i kryteriów zakończenia. Następnie następuje analiza i projektowanie testów, w których powstają przypadki testowe z danymi wejściowymi i oczekiwanymi wynikami. Potem testy są implementowane i wykonywane, a wyniki rzeczywiste porównuje się z oczekiwanymi, po czym raportuje się znalezione błędy, wykonuje retesty po poprawkach i zamyka proces podsumowaniem.</w:t>
+        <w:t>Testowanie oprogramowania to proces sprawdzania, czy program działa zgodnie z wymaganiami, oraz wykrywania w nim błędów przed przekazaniem go użytkownikom. Błąd (defekt) to wada w kodzie, która może doprowadzić do awarii, czyli widocznego niepoprawnego działania systemu. Celem testowania jest nie tylko znajdowanie usterek, ale też ograniczanie ryzyka jego wdrożenia. Ze względu na poziom wyróżnia się testy jednostkowe, integracyjne, systemowe i akceptacyjne, które sprawdzają kolejno pojedyncze elementy, ich współpracę, cały system oraz zgodność z oczekiwaniami klienta. Ze względu na cel dzielimy je na funkcjonalne (co system robi) i niefunkcjonalne (jak działa: wydajność, bezpieczeństwo, użyteczność), a osobną grupę stanowią testy regresyjne, które po zmianach w kodzie sprawdzają, czy nie zepsuto istniejących funkcji. Wyróżnia się też podejścia czarnej skrzynki (bez znajomości kodu), białej skrzynki (z analizą wnętrza programu) i szarej skrzynki (mieszane). Pierwsza zasada testowania mówi, że testy ujawniają obecność błędów, ale nie dowodzą ich braku. Druga głosi, że testowanie wyczerpujące jest niemożliwe, więc wysiłek kieruje się na obszary o największym ryzyku. Trzecia zasada to wczesne testowanie, bo błąd znaleziony na etapie projektu kosztuje znacznie mniej niż ten znaleziony po wdrożeniu. Kolejne zasady mówią, że defekty grupują się w niewielu modułach, a wielokrotne uruchamianie tych samych testów przestaje wykrywać nowe błędy. Ostatnie zasady to zależność testów od kontekstu oraz złudzenie braku błędów: program bez usterek nadal nie jest wartościowy, jeśli nie spełnia potrzeb użytkownika. Proces testowy zaczyna się od planowania i nadzoru, czyli określenia zakresu, zasobów i kryteriów zakończenia. Następnie następuje analiza i projektowanie testów, w których powstają przypadki testowe z danymi wejściowymi i oczekiwanymi wynikami. Potem testy są implementowane i wykonywane, a wyniki rzeczywiste porównuje się z oczekiwanymi, po czym raportuje się znalezione błędy, wykonuje retesty po poprawkach i zamyka proces podsumowaniem.</w:t>
       </w:r>
     </w:p>
     <w:p>
@@ -2028,7 +2000,6 @@
         </w:rPr>
       </w:pPr>
       <w:proofErr w:type="spellStart"/>
-      <w:proofErr w:type="gramStart"/>
       <w:r>
         <w:rPr>
           <w:rFonts w:asciiTheme="majorHAnsi" w:hAnsiTheme="majorHAnsi"/>
@@ -2040,7 +2011,6 @@
         <w:t>int.TryParse</w:t>
       </w:r>
       <w:proofErr w:type="spellEnd"/>
-      <w:proofErr w:type="gramEnd"/>
       <w:r>
         <w:rPr>
           <w:rFonts w:asciiTheme="majorHAnsi" w:hAnsiTheme="majorHAnsi"/>
@@ -2096,7 +2066,6 @@
         <w:t xml:space="preserve"> </w:t>
       </w:r>
       <w:proofErr w:type="spellStart"/>
-      <w:proofErr w:type="gramStart"/>
       <w:r>
         <w:rPr>
           <w:rFonts w:asciiTheme="majorHAnsi" w:hAnsiTheme="majorHAnsi"/>
@@ -2131,15 +2100,7 @@
           <w:rFonts w:asciiTheme="majorHAnsi" w:hAnsiTheme="majorHAnsi"/>
           <w:szCs w:val="22"/>
         </w:rPr>
-        <w:t xml:space="preserve"> -</w:t>
-      </w:r>
-      <w:proofErr w:type="gramEnd"/>
-      <w:r>
-        <w:rPr>
-          <w:rFonts w:asciiTheme="majorHAnsi" w:hAnsiTheme="majorHAnsi"/>
-          <w:szCs w:val="22"/>
-        </w:rPr>
-        <w:t xml:space="preserve"> wczytuje tekst z klawiatury i próbuje zamienić go na liczbę całkowitą. Jeśli się uda, zwraca </w:t>
+        <w:t xml:space="preserve"> - wczytuje tekst z klawiatury i próbuje zamienić go na liczbę całkowitą. Jeśli się uda, zwraca </w:t>
       </w:r>
       <w:proofErr w:type="spellStart"/>
       <w:r>
@@ -2260,7 +2221,6 @@
         <w:t xml:space="preserve"> </w:t>
       </w:r>
       <w:proofErr w:type="spellStart"/>
-      <w:proofErr w:type="gramStart"/>
       <w:r>
         <w:rPr>
           <w:rFonts w:asciiTheme="majorHAnsi" w:hAnsiTheme="majorHAnsi"/>
@@ -2283,7 +2243,6 @@
         <w:t>[</w:t>
       </w:r>
       <w:proofErr w:type="spellStart"/>
-      <w:proofErr w:type="gramEnd"/>
       <w:r>
         <w:rPr>
           <w:rFonts w:asciiTheme="majorHAnsi" w:hAnsiTheme="majorHAnsi"/>
@@ -2360,26 +2319,9 @@
           <w:rFonts w:asciiTheme="majorHAnsi" w:hAnsiTheme="majorHAnsi"/>
           <w:szCs w:val="22"/>
         </w:rPr>
-        <w:t>Pętla zewnętrzna for (</w:t>
-      </w:r>
-      <w:proofErr w:type="gramStart"/>
-      <w:r>
-        <w:rPr>
-          <w:rFonts w:asciiTheme="majorHAnsi" w:hAnsiTheme="majorHAnsi"/>
-          <w:szCs w:val="22"/>
-        </w:rPr>
-        <w:t>i...</w:t>
-      </w:r>
-      <w:proofErr w:type="gramEnd"/>
-      <w:r>
-        <w:rPr>
-          <w:rFonts w:asciiTheme="majorHAnsi" w:hAnsiTheme="majorHAnsi"/>
-          <w:szCs w:val="22"/>
-        </w:rPr>
-        <w:t xml:space="preserve">) wykonuje się raz dla każdego zestawu. W każdym obiegu wywołuje </w:t>
+        <w:t xml:space="preserve">Pętla zewnętrzna for (i...) wykonuje się raz dla każdego zestawu. W każdym obiegu wywołuje </w:t>
       </w:r>
       <w:proofErr w:type="spellStart"/>
-      <w:proofErr w:type="gramStart"/>
       <w:r>
         <w:rPr>
           <w:rFonts w:asciiTheme="majorHAnsi" w:hAnsiTheme="majorHAnsi"/>
@@ -2393,15 +2335,7 @@
           <w:rFonts w:asciiTheme="majorHAnsi" w:hAnsiTheme="majorHAnsi"/>
           <w:szCs w:val="22"/>
         </w:rPr>
-        <w:t>(</w:t>
-      </w:r>
-      <w:proofErr w:type="gramEnd"/>
-      <w:r>
-        <w:rPr>
-          <w:rFonts w:asciiTheme="majorHAnsi" w:hAnsiTheme="majorHAnsi"/>
-          <w:szCs w:val="22"/>
-        </w:rPr>
-        <w:t>), która zwraca 6-elementową tablicę.</w:t>
+        <w:t>(), która zwraca 6-elementową tablicę.</w:t>
       </w:r>
     </w:p>
     <w:p>
@@ -2421,23 +2355,7 @@
           <w:rFonts w:asciiTheme="majorHAnsi" w:hAnsiTheme="majorHAnsi"/>
           <w:szCs w:val="22"/>
         </w:rPr>
-        <w:t>Pętla wewnętrzna for (</w:t>
-      </w:r>
-      <w:proofErr w:type="gramStart"/>
-      <w:r>
-        <w:rPr>
-          <w:rFonts w:asciiTheme="majorHAnsi" w:hAnsiTheme="majorHAnsi"/>
-          <w:szCs w:val="22"/>
-        </w:rPr>
-        <w:t>j...</w:t>
-      </w:r>
-      <w:proofErr w:type="gramEnd"/>
-      <w:r>
-        <w:rPr>
-          <w:rFonts w:asciiTheme="majorHAnsi" w:hAnsiTheme="majorHAnsi"/>
-          <w:szCs w:val="22"/>
-        </w:rPr>
-        <w:t>) przepisuje 6 wylosowanych liczb do wiersza i tablicy losowania.</w:t>
+        <w:t>Pętla wewnętrzna for (j...) przepisuje 6 wylosowanych liczb do wiersza i tablicy losowania.</w:t>
       </w:r>
     </w:p>
     <w:p>
@@ -2453,7 +2371,6 @@
         </w:rPr>
       </w:pPr>
       <w:proofErr w:type="spellStart"/>
-      <w:proofErr w:type="gramStart"/>
       <w:r>
         <w:rPr>
           <w:rFonts w:asciiTheme="majorHAnsi" w:hAnsiTheme="majorHAnsi"/>
@@ -2476,7 +2393,6 @@
         <w:t>(</w:t>
       </w:r>
       <w:proofErr w:type="spellStart"/>
-      <w:proofErr w:type="gramEnd"/>
       <w:r>
         <w:rPr>
           <w:rFonts w:asciiTheme="majorHAnsi" w:hAnsiTheme="majorHAnsi"/>
@@ -2613,7 +2529,6 @@
         <w:t xml:space="preserve">Funkcja </w:t>
       </w:r>
       <w:proofErr w:type="spellStart"/>
-      <w:proofErr w:type="gramStart"/>
       <w:r>
         <w:rPr>
           <w:rFonts w:asciiTheme="majorHAnsi" w:hAnsiTheme="majorHAnsi"/>
@@ -2631,23 +2546,13 @@
           <w:bCs/>
           <w:color w:val="BF4E14" w:themeColor="accent2" w:themeShade="BF"/>
         </w:rPr>
-        <w:t>(</w:t>
-      </w:r>
-      <w:proofErr w:type="gramEnd"/>
-      <w:r>
-        <w:rPr>
-          <w:rFonts w:asciiTheme="majorHAnsi" w:hAnsiTheme="majorHAnsi"/>
-          <w:b/>
-          <w:bCs/>
+        <w:t>()</w:t>
+      </w:r>
+      <w:r>
+        <w:rPr>
+          <w:rFonts w:asciiTheme="majorHAnsi" w:hAnsiTheme="majorHAnsi"/>
           <w:color w:val="BF4E14" w:themeColor="accent2" w:themeShade="BF"/>
         </w:rPr>
-        <w:t>)</w:t>
-      </w:r>
-      <w:r>
-        <w:rPr>
-          <w:rFonts w:asciiTheme="majorHAnsi" w:hAnsiTheme="majorHAnsi"/>
-          <w:color w:val="BF4E14" w:themeColor="accent2" w:themeShade="BF"/>
-        </w:rPr>
         <w:t xml:space="preserve"> </w:t>
       </w:r>
       <w:r>
@@ -2664,7 +2569,6 @@
         <w:t xml:space="preserve">losuje jeden zestaw 6 różnych liczb z przedziału 1–49. Nie przyjmuje argumentów i zwraca tablicę </w:t>
       </w:r>
       <w:proofErr w:type="spellStart"/>
-      <w:proofErr w:type="gramStart"/>
       <w:r>
         <w:rPr>
           <w:rFonts w:asciiTheme="majorHAnsi" w:hAnsiTheme="majorHAnsi"/>
@@ -2678,15 +2582,7 @@
           <w:rFonts w:asciiTheme="majorHAnsi" w:hAnsiTheme="majorHAnsi"/>
           <w:lang w:eastAsia="pl-PL"/>
         </w:rPr>
-        <w:t>[</w:t>
-      </w:r>
-      <w:proofErr w:type="gramEnd"/>
-      <w:r>
-        <w:rPr>
-          <w:rFonts w:asciiTheme="majorHAnsi" w:hAnsiTheme="majorHAnsi"/>
-          <w:lang w:eastAsia="pl-PL"/>
-        </w:rPr>
-        <w:t>] z wylosowanymi liczbami.</w:t>
+        <w:t>[] z wylosowanymi liczbami.</w:t>
       </w:r>
     </w:p>
     <w:p>
@@ -2703,7 +2599,6 @@
         </w:rPr>
       </w:pPr>
       <w:proofErr w:type="spellStart"/>
-      <w:proofErr w:type="gramStart"/>
       <w:r>
         <w:rPr>
           <w:rFonts w:asciiTheme="majorHAnsi" w:hAnsiTheme="majorHAnsi"/>
@@ -2725,9 +2620,57 @@
           <w:szCs w:val="22"/>
           <w:lang w:eastAsia="pl-PL"/>
         </w:rPr>
+        <w:t xml:space="preserve">[] zestaw = </w:t>
+      </w:r>
+      <w:proofErr w:type="spellStart"/>
+      <w:r>
+        <w:rPr>
+          <w:rFonts w:asciiTheme="majorHAnsi" w:hAnsiTheme="majorHAnsi"/>
+          <w:b/>
+          <w:bCs/>
+          <w:color w:val="BF4E14" w:themeColor="accent2" w:themeShade="BF"/>
+          <w:szCs w:val="22"/>
+          <w:lang w:eastAsia="pl-PL"/>
+        </w:rPr>
+        <w:t>new</w:t>
+      </w:r>
+      <w:proofErr w:type="spellEnd"/>
+      <w:r>
+        <w:rPr>
+          <w:rFonts w:asciiTheme="majorHAnsi" w:hAnsiTheme="majorHAnsi"/>
+          <w:b/>
+          <w:bCs/>
+          <w:color w:val="BF4E14" w:themeColor="accent2" w:themeShade="BF"/>
+          <w:szCs w:val="22"/>
+          <w:lang w:eastAsia="pl-PL"/>
+        </w:rPr>
+        <w:t xml:space="preserve"> </w:t>
+      </w:r>
+      <w:proofErr w:type="spellStart"/>
+      <w:r>
+        <w:rPr>
+          <w:rFonts w:asciiTheme="majorHAnsi" w:hAnsiTheme="majorHAnsi"/>
+          <w:b/>
+          <w:bCs/>
+          <w:color w:val="BF4E14" w:themeColor="accent2" w:themeShade="BF"/>
+          <w:szCs w:val="22"/>
+          <w:lang w:eastAsia="pl-PL"/>
+        </w:rPr>
+        <w:t>int</w:t>
+      </w:r>
+      <w:proofErr w:type="spellEnd"/>
+      <w:r>
+        <w:rPr>
+          <w:rFonts w:asciiTheme="majorHAnsi" w:hAnsiTheme="majorHAnsi"/>
+          <w:b/>
+          <w:bCs/>
+          <w:color w:val="BF4E14" w:themeColor="accent2" w:themeShade="BF"/>
+          <w:szCs w:val="22"/>
+          <w:lang w:eastAsia="pl-PL"/>
+        </w:rPr>
         <w:t>[</w:t>
       </w:r>
-      <w:proofErr w:type="gramEnd"/>
+      <w:proofErr w:type="spellStart"/>
       <w:r>
         <w:rPr>
           <w:rFonts w:asciiTheme="majorHAnsi" w:hAnsiTheme="majorHAnsi"/>
@@ -2737,9 +2680,9 @@
           <w:szCs w:val="22"/>
           <w:lang w:eastAsia="pl-PL"/>
         </w:rPr>
-        <w:t xml:space="preserve">] zestaw = </w:t>
-      </w:r>
-      <w:proofErr w:type="spellStart"/>
+        <w:t>LiczbWZestawie</w:t>
+      </w:r>
+      <w:proofErr w:type="spellEnd"/>
       <w:r>
         <w:rPr>
           <w:rFonts w:asciiTheme="majorHAnsi" w:hAnsiTheme="majorHAnsi"/>
@@ -2749,103 +2692,33 @@
           <w:szCs w:val="22"/>
           <w:lang w:eastAsia="pl-PL"/>
         </w:rPr>
-        <w:t>new</w:t>
-      </w:r>
-      <w:proofErr w:type="spellEnd"/>
-      <w:r>
-        <w:rPr>
-          <w:rFonts w:asciiTheme="majorHAnsi" w:hAnsiTheme="majorHAnsi"/>
-          <w:b/>
-          <w:bCs/>
+        <w:t>]</w:t>
+      </w:r>
+      <w:r>
+        <w:rPr>
+          <w:rFonts w:asciiTheme="majorHAnsi" w:hAnsiTheme="majorHAnsi"/>
           <w:color w:val="BF4E14" w:themeColor="accent2" w:themeShade="BF"/>
           <w:szCs w:val="22"/>
           <w:lang w:eastAsia="pl-PL"/>
         </w:rPr>
         <w:t xml:space="preserve"> </w:t>
       </w:r>
-      <w:proofErr w:type="spellStart"/>
-      <w:proofErr w:type="gramStart"/>
-      <w:r>
-        <w:rPr>
-          <w:rFonts w:asciiTheme="majorHAnsi" w:hAnsiTheme="majorHAnsi"/>
-          <w:b/>
-          <w:bCs/>
+      <w:r>
+        <w:rPr>
+          <w:rFonts w:asciiTheme="majorHAnsi" w:hAnsiTheme="majorHAnsi"/>
           <w:color w:val="BF4E14" w:themeColor="accent2" w:themeShade="BF"/>
           <w:szCs w:val="22"/>
           <w:lang w:eastAsia="pl-PL"/>
         </w:rPr>
-        <w:t>int</w:t>
-      </w:r>
-      <w:proofErr w:type="spellEnd"/>
-      <w:r>
-        <w:rPr>
-          <w:rFonts w:asciiTheme="majorHAnsi" w:hAnsiTheme="majorHAnsi"/>
-          <w:b/>
-          <w:bCs/>
-          <w:color w:val="BF4E14" w:themeColor="accent2" w:themeShade="BF"/>
+        <w:t xml:space="preserve"> </w:t>
+      </w:r>
+      <w:r>
+        <w:rPr>
+          <w:rFonts w:asciiTheme="majorHAnsi" w:hAnsiTheme="majorHAnsi"/>
           <w:szCs w:val="22"/>
           <w:lang w:eastAsia="pl-PL"/>
         </w:rPr>
-        <w:t>[</w:t>
-      </w:r>
-      <w:proofErr w:type="spellStart"/>
-      <w:r>
-        <w:rPr>
-          <w:rFonts w:asciiTheme="majorHAnsi" w:hAnsiTheme="majorHAnsi"/>
-          <w:b/>
-          <w:bCs/>
-          <w:color w:val="BF4E14" w:themeColor="accent2" w:themeShade="BF"/>
-          <w:szCs w:val="22"/>
-          <w:lang w:eastAsia="pl-PL"/>
-        </w:rPr>
-        <w:t>LiczbWZestawie</w:t>
-      </w:r>
-      <w:proofErr w:type="spellEnd"/>
-      <w:r>
-        <w:rPr>
-          <w:rFonts w:asciiTheme="majorHAnsi" w:hAnsiTheme="majorHAnsi"/>
-          <w:b/>
-          <w:bCs/>
-          <w:color w:val="BF4E14" w:themeColor="accent2" w:themeShade="BF"/>
-          <w:szCs w:val="22"/>
-          <w:lang w:eastAsia="pl-PL"/>
-        </w:rPr>
-        <w:t>]</w:t>
-      </w:r>
-      <w:r>
-        <w:rPr>
-          <w:rFonts w:asciiTheme="majorHAnsi" w:hAnsiTheme="majorHAnsi"/>
-          <w:color w:val="BF4E14" w:themeColor="accent2" w:themeShade="BF"/>
-          <w:szCs w:val="22"/>
-          <w:lang w:eastAsia="pl-PL"/>
-        </w:rPr>
-        <w:t xml:space="preserve"> </w:t>
-      </w:r>
-      <w:r>
-        <w:rPr>
-          <w:rFonts w:asciiTheme="majorHAnsi" w:hAnsiTheme="majorHAnsi"/>
-          <w:color w:val="BF4E14" w:themeColor="accent2" w:themeShade="BF"/>
-          <w:szCs w:val="22"/>
-          <w:lang w:eastAsia="pl-PL"/>
-        </w:rPr>
-        <w:t xml:space="preserve"> </w:t>
-      </w:r>
-      <w:r>
-        <w:rPr>
-          <w:rFonts w:asciiTheme="majorHAnsi" w:hAnsiTheme="majorHAnsi"/>
-          <w:szCs w:val="22"/>
-          <w:lang w:eastAsia="pl-PL"/>
-        </w:rPr>
-        <w:t>-</w:t>
-      </w:r>
-      <w:proofErr w:type="gramEnd"/>
-      <w:r>
-        <w:rPr>
-          <w:rFonts w:asciiTheme="majorHAnsi" w:hAnsiTheme="majorHAnsi"/>
-          <w:szCs w:val="22"/>
-          <w:lang w:eastAsia="pl-PL"/>
-        </w:rPr>
-        <w:t xml:space="preserve"> t</w:t>
+        <w:t>- t</w:t>
       </w:r>
       <w:r>
         <w:rPr>
@@ -2918,7 +2791,6 @@
         <w:t xml:space="preserve"> </w:t>
       </w:r>
       <w:proofErr w:type="spellStart"/>
-      <w:proofErr w:type="gramStart"/>
       <w:r>
         <w:rPr>
           <w:rFonts w:asciiTheme="majorHAnsi" w:hAnsiTheme="majorHAnsi"/>
@@ -2940,19 +2812,7 @@
           <w:szCs w:val="22"/>
           <w:lang w:eastAsia="pl-PL"/>
         </w:rPr>
-        <w:t>(</w:t>
-      </w:r>
-      <w:proofErr w:type="gramEnd"/>
-      <w:r>
-        <w:rPr>
-          <w:rFonts w:asciiTheme="majorHAnsi" w:hAnsiTheme="majorHAnsi"/>
-          <w:b/>
-          <w:bCs/>
-          <w:color w:val="BF4E14" w:themeColor="accent2" w:themeShade="BF"/>
-          <w:szCs w:val="22"/>
-          <w:lang w:eastAsia="pl-PL"/>
-        </w:rPr>
-        <w:t>)</w:t>
+        <w:t>()</w:t>
       </w:r>
       <w:r>
         <w:rPr>
@@ -3135,7 +2995,6 @@
         </w:rPr>
       </w:pPr>
       <w:proofErr w:type="spellStart"/>
-      <w:proofErr w:type="gramStart"/>
       <w:r>
         <w:rPr>
           <w:rFonts w:asciiTheme="majorHAnsi" w:hAnsiTheme="majorHAnsi"/>
@@ -3148,7 +3007,6 @@
         <w:t>generator.Next</w:t>
       </w:r>
       <w:proofErr w:type="spellEnd"/>
-      <w:proofErr w:type="gramEnd"/>
       <w:r>
         <w:rPr>
           <w:rFonts w:asciiTheme="majorHAnsi" w:hAnsiTheme="majorHAnsi"/>
@@ -3274,7 +3132,6 @@
         </w:rPr>
       </w:pPr>
       <w:proofErr w:type="spellStart"/>
-      <w:proofErr w:type="gramStart"/>
       <w:r>
         <w:rPr>
           <w:rFonts w:asciiTheme="majorHAnsi" w:hAnsiTheme="majorHAnsi"/>
@@ -3287,7 +3144,6 @@
         <w:t>zestaw.Contains</w:t>
       </w:r>
       <w:proofErr w:type="spellEnd"/>
-      <w:proofErr w:type="gramEnd"/>
       <w:r>
         <w:rPr>
           <w:rFonts w:asciiTheme="majorHAnsi" w:hAnsiTheme="majorHAnsi"/>
@@ -3371,25 +3227,7 @@
           <w:szCs w:val="22"/>
           <w:lang w:eastAsia="pl-PL"/>
         </w:rPr>
-        <w:t xml:space="preserve">jeśli nie, liczba zostaje zapisana pod indeksem </w:t>
-      </w:r>
-      <w:proofErr w:type="gramStart"/>
-      <w:r>
-        <w:rPr>
-          <w:rFonts w:asciiTheme="majorHAnsi" w:hAnsiTheme="majorHAnsi"/>
-          <w:szCs w:val="22"/>
-          <w:lang w:eastAsia="pl-PL"/>
-        </w:rPr>
-        <w:t>i,</w:t>
-      </w:r>
-      <w:proofErr w:type="gramEnd"/>
-      <w:r>
-        <w:rPr>
-          <w:rFonts w:asciiTheme="majorHAnsi" w:hAnsiTheme="majorHAnsi"/>
-          <w:szCs w:val="22"/>
-          <w:lang w:eastAsia="pl-PL"/>
-        </w:rPr>
-        <w:t xml:space="preserve"> a następnie i++ przesuwa licznik.</w:t>
+        <w:t>jeśli nie, liczba zostaje zapisana pod indeksem i, a następnie i++ przesuwa licznik.</w:t>
       </w:r>
     </w:p>
     <w:p>
@@ -3466,7 +3304,6 @@
         <w:t xml:space="preserve">Funkcja </w:t>
       </w:r>
       <w:proofErr w:type="spellStart"/>
-      <w:proofErr w:type="gramStart"/>
       <w:r>
         <w:rPr>
           <w:rFonts w:asciiTheme="majorHAnsi" w:hAnsiTheme="majorHAnsi"/>
@@ -3484,17 +3321,7 @@
           <w:bCs/>
           <w:color w:val="BF4E14" w:themeColor="accent2" w:themeShade="BF"/>
         </w:rPr>
-        <w:t>(</w:t>
-      </w:r>
-      <w:proofErr w:type="gramEnd"/>
-      <w:r>
-        <w:rPr>
-          <w:rFonts w:asciiTheme="majorHAnsi" w:hAnsiTheme="majorHAnsi"/>
-          <w:b/>
-          <w:bCs/>
-          <w:color w:val="BF4E14" w:themeColor="accent2" w:themeShade="BF"/>
-        </w:rPr>
-        <w:t>)</w:t>
+        <w:t>()</w:t>
       </w:r>
       <w:r>
         <w:rPr>
@@ -3536,7 +3363,6 @@
         </w:rPr>
       </w:pPr>
       <w:proofErr w:type="spellStart"/>
-      <w:proofErr w:type="gramStart"/>
       <w:r>
         <w:rPr>
           <w:rFonts w:asciiTheme="majorHAnsi" w:hAnsiTheme="majorHAnsi"/>
@@ -3556,88 +3382,75 @@
           <w:color w:val="BF4E14" w:themeColor="accent2" w:themeShade="BF"/>
           <w:szCs w:val="22"/>
         </w:rPr>
+        <w:t xml:space="preserve">[] </w:t>
+      </w:r>
+      <w:proofErr w:type="spellStart"/>
+      <w:r>
+        <w:rPr>
+          <w:rFonts w:asciiTheme="majorHAnsi" w:hAnsiTheme="majorHAnsi"/>
+          <w:b/>
+          <w:bCs/>
+          <w:color w:val="BF4E14" w:themeColor="accent2" w:themeShade="BF"/>
+          <w:szCs w:val="22"/>
+        </w:rPr>
+        <w:t>wystapienia</w:t>
+      </w:r>
+      <w:proofErr w:type="spellEnd"/>
+      <w:r>
+        <w:rPr>
+          <w:rFonts w:asciiTheme="majorHAnsi" w:hAnsiTheme="majorHAnsi"/>
+          <w:b/>
+          <w:bCs/>
+          <w:color w:val="BF4E14" w:themeColor="accent2" w:themeShade="BF"/>
+          <w:szCs w:val="22"/>
+        </w:rPr>
+        <w:t xml:space="preserve"> = </w:t>
+      </w:r>
+      <w:proofErr w:type="spellStart"/>
+      <w:r>
+        <w:rPr>
+          <w:rFonts w:asciiTheme="majorHAnsi" w:hAnsiTheme="majorHAnsi"/>
+          <w:b/>
+          <w:bCs/>
+          <w:color w:val="BF4E14" w:themeColor="accent2" w:themeShade="BF"/>
+          <w:szCs w:val="22"/>
+        </w:rPr>
+        <w:t>new</w:t>
+      </w:r>
+      <w:proofErr w:type="spellEnd"/>
+      <w:r>
+        <w:rPr>
+          <w:rFonts w:asciiTheme="majorHAnsi" w:hAnsiTheme="majorHAnsi"/>
+          <w:b/>
+          <w:bCs/>
+          <w:color w:val="BF4E14" w:themeColor="accent2" w:themeShade="BF"/>
+          <w:szCs w:val="22"/>
+        </w:rPr>
+        <w:t xml:space="preserve"> </w:t>
+      </w:r>
+      <w:proofErr w:type="spellStart"/>
+      <w:r>
+        <w:rPr>
+          <w:rFonts w:asciiTheme="majorHAnsi" w:hAnsiTheme="majorHAnsi"/>
+          <w:b/>
+          <w:bCs/>
+          <w:color w:val="BF4E14" w:themeColor="accent2" w:themeShade="BF"/>
+          <w:szCs w:val="22"/>
+        </w:rPr>
+        <w:t>int</w:t>
+      </w:r>
+      <w:proofErr w:type="spellEnd"/>
+      <w:r>
+        <w:rPr>
+          <w:rFonts w:asciiTheme="majorHAnsi" w:hAnsiTheme="majorHAnsi"/>
+          <w:b/>
+          <w:bCs/>
+          <w:color w:val="BF4E14" w:themeColor="accent2" w:themeShade="BF"/>
+          <w:szCs w:val="22"/>
+        </w:rPr>
         <w:t>[</w:t>
       </w:r>
-      <w:proofErr w:type="gramEnd"/>
-      <w:r>
-        <w:rPr>
-          <w:rFonts w:asciiTheme="majorHAnsi" w:hAnsiTheme="majorHAnsi"/>
-          <w:b/>
-          <w:bCs/>
-          <w:color w:val="BF4E14" w:themeColor="accent2" w:themeShade="BF"/>
-          <w:szCs w:val="22"/>
-        </w:rPr>
-        <w:t xml:space="preserve">] </w:t>
-      </w:r>
       <w:proofErr w:type="spellStart"/>
-      <w:r>
-        <w:rPr>
-          <w:rFonts w:asciiTheme="majorHAnsi" w:hAnsiTheme="majorHAnsi"/>
-          <w:b/>
-          <w:bCs/>
-          <w:color w:val="BF4E14" w:themeColor="accent2" w:themeShade="BF"/>
-          <w:szCs w:val="22"/>
-        </w:rPr>
-        <w:t>wystapienia</w:t>
-      </w:r>
-      <w:proofErr w:type="spellEnd"/>
-      <w:r>
-        <w:rPr>
-          <w:rFonts w:asciiTheme="majorHAnsi" w:hAnsiTheme="majorHAnsi"/>
-          <w:b/>
-          <w:bCs/>
-          <w:color w:val="BF4E14" w:themeColor="accent2" w:themeShade="BF"/>
-          <w:szCs w:val="22"/>
-        </w:rPr>
-        <w:t xml:space="preserve"> = </w:t>
-      </w:r>
-      <w:proofErr w:type="spellStart"/>
-      <w:r>
-        <w:rPr>
-          <w:rFonts w:asciiTheme="majorHAnsi" w:hAnsiTheme="majorHAnsi"/>
-          <w:b/>
-          <w:bCs/>
-          <w:color w:val="BF4E14" w:themeColor="accent2" w:themeShade="BF"/>
-          <w:szCs w:val="22"/>
-        </w:rPr>
-        <w:t>new</w:t>
-      </w:r>
-      <w:proofErr w:type="spellEnd"/>
-      <w:r>
-        <w:rPr>
-          <w:rFonts w:asciiTheme="majorHAnsi" w:hAnsiTheme="majorHAnsi"/>
-          <w:b/>
-          <w:bCs/>
-          <w:color w:val="BF4E14" w:themeColor="accent2" w:themeShade="BF"/>
-          <w:szCs w:val="22"/>
-        </w:rPr>
-        <w:t xml:space="preserve"> </w:t>
-      </w:r>
-      <w:proofErr w:type="spellStart"/>
-      <w:proofErr w:type="gramStart"/>
-      <w:r>
-        <w:rPr>
-          <w:rFonts w:asciiTheme="majorHAnsi" w:hAnsiTheme="majorHAnsi"/>
-          <w:b/>
-          <w:bCs/>
-          <w:color w:val="BF4E14" w:themeColor="accent2" w:themeShade="BF"/>
-          <w:szCs w:val="22"/>
-        </w:rPr>
-        <w:t>int</w:t>
-      </w:r>
-      <w:proofErr w:type="spellEnd"/>
-      <w:r>
-        <w:rPr>
-          <w:rFonts w:asciiTheme="majorHAnsi" w:hAnsiTheme="majorHAnsi"/>
-          <w:b/>
-          <w:bCs/>
-          <w:color w:val="BF4E14" w:themeColor="accent2" w:themeShade="BF"/>
-          <w:szCs w:val="22"/>
-        </w:rPr>
-        <w:t>[</w:t>
-      </w:r>
-      <w:proofErr w:type="spellStart"/>
-      <w:proofErr w:type="gramEnd"/>
       <w:r>
         <w:rPr>
           <w:rFonts w:asciiTheme="majorHAnsi" w:hAnsiTheme="majorHAnsi"/>
@@ -3792,7 +3605,6 @@
         </w:rPr>
       </w:pPr>
       <w:proofErr w:type="spellStart"/>
-      <w:proofErr w:type="gramStart"/>
       <w:r>
         <w:rPr>
           <w:rFonts w:asciiTheme="majorHAnsi" w:hAnsiTheme="majorHAnsi"/>
@@ -3812,40 +3624,7 @@
           <w:color w:val="BF4E14" w:themeColor="accent2" w:themeShade="BF"/>
           <w:szCs w:val="22"/>
         </w:rPr>
-        <w:t>[losowania[i,</w:t>
-      </w:r>
-      <w:proofErr w:type="gramEnd"/>
-      <w:r>
-        <w:rPr>
-          <w:rFonts w:asciiTheme="majorHAnsi" w:hAnsiTheme="majorHAnsi"/>
-          <w:b/>
-          <w:bCs/>
-          <w:color w:val="BF4E14" w:themeColor="accent2" w:themeShade="BF"/>
-          <w:szCs w:val="22"/>
-        </w:rPr>
-        <w:t xml:space="preserve"> j] - </w:t>
-      </w:r>
-      <w:proofErr w:type="gramStart"/>
-      <w:r>
-        <w:rPr>
-          <w:rFonts w:asciiTheme="majorHAnsi" w:hAnsiTheme="majorHAnsi"/>
-          <w:b/>
-          <w:bCs/>
-          <w:color w:val="BF4E14" w:themeColor="accent2" w:themeShade="BF"/>
-          <w:szCs w:val="22"/>
-        </w:rPr>
-        <w:t>1]+</w:t>
-      </w:r>
-      <w:proofErr w:type="gramEnd"/>
-      <w:r>
-        <w:rPr>
-          <w:rFonts w:asciiTheme="majorHAnsi" w:hAnsiTheme="majorHAnsi"/>
-          <w:b/>
-          <w:bCs/>
-          <w:color w:val="BF4E14" w:themeColor="accent2" w:themeShade="BF"/>
-          <w:szCs w:val="22"/>
-        </w:rPr>
-        <w:t xml:space="preserve">+ </w:t>
+        <w:t xml:space="preserve">[losowania[i, j] - 1]++ </w:t>
       </w:r>
       <w:r>
         <w:rPr>
@@ -3904,29 +3683,7 @@
           <w:color w:val="BF4E14" w:themeColor="accent2" w:themeShade="BF"/>
           <w:szCs w:val="22"/>
         </w:rPr>
-        <w:t>(</w:t>
-      </w:r>
-      <w:proofErr w:type="gramStart"/>
-      <w:r>
-        <w:rPr>
-          <w:rFonts w:asciiTheme="majorHAnsi" w:hAnsiTheme="majorHAnsi"/>
-          <w:b/>
-          <w:bCs/>
-          <w:color w:val="BF4E14" w:themeColor="accent2" w:themeShade="BF"/>
-          <w:szCs w:val="22"/>
-        </w:rPr>
-        <w:t>losowania[i,</w:t>
-      </w:r>
-      <w:proofErr w:type="gramEnd"/>
-      <w:r>
-        <w:rPr>
-          <w:rFonts w:asciiTheme="majorHAnsi" w:hAnsiTheme="majorHAnsi"/>
-          <w:b/>
-          <w:bCs/>
-          <w:color w:val="BF4E14" w:themeColor="accent2" w:themeShade="BF"/>
-          <w:szCs w:val="22"/>
-        </w:rPr>
-        <w:t xml:space="preserve"> j] + " ")</w:t>
+        <w:t>(losowania[i, j] + " ")</w:t>
       </w:r>
       <w:r>
         <w:rPr>
@@ -4614,17 +4371,12 @@
               <w:t xml:space="preserve">Wywołuje </w:t>
             </w:r>
             <w:proofErr w:type="spellStart"/>
-            <w:proofErr w:type="gramStart"/>
             <w:r>
               <w:t>LosujZestaw</w:t>
             </w:r>
             <w:proofErr w:type="spellEnd"/>
             <w:r>
-              <w:t>(</w:t>
-            </w:r>
-            <w:proofErr w:type="gramEnd"/>
-            <w:r>
-              <w:t xml:space="preserve">) i sprawdza </w:t>
+              <w:t xml:space="preserve">() i sprawdza </w:t>
             </w:r>
             <w:proofErr w:type="spellStart"/>
             <w:r>
@@ -4635,12 +4387,10 @@
               <w:t xml:space="preserve">(6, </w:t>
             </w:r>
             <w:proofErr w:type="spellStart"/>
-            <w:proofErr w:type="gramStart"/>
             <w:r>
               <w:t>zestaw.Length</w:t>
             </w:r>
             <w:proofErr w:type="spellEnd"/>
-            <w:proofErr w:type="gramEnd"/>
             <w:r>
               <w:t>).</w:t>
             </w:r>
@@ -4730,17 +4480,12 @@
               <w:t xml:space="preserve">Losuje 1000 zestawów. </w:t>
             </w:r>
             <w:proofErr w:type="spellStart"/>
-            <w:proofErr w:type="gramStart"/>
             <w:r>
               <w:t>Distinct</w:t>
             </w:r>
             <w:proofErr w:type="spellEnd"/>
             <w:r>
-              <w:t>(</w:t>
-            </w:r>
-            <w:proofErr w:type="gramEnd"/>
-            <w:r>
-              <w:t>) usuwa powtórzenia, więc liczba elementów po jego zastosowaniu musi być równa długości zestawu.</w:t>
+              <w:t>() usuwa powtórzenia, więc liczba elementów po jego zastosowaniu musi być równa długości zestawu.</w:t>
             </w:r>
           </w:p>
         </w:tc>
@@ -4924,17 +4669,12 @@
               <w:t xml:space="preserve">Dane zawierają liczbę 50, spoza zakresu. Metoda próbuje zwiększyć </w:t>
             </w:r>
             <w:proofErr w:type="spellStart"/>
-            <w:proofErr w:type="gramStart"/>
             <w:r>
               <w:t>wystapienia</w:t>
             </w:r>
             <w:proofErr w:type="spellEnd"/>
             <w:r>
-              <w:t>[</w:t>
-            </w:r>
-            <w:proofErr w:type="gramEnd"/>
-            <w:r>
-              <w:t xml:space="preserve">49], ale tablica ma indeksy 0–48. </w:t>
+              <w:t xml:space="preserve">[49], ale tablica ma indeksy 0–48. </w:t>
             </w:r>
             <w:proofErr w:type="spellStart"/>
             <w:r>
@@ -5528,30 +5268,20 @@
               <w:t xml:space="preserve">Wywołuje </w:t>
             </w:r>
             <w:proofErr w:type="spellStart"/>
-            <w:proofErr w:type="gramStart"/>
             <w:r>
               <w:t>LosujZestaw</w:t>
             </w:r>
             <w:proofErr w:type="spellEnd"/>
             <w:r>
-              <w:t>(</w:t>
-            </w:r>
-            <w:proofErr w:type="gramEnd"/>
-            <w:r>
-              <w:t xml:space="preserve">) wielokrotnie, przekazuje uzyskane dane do </w:t>
+              <w:t xml:space="preserve">() wielokrotnie, przekazuje uzyskane dane do </w:t>
             </w:r>
             <w:proofErr w:type="spellStart"/>
-            <w:proofErr w:type="gramStart"/>
             <w:r>
               <w:t>WyswietlLosowania</w:t>
             </w:r>
             <w:proofErr w:type="spellEnd"/>
             <w:r>
-              <w:t>(</w:t>
-            </w:r>
-            <w:proofErr w:type="gramEnd"/>
-            <w:r>
-              <w:t xml:space="preserve">) i przechwytuje wyjście konsoli za pomocą </w:t>
+              <w:t xml:space="preserve">() i przechwytuje wyjście konsoli za pomocą </w:t>
             </w:r>
             <w:proofErr w:type="spellStart"/>
             <w:r>
@@ -5744,15 +5474,7 @@
               <w:cnfStyle w:val="000000100000" w:firstRow="0" w:lastRow="0" w:firstColumn="0" w:lastColumn="0" w:oddVBand="0" w:evenVBand="0" w:oddHBand="1" w:evenHBand="0" w:firstRowFirstColumn="0" w:firstRowLastColumn="0" w:lastRowFirstColumn="0" w:lastRowLastColumn="0"/>
             </w:pPr>
             <w:r>
-              <w:t xml:space="preserve">Generuje znaną liczbę zestawów (np. 5) i weryfikuje w wypisanym strumieniu </w:t>
-            </w:r>
-            <w:proofErr w:type="gramStart"/>
-            <w:r>
-              <w:t>wyjściowym,</w:t>
-            </w:r>
-            <w:proofErr w:type="gramEnd"/>
-            <w:r>
-              <w:t xml:space="preserve"> czy łączna suma wystąpień wszystkich liczb wynosi dokładnie </w:t>
+              <w:t xml:space="preserve">Generuje znaną liczbę zestawów (np. 5) i weryfikuje w wypisanym strumieniu wyjściowym, czy łączna suma wystąpień wszystkich liczb wynosi dokładnie </w:t>
             </w:r>
             <m:oMath>
               <m:r>
@@ -6079,6 +5801,124 @@
           </wp:inline>
         </w:drawing>
       </w:r>
+    </w:p>
+    <w:p>
+      <w:pPr>
+        <w:jc w:val="left"/>
+      </w:pPr>
+      <w:r>
+        <w:br w:type="page"/>
+      </w:r>
+    </w:p>
+    <w:p>
+      <w:pPr>
+        <w:pStyle w:val="Nagwek1"/>
+      </w:pPr>
+      <w:r>
+        <w:lastRenderedPageBreak/>
+        <w:t>Testy</w:t>
+      </w:r>
+      <w:r>
+        <w:t xml:space="preserve"> systemowe</w:t>
+      </w:r>
+    </w:p>
+    <w:p>
+      <w:pPr>
+        <w:ind w:firstLine="360"/>
+      </w:pPr>
+      <w:r>
+        <w:rPr>
+          <w:b/>
+          <w:bCs/>
+        </w:rPr>
+        <w:t>Czym są?</w:t>
+      </w:r>
+      <w:r>
+        <w:t xml:space="preserve"> – </w:t>
+      </w:r>
+      <w:r>
+        <w:t xml:space="preserve">  Testy systemowe (ang. </w:t>
+      </w:r>
+      <w:r>
+        <w:rPr>
+          <w:i/>
+          <w:iCs/>
+        </w:rPr>
+        <w:t xml:space="preserve">system </w:t>
+      </w:r>
+      <w:proofErr w:type="spellStart"/>
+      <w:r>
+        <w:rPr>
+          <w:i/>
+          <w:iCs/>
+        </w:rPr>
+        <w:t>tests</w:t>
+      </w:r>
+      <w:proofErr w:type="spellEnd"/>
+      <w:r>
+        <w:t>) sprawdzają cały, kompletnie zmontowany i zintegrowany produkt programistyczny jako jedną całość. Weryfikują, czy aplikacja spełnia wszystkie określone wymagania funkcjonalne i niefunkcjonalne (np. wydajność, bezpieczeństwo, użyteczność) w środowisku zbliżonym do produkcyjnego.</w:t>
+      </w:r>
+    </w:p>
+    <w:p>
+      <w:pPr>
+        <w:ind w:firstLine="360"/>
+      </w:pPr>
+      <w:r>
+        <w:rPr>
+          <w:b/>
+          <w:bCs/>
+        </w:rPr>
+        <w:t>Kiedy je wykonujemy?</w:t>
+      </w:r>
+      <w:r>
+        <w:t xml:space="preserve"> – Wykonujemy je na późniejszym etapie tworzenia oprogramowania – po zakończeniu integracji wszystkich modułów, a przed przekazaniem aplikacji użytkownikom końcowym lub klientowi. Zwykle odpowiada za nie dedykowany zespół testerów (QA).</w:t>
+      </w:r>
+    </w:p>
+    <w:p>
+      <w:pPr>
+        <w:pStyle w:val="Nagwek1"/>
+        <w:numPr>
+          <w:ilvl w:val="1"/>
+          <w:numId w:val="27"/>
+        </w:numPr>
+      </w:pPr>
+      <w:r>
+        <w:t>Implementacja programu</w:t>
+      </w:r>
+    </w:p>
+    <w:p>
+      <w:pPr>
+        <w:ind w:firstLine="360"/>
+      </w:pPr>
+      <w:r>
+        <w:t>Podobnie jak poprzednio t</w:t>
+      </w:r>
+      <w:r>
+        <w:t xml:space="preserve">en rozdział będzie się opierać na programie opisanym w </w:t>
+      </w:r>
+      <w:r>
+        <w:t xml:space="preserve">pierwszym </w:t>
+      </w:r>
+      <w:r>
+        <w:t>punkcie. Szczegóły jego implementacji znajdują się w rozdziale 1.1. dokumentacji.</w:t>
+      </w:r>
+    </w:p>
+    <w:p>
+      <w:pPr>
+        <w:pStyle w:val="Nagwek1"/>
+        <w:numPr>
+          <w:ilvl w:val="1"/>
+          <w:numId w:val="27"/>
+        </w:numPr>
+      </w:pPr>
+      <w:r>
+        <w:t>Implementacja testów</w:t>
+      </w:r>
+    </w:p>
+    <w:p>
+      <w:pPr>
+        <w:jc w:val="center"/>
+      </w:pPr>
     </w:p>
     <w:sectPr>
       <w:footerReference w:type="default" r:id="rId17"/>
@@ -9204,6 +9044,36 @@
   </w:num>
   <w:num w:numId="28" w16cid:durableId="1210415893">
     <w:abstractNumId w:val="15"/>
+  </w:num>
+  <w:num w:numId="29" w16cid:durableId="118650564">
+    <w:abstractNumId w:val="14"/>
+    <w:lvlOverride w:ilvl="0">
+      <w:startOverride w:val="1"/>
+    </w:lvlOverride>
+    <w:lvlOverride w:ilvl="1">
+      <w:startOverride w:val="1"/>
+    </w:lvlOverride>
+    <w:lvlOverride w:ilvl="2">
+      <w:startOverride w:val="1"/>
+    </w:lvlOverride>
+    <w:lvlOverride w:ilvl="3">
+      <w:startOverride w:val="1"/>
+    </w:lvlOverride>
+    <w:lvlOverride w:ilvl="4">
+      <w:startOverride w:val="1"/>
+    </w:lvlOverride>
+    <w:lvlOverride w:ilvl="5">
+      <w:startOverride w:val="1"/>
+    </w:lvlOverride>
+    <w:lvlOverride w:ilvl="6">
+      <w:startOverride w:val="1"/>
+    </w:lvlOverride>
+    <w:lvlOverride w:ilvl="7">
+      <w:startOverride w:val="1"/>
+    </w:lvlOverride>
+    <w:lvlOverride w:ilvl="8">
+      <w:startOverride w:val="1"/>
+    </w:lvlOverride>
   </w:num>
 </w:numbering>
 </file>
@@ -9822,7 +9692,6 @@
   <w:style w:type="character" w:default="1" w:styleId="Domylnaczcionkaakapitu">
     <w:name w:val="Default Paragraph Font"/>
     <w:uiPriority w:val="1"/>
-    <w:semiHidden/>
     <w:unhideWhenUsed/>
   </w:style>
   <w:style w:type="table" w:default="1" w:styleId="Standardowy">

</xml_diff>

<commit_message>
Utworzenie trzeciego testu systemowego - wydajności aplikacji przy generowaniu dużej liczby losowań
</commit_message>
<xml_diff>
--- a/Testowanie aplikacji - Marcin_Migacz_5P2.docx
+++ b/Testowanie aplikacji - Marcin_Migacz_5P2.docx
@@ -283,8 +283,20 @@
           <w:sz w:val="28"/>
           <w:szCs w:val="28"/>
         </w:rPr>
-        <w:t>NOWY SĄCZ 2026r.</w:t>
-      </w:r>
+        <w:t xml:space="preserve">NOWY SĄCZ </w:t>
+      </w:r>
+      <w:proofErr w:type="gramStart"/>
+      <w:r>
+        <w:rPr>
+          <w:rFonts w:asciiTheme="majorHAnsi" w:hAnsiTheme="majorHAnsi"/>
+          <w:b/>
+          <w:bCs/>
+          <w:sz w:val="28"/>
+          <w:szCs w:val="28"/>
+        </w:rPr>
+        <w:t>2026r.</w:t>
+      </w:r>
+      <w:proofErr w:type="gramEnd"/>
     </w:p>
     <w:p>
       <w:pPr>
@@ -1284,7 +1296,23 @@
         <w:ind w:firstLine="360"/>
       </w:pPr>
       <w:r>
-        <w:t>Testowanie oprogramowania to proces sprawdzania, czy program działa zgodnie z wymaganiami, oraz wykrywania w nim błędów przed przekazaniem go użytkownikom. Błąd (defekt) to wada w kodzie, która może doprowadzić do awarii, czyli widocznego niepoprawnego działania systemu. Celem testowania jest nie tylko znajdowanie usterek, ale też ograniczanie ryzyka jego wdrożenia. Ze względu na poziom wyróżnia się testy jednostkowe, integracyjne, systemowe i akceptacyjne, które sprawdzają kolejno pojedyncze elementy, ich współpracę, cały system oraz zgodność z oczekiwaniami klienta. Ze względu na cel dzielimy je na funkcjonalne (co system robi) i niefunkcjonalne (jak działa: wydajność, bezpieczeństwo, użyteczność), a osobną grupę stanowią testy regresyjne, które po zmianach w kodzie sprawdzają, czy nie zepsuto istniejących funkcji. Wyróżnia się też podejścia czarnej skrzynki (bez znajomości kodu), białej skrzynki (z analizą wnętrza programu) i szarej skrzynki (mieszane). Pierwsza zasada testowania mówi, że testy ujawniają obecność błędów, ale nie dowodzą ich braku. Druga głosi, że testowanie wyczerpujące jest niemożliwe, więc wysiłek kieruje się na obszary o największym ryzyku. Trzecia zasada to wczesne testowanie, bo błąd znaleziony na etapie projektu kosztuje znacznie mniej niż ten znaleziony po wdrożeniu. Kolejne zasady mówią, że defekty grupują się w niewielu modułach, a wielokrotne uruchamianie tych samych testów przestaje wykrywać nowe błędy. Ostatnie zasady to zależność testów od kontekstu oraz złudzenie braku błędów: program bez usterek nadal nie jest wartościowy, jeśli nie spełnia potrzeb użytkownika. Proces testowy zaczyna się od planowania i nadzoru, czyli określenia zakresu, zasobów i kryteriów zakończenia. Następnie następuje analiza i projektowanie testów, w których powstają przypadki testowe z danymi wejściowymi i oczekiwanymi wynikami. Potem testy są implementowane i wykonywane, a wyniki rzeczywiste porównuje się z oczekiwanymi, po czym raportuje się znalezione błędy, wykonuje retesty po poprawkach i zamyka proces podsumowaniem.</w:t>
+        <w:t xml:space="preserve">Testowanie oprogramowania to proces </w:t>
+      </w:r>
+      <w:proofErr w:type="gramStart"/>
+      <w:r>
+        <w:t>sprawdzania,</w:t>
+      </w:r>
+      <w:proofErr w:type="gramEnd"/>
+      <w:r>
+        <w:t xml:space="preserve"> czy program działa zgodnie z </w:t>
+      </w:r>
+      <w:proofErr w:type="gramStart"/>
+      <w:r>
+        <w:t>wymaganiami,</w:t>
+      </w:r>
+      <w:proofErr w:type="gramEnd"/>
+      <w:r>
+        <w:t xml:space="preserve"> oraz wykrywania w nim błędów przed przekazaniem go użytkownikom. Błąd (defekt) to wada w kodzie, która może doprowadzić do awarii, czyli widocznego niepoprawnego działania systemu. Celem testowania jest nie tylko znajdowanie usterek, ale też ograniczanie ryzyka jego wdrożenia. Ze względu na poziom wyróżnia się testy jednostkowe, integracyjne, systemowe i akceptacyjne, które sprawdzają kolejno pojedyncze elementy, ich współpracę, cały system oraz zgodność z oczekiwaniami klienta. Ze względu na cel dzielimy je na funkcjonalne (co system robi) i niefunkcjonalne (jak działa: wydajność, bezpieczeństwo, użyteczność), a osobną grupę stanowią testy regresyjne, które po zmianach w kodzie sprawdzają, czy nie zepsuto istniejących funkcji. Wyróżnia się też podejścia czarnej skrzynki (bez znajomości kodu), białej skrzynki (z analizą wnętrza programu) i szarej skrzynki (mieszane). Pierwsza zasada testowania mówi, że testy ujawniają obecność błędów, ale nie dowodzą ich braku. Druga głosi, że testowanie wyczerpujące jest niemożliwe, więc wysiłek kieruje się na obszary o największym ryzyku. Trzecia zasada to wczesne testowanie, bo błąd znaleziony na etapie projektu kosztuje znacznie mniej niż ten znaleziony po wdrożeniu. Kolejne zasady mówią, że defekty grupują się w niewielu modułach, a wielokrotne uruchamianie tych samych testów przestaje wykrywać nowe błędy. Ostatnie zasady to zależność testów od kontekstu oraz złudzenie braku błędów: program bez usterek nadal nie jest wartościowy, jeśli nie spełnia potrzeb użytkownika. Proces testowy zaczyna się od planowania i nadzoru, czyli określenia zakresu, zasobów i kryteriów zakończenia. Następnie następuje analiza i projektowanie testów, w których powstają przypadki testowe z danymi wejściowymi i oczekiwanymi wynikami. Potem testy są implementowane i wykonywane, a wyniki rzeczywiste porównuje się z oczekiwanymi, po czym raportuje się znalezione błędy, wykonuje retesty po poprawkach i zamyka proces podsumowaniem.</w:t>
       </w:r>
     </w:p>
     <w:p>
@@ -2000,6 +2028,7 @@
         </w:rPr>
       </w:pPr>
       <w:proofErr w:type="spellStart"/>
+      <w:proofErr w:type="gramStart"/>
       <w:r>
         <w:rPr>
           <w:rFonts w:asciiTheme="majorHAnsi" w:hAnsiTheme="majorHAnsi"/>
@@ -2011,6 +2040,7 @@
         <w:t>int.TryParse</w:t>
       </w:r>
       <w:proofErr w:type="spellEnd"/>
+      <w:proofErr w:type="gramEnd"/>
       <w:r>
         <w:rPr>
           <w:rFonts w:asciiTheme="majorHAnsi" w:hAnsiTheme="majorHAnsi"/>
@@ -2066,6 +2096,7 @@
         <w:t xml:space="preserve"> </w:t>
       </w:r>
       <w:proofErr w:type="spellStart"/>
+      <w:proofErr w:type="gramStart"/>
       <w:r>
         <w:rPr>
           <w:rFonts w:asciiTheme="majorHAnsi" w:hAnsiTheme="majorHAnsi"/>
@@ -2100,7 +2131,15 @@
           <w:rFonts w:asciiTheme="majorHAnsi" w:hAnsiTheme="majorHAnsi"/>
           <w:szCs w:val="22"/>
         </w:rPr>
-        <w:t xml:space="preserve"> - wczytuje tekst z klawiatury i próbuje zamienić go na liczbę całkowitą. Jeśli się uda, zwraca </w:t>
+        <w:t xml:space="preserve"> -</w:t>
+      </w:r>
+      <w:proofErr w:type="gramEnd"/>
+      <w:r>
+        <w:rPr>
+          <w:rFonts w:asciiTheme="majorHAnsi" w:hAnsiTheme="majorHAnsi"/>
+          <w:szCs w:val="22"/>
+        </w:rPr>
+        <w:t xml:space="preserve"> wczytuje tekst z klawiatury i próbuje zamienić go na liczbę całkowitą. Jeśli się uda, zwraca </w:t>
       </w:r>
       <w:proofErr w:type="spellStart"/>
       <w:r>
@@ -2221,6 +2260,7 @@
         <w:t xml:space="preserve"> </w:t>
       </w:r>
       <w:proofErr w:type="spellStart"/>
+      <w:proofErr w:type="gramStart"/>
       <w:r>
         <w:rPr>
           <w:rFonts w:asciiTheme="majorHAnsi" w:hAnsiTheme="majorHAnsi"/>
@@ -2243,6 +2283,7 @@
         <w:t>[</w:t>
       </w:r>
       <w:proofErr w:type="spellStart"/>
+      <w:proofErr w:type="gramEnd"/>
       <w:r>
         <w:rPr>
           <w:rFonts w:asciiTheme="majorHAnsi" w:hAnsiTheme="majorHAnsi"/>
@@ -2319,9 +2360,26 @@
           <w:rFonts w:asciiTheme="majorHAnsi" w:hAnsiTheme="majorHAnsi"/>
           <w:szCs w:val="22"/>
         </w:rPr>
-        <w:t xml:space="preserve">Pętla zewnętrzna for (i...) wykonuje się raz dla każdego zestawu. W każdym obiegu wywołuje </w:t>
+        <w:t>Pętla zewnętrzna for (</w:t>
+      </w:r>
+      <w:proofErr w:type="gramStart"/>
+      <w:r>
+        <w:rPr>
+          <w:rFonts w:asciiTheme="majorHAnsi" w:hAnsiTheme="majorHAnsi"/>
+          <w:szCs w:val="22"/>
+        </w:rPr>
+        <w:t>i...</w:t>
+      </w:r>
+      <w:proofErr w:type="gramEnd"/>
+      <w:r>
+        <w:rPr>
+          <w:rFonts w:asciiTheme="majorHAnsi" w:hAnsiTheme="majorHAnsi"/>
+          <w:szCs w:val="22"/>
+        </w:rPr>
+        <w:t xml:space="preserve">) wykonuje się raz dla każdego zestawu. W każdym obiegu wywołuje </w:t>
       </w:r>
       <w:proofErr w:type="spellStart"/>
+      <w:proofErr w:type="gramStart"/>
       <w:r>
         <w:rPr>
           <w:rFonts w:asciiTheme="majorHAnsi" w:hAnsiTheme="majorHAnsi"/>
@@ -2335,7 +2393,15 @@
           <w:rFonts w:asciiTheme="majorHAnsi" w:hAnsiTheme="majorHAnsi"/>
           <w:szCs w:val="22"/>
         </w:rPr>
-        <w:t>(), która zwraca 6-elementową tablicę.</w:t>
+        <w:t>(</w:t>
+      </w:r>
+      <w:proofErr w:type="gramEnd"/>
+      <w:r>
+        <w:rPr>
+          <w:rFonts w:asciiTheme="majorHAnsi" w:hAnsiTheme="majorHAnsi"/>
+          <w:szCs w:val="22"/>
+        </w:rPr>
+        <w:t>), która zwraca 6-elementową tablicę.</w:t>
       </w:r>
     </w:p>
     <w:p>
@@ -2355,7 +2421,23 @@
           <w:rFonts w:asciiTheme="majorHAnsi" w:hAnsiTheme="majorHAnsi"/>
           <w:szCs w:val="22"/>
         </w:rPr>
-        <w:t>Pętla wewnętrzna for (j...) przepisuje 6 wylosowanych liczb do wiersza i tablicy losowania.</w:t>
+        <w:t>Pętla wewnętrzna for (</w:t>
+      </w:r>
+      <w:proofErr w:type="gramStart"/>
+      <w:r>
+        <w:rPr>
+          <w:rFonts w:asciiTheme="majorHAnsi" w:hAnsiTheme="majorHAnsi"/>
+          <w:szCs w:val="22"/>
+        </w:rPr>
+        <w:t>j...</w:t>
+      </w:r>
+      <w:proofErr w:type="gramEnd"/>
+      <w:r>
+        <w:rPr>
+          <w:rFonts w:asciiTheme="majorHAnsi" w:hAnsiTheme="majorHAnsi"/>
+          <w:szCs w:val="22"/>
+        </w:rPr>
+        <w:t>) przepisuje 6 wylosowanych liczb do wiersza i tablicy losowania.</w:t>
       </w:r>
     </w:p>
     <w:p>
@@ -2371,6 +2453,7 @@
         </w:rPr>
       </w:pPr>
       <w:proofErr w:type="spellStart"/>
+      <w:proofErr w:type="gramStart"/>
       <w:r>
         <w:rPr>
           <w:rFonts w:asciiTheme="majorHAnsi" w:hAnsiTheme="majorHAnsi"/>
@@ -2393,6 +2476,7 @@
         <w:t>(</w:t>
       </w:r>
       <w:proofErr w:type="spellStart"/>
+      <w:proofErr w:type="gramEnd"/>
       <w:r>
         <w:rPr>
           <w:rFonts w:asciiTheme="majorHAnsi" w:hAnsiTheme="majorHAnsi"/>
@@ -2529,6 +2613,7 @@
         <w:t xml:space="preserve">Funkcja </w:t>
       </w:r>
       <w:proofErr w:type="spellStart"/>
+      <w:proofErr w:type="gramStart"/>
       <w:r>
         <w:rPr>
           <w:rFonts w:asciiTheme="majorHAnsi" w:hAnsiTheme="majorHAnsi"/>
@@ -2546,13 +2631,23 @@
           <w:bCs/>
           <w:color w:val="BF4E14" w:themeColor="accent2" w:themeShade="BF"/>
         </w:rPr>
-        <w:t>()</w:t>
-      </w:r>
-      <w:r>
-        <w:rPr>
-          <w:rFonts w:asciiTheme="majorHAnsi" w:hAnsiTheme="majorHAnsi"/>
+        <w:t>(</w:t>
+      </w:r>
+      <w:proofErr w:type="gramEnd"/>
+      <w:r>
+        <w:rPr>
+          <w:rFonts w:asciiTheme="majorHAnsi" w:hAnsiTheme="majorHAnsi"/>
+          <w:b/>
+          <w:bCs/>
           <w:color w:val="BF4E14" w:themeColor="accent2" w:themeShade="BF"/>
         </w:rPr>
+        <w:t>)</w:t>
+      </w:r>
+      <w:r>
+        <w:rPr>
+          <w:rFonts w:asciiTheme="majorHAnsi" w:hAnsiTheme="majorHAnsi"/>
+          <w:color w:val="BF4E14" w:themeColor="accent2" w:themeShade="BF"/>
+        </w:rPr>
         <w:t xml:space="preserve"> </w:t>
       </w:r>
       <w:r>
@@ -2569,6 +2664,7 @@
         <w:t xml:space="preserve">losuje jeden zestaw 6 różnych liczb z przedziału 1–49. Nie przyjmuje argumentów i zwraca tablicę </w:t>
       </w:r>
       <w:proofErr w:type="spellStart"/>
+      <w:proofErr w:type="gramStart"/>
       <w:r>
         <w:rPr>
           <w:rFonts w:asciiTheme="majorHAnsi" w:hAnsiTheme="majorHAnsi"/>
@@ -2582,7 +2678,15 @@
           <w:rFonts w:asciiTheme="majorHAnsi" w:hAnsiTheme="majorHAnsi"/>
           <w:lang w:eastAsia="pl-PL"/>
         </w:rPr>
-        <w:t>[] z wylosowanymi liczbami.</w:t>
+        <w:t>[</w:t>
+      </w:r>
+      <w:proofErr w:type="gramEnd"/>
+      <w:r>
+        <w:rPr>
+          <w:rFonts w:asciiTheme="majorHAnsi" w:hAnsiTheme="majorHAnsi"/>
+          <w:lang w:eastAsia="pl-PL"/>
+        </w:rPr>
+        <w:t>] z wylosowanymi liczbami.</w:t>
       </w:r>
     </w:p>
     <w:p>
@@ -2599,6 +2703,7 @@
         </w:rPr>
       </w:pPr>
       <w:proofErr w:type="spellStart"/>
+      <w:proofErr w:type="gramStart"/>
       <w:r>
         <w:rPr>
           <w:rFonts w:asciiTheme="majorHAnsi" w:hAnsiTheme="majorHAnsi"/>
@@ -2620,7 +2725,19 @@
           <w:szCs w:val="22"/>
           <w:lang w:eastAsia="pl-PL"/>
         </w:rPr>
-        <w:t xml:space="preserve">[] zestaw = </w:t>
+        <w:t>[</w:t>
+      </w:r>
+      <w:proofErr w:type="gramEnd"/>
+      <w:r>
+        <w:rPr>
+          <w:rFonts w:asciiTheme="majorHAnsi" w:hAnsiTheme="majorHAnsi"/>
+          <w:b/>
+          <w:bCs/>
+          <w:color w:val="BF4E14" w:themeColor="accent2" w:themeShade="BF"/>
+          <w:szCs w:val="22"/>
+          <w:lang w:eastAsia="pl-PL"/>
+        </w:rPr>
+        <w:t xml:space="preserve">] zestaw = </w:t>
       </w:r>
       <w:proofErr w:type="spellStart"/>
       <w:r>
@@ -2647,6 +2764,7 @@
         <w:t xml:space="preserve"> </w:t>
       </w:r>
       <w:proofErr w:type="spellStart"/>
+      <w:proofErr w:type="gramStart"/>
       <w:r>
         <w:rPr>
           <w:rFonts w:asciiTheme="majorHAnsi" w:hAnsiTheme="majorHAnsi"/>
@@ -2718,7 +2836,16 @@
           <w:szCs w:val="22"/>
           <w:lang w:eastAsia="pl-PL"/>
         </w:rPr>
-        <w:t>- t</w:t>
+        <w:t>-</w:t>
+      </w:r>
+      <w:proofErr w:type="gramEnd"/>
+      <w:r>
+        <w:rPr>
+          <w:rFonts w:asciiTheme="majorHAnsi" w:hAnsiTheme="majorHAnsi"/>
+          <w:szCs w:val="22"/>
+          <w:lang w:eastAsia="pl-PL"/>
+        </w:rPr>
+        <w:t xml:space="preserve"> t</w:t>
       </w:r>
       <w:r>
         <w:rPr>
@@ -2791,6 +2918,7 @@
         <w:t xml:space="preserve"> </w:t>
       </w:r>
       <w:proofErr w:type="spellStart"/>
+      <w:proofErr w:type="gramStart"/>
       <w:r>
         <w:rPr>
           <w:rFonts w:asciiTheme="majorHAnsi" w:hAnsiTheme="majorHAnsi"/>
@@ -2812,7 +2940,19 @@
           <w:szCs w:val="22"/>
           <w:lang w:eastAsia="pl-PL"/>
         </w:rPr>
-        <w:t>()</w:t>
+        <w:t>(</w:t>
+      </w:r>
+      <w:proofErr w:type="gramEnd"/>
+      <w:r>
+        <w:rPr>
+          <w:rFonts w:asciiTheme="majorHAnsi" w:hAnsiTheme="majorHAnsi"/>
+          <w:b/>
+          <w:bCs/>
+          <w:color w:val="BF4E14" w:themeColor="accent2" w:themeShade="BF"/>
+          <w:szCs w:val="22"/>
+          <w:lang w:eastAsia="pl-PL"/>
+        </w:rPr>
+        <w:t>)</w:t>
       </w:r>
       <w:r>
         <w:rPr>
@@ -2995,6 +3135,7 @@
         </w:rPr>
       </w:pPr>
       <w:proofErr w:type="spellStart"/>
+      <w:proofErr w:type="gramStart"/>
       <w:r>
         <w:rPr>
           <w:rFonts w:asciiTheme="majorHAnsi" w:hAnsiTheme="majorHAnsi"/>
@@ -3007,6 +3148,7 @@
         <w:t>generator.Next</w:t>
       </w:r>
       <w:proofErr w:type="spellEnd"/>
+      <w:proofErr w:type="gramEnd"/>
       <w:r>
         <w:rPr>
           <w:rFonts w:asciiTheme="majorHAnsi" w:hAnsiTheme="majorHAnsi"/>
@@ -3132,6 +3274,7 @@
         </w:rPr>
       </w:pPr>
       <w:proofErr w:type="spellStart"/>
+      <w:proofErr w:type="gramStart"/>
       <w:r>
         <w:rPr>
           <w:rFonts w:asciiTheme="majorHAnsi" w:hAnsiTheme="majorHAnsi"/>
@@ -3144,6 +3287,7 @@
         <w:t>zestaw.Contains</w:t>
       </w:r>
       <w:proofErr w:type="spellEnd"/>
+      <w:proofErr w:type="gramEnd"/>
       <w:r>
         <w:rPr>
           <w:rFonts w:asciiTheme="majorHAnsi" w:hAnsiTheme="majorHAnsi"/>
@@ -3227,7 +3371,25 @@
           <w:szCs w:val="22"/>
           <w:lang w:eastAsia="pl-PL"/>
         </w:rPr>
-        <w:t>jeśli nie, liczba zostaje zapisana pod indeksem i, a następnie i++ przesuwa licznik.</w:t>
+        <w:t xml:space="preserve">jeśli nie, liczba zostaje zapisana pod indeksem </w:t>
+      </w:r>
+      <w:proofErr w:type="gramStart"/>
+      <w:r>
+        <w:rPr>
+          <w:rFonts w:asciiTheme="majorHAnsi" w:hAnsiTheme="majorHAnsi"/>
+          <w:szCs w:val="22"/>
+          <w:lang w:eastAsia="pl-PL"/>
+        </w:rPr>
+        <w:t>i,</w:t>
+      </w:r>
+      <w:proofErr w:type="gramEnd"/>
+      <w:r>
+        <w:rPr>
+          <w:rFonts w:asciiTheme="majorHAnsi" w:hAnsiTheme="majorHAnsi"/>
+          <w:szCs w:val="22"/>
+          <w:lang w:eastAsia="pl-PL"/>
+        </w:rPr>
+        <w:t xml:space="preserve"> a następnie i++ przesuwa licznik.</w:t>
       </w:r>
     </w:p>
     <w:p>
@@ -3304,6 +3466,7 @@
         <w:t xml:space="preserve">Funkcja </w:t>
       </w:r>
       <w:proofErr w:type="spellStart"/>
+      <w:proofErr w:type="gramStart"/>
       <w:r>
         <w:rPr>
           <w:rFonts w:asciiTheme="majorHAnsi" w:hAnsiTheme="majorHAnsi"/>
@@ -3321,7 +3484,17 @@
           <w:bCs/>
           <w:color w:val="BF4E14" w:themeColor="accent2" w:themeShade="BF"/>
         </w:rPr>
-        <w:t>()</w:t>
+        <w:t>(</w:t>
+      </w:r>
+      <w:proofErr w:type="gramEnd"/>
+      <w:r>
+        <w:rPr>
+          <w:rFonts w:asciiTheme="majorHAnsi" w:hAnsiTheme="majorHAnsi"/>
+          <w:b/>
+          <w:bCs/>
+          <w:color w:val="BF4E14" w:themeColor="accent2" w:themeShade="BF"/>
+        </w:rPr>
+        <w:t>)</w:t>
       </w:r>
       <w:r>
         <w:rPr>
@@ -3363,6 +3536,7 @@
         </w:rPr>
       </w:pPr>
       <w:proofErr w:type="spellStart"/>
+      <w:proofErr w:type="gramStart"/>
       <w:r>
         <w:rPr>
           <w:rFonts w:asciiTheme="majorHAnsi" w:hAnsiTheme="majorHAnsi"/>
@@ -3382,7 +3556,18 @@
           <w:color w:val="BF4E14" w:themeColor="accent2" w:themeShade="BF"/>
           <w:szCs w:val="22"/>
         </w:rPr>
-        <w:t xml:space="preserve">[] </w:t>
+        <w:t>[</w:t>
+      </w:r>
+      <w:proofErr w:type="gramEnd"/>
+      <w:r>
+        <w:rPr>
+          <w:rFonts w:asciiTheme="majorHAnsi" w:hAnsiTheme="majorHAnsi"/>
+          <w:b/>
+          <w:bCs/>
+          <w:color w:val="BF4E14" w:themeColor="accent2" w:themeShade="BF"/>
+          <w:szCs w:val="22"/>
+        </w:rPr>
+        <w:t xml:space="preserve">] </w:t>
       </w:r>
       <w:proofErr w:type="spellStart"/>
       <w:r>
@@ -3429,6 +3614,7 @@
         <w:t xml:space="preserve"> </w:t>
       </w:r>
       <w:proofErr w:type="spellStart"/>
+      <w:proofErr w:type="gramStart"/>
       <w:r>
         <w:rPr>
           <w:rFonts w:asciiTheme="majorHAnsi" w:hAnsiTheme="majorHAnsi"/>
@@ -3451,6 +3637,7 @@
         <w:t>[</w:t>
       </w:r>
       <w:proofErr w:type="spellStart"/>
+      <w:proofErr w:type="gramEnd"/>
       <w:r>
         <w:rPr>
           <w:rFonts w:asciiTheme="majorHAnsi" w:hAnsiTheme="majorHAnsi"/>
@@ -3605,6 +3792,7 @@
         </w:rPr>
       </w:pPr>
       <w:proofErr w:type="spellStart"/>
+      <w:proofErr w:type="gramStart"/>
       <w:r>
         <w:rPr>
           <w:rFonts w:asciiTheme="majorHAnsi" w:hAnsiTheme="majorHAnsi"/>
@@ -3624,7 +3812,40 @@
           <w:color w:val="BF4E14" w:themeColor="accent2" w:themeShade="BF"/>
           <w:szCs w:val="22"/>
         </w:rPr>
-        <w:t xml:space="preserve">[losowania[i, j] - 1]++ </w:t>
+        <w:t>[losowania[i,</w:t>
+      </w:r>
+      <w:proofErr w:type="gramEnd"/>
+      <w:r>
+        <w:rPr>
+          <w:rFonts w:asciiTheme="majorHAnsi" w:hAnsiTheme="majorHAnsi"/>
+          <w:b/>
+          <w:bCs/>
+          <w:color w:val="BF4E14" w:themeColor="accent2" w:themeShade="BF"/>
+          <w:szCs w:val="22"/>
+        </w:rPr>
+        <w:t xml:space="preserve"> j] - </w:t>
+      </w:r>
+      <w:proofErr w:type="gramStart"/>
+      <w:r>
+        <w:rPr>
+          <w:rFonts w:asciiTheme="majorHAnsi" w:hAnsiTheme="majorHAnsi"/>
+          <w:b/>
+          <w:bCs/>
+          <w:color w:val="BF4E14" w:themeColor="accent2" w:themeShade="BF"/>
+          <w:szCs w:val="22"/>
+        </w:rPr>
+        <w:t>1]+</w:t>
+      </w:r>
+      <w:proofErr w:type="gramEnd"/>
+      <w:r>
+        <w:rPr>
+          <w:rFonts w:asciiTheme="majorHAnsi" w:hAnsiTheme="majorHAnsi"/>
+          <w:b/>
+          <w:bCs/>
+          <w:color w:val="BF4E14" w:themeColor="accent2" w:themeShade="BF"/>
+          <w:szCs w:val="22"/>
+        </w:rPr>
+        <w:t xml:space="preserve">+ </w:t>
       </w:r>
       <w:r>
         <w:rPr>
@@ -3683,7 +3904,29 @@
           <w:color w:val="BF4E14" w:themeColor="accent2" w:themeShade="BF"/>
           <w:szCs w:val="22"/>
         </w:rPr>
-        <w:t>(losowania[i, j] + " ")</w:t>
+        <w:t>(</w:t>
+      </w:r>
+      <w:proofErr w:type="gramStart"/>
+      <w:r>
+        <w:rPr>
+          <w:rFonts w:asciiTheme="majorHAnsi" w:hAnsiTheme="majorHAnsi"/>
+          <w:b/>
+          <w:bCs/>
+          <w:color w:val="BF4E14" w:themeColor="accent2" w:themeShade="BF"/>
+          <w:szCs w:val="22"/>
+        </w:rPr>
+        <w:t>losowania[i,</w:t>
+      </w:r>
+      <w:proofErr w:type="gramEnd"/>
+      <w:r>
+        <w:rPr>
+          <w:rFonts w:asciiTheme="majorHAnsi" w:hAnsiTheme="majorHAnsi"/>
+          <w:b/>
+          <w:bCs/>
+          <w:color w:val="BF4E14" w:themeColor="accent2" w:themeShade="BF"/>
+          <w:szCs w:val="22"/>
+        </w:rPr>
+        <w:t xml:space="preserve"> j] + " ")</w:t>
       </w:r>
       <w:r>
         <w:rPr>
@@ -4371,12 +4614,17 @@
               <w:t xml:space="preserve">Wywołuje </w:t>
             </w:r>
             <w:proofErr w:type="spellStart"/>
+            <w:proofErr w:type="gramStart"/>
             <w:r>
               <w:t>LosujZestaw</w:t>
             </w:r>
             <w:proofErr w:type="spellEnd"/>
             <w:r>
-              <w:t xml:space="preserve">() i sprawdza </w:t>
+              <w:t>(</w:t>
+            </w:r>
+            <w:proofErr w:type="gramEnd"/>
+            <w:r>
+              <w:t xml:space="preserve">) i sprawdza </w:t>
             </w:r>
             <w:proofErr w:type="spellStart"/>
             <w:r>
@@ -4387,10 +4635,12 @@
               <w:t xml:space="preserve">(6, </w:t>
             </w:r>
             <w:proofErr w:type="spellStart"/>
+            <w:proofErr w:type="gramStart"/>
             <w:r>
               <w:t>zestaw.Length</w:t>
             </w:r>
             <w:proofErr w:type="spellEnd"/>
+            <w:proofErr w:type="gramEnd"/>
             <w:r>
               <w:t>).</w:t>
             </w:r>
@@ -4480,12 +4730,17 @@
               <w:t xml:space="preserve">Losuje 1000 zestawów. </w:t>
             </w:r>
             <w:proofErr w:type="spellStart"/>
+            <w:proofErr w:type="gramStart"/>
             <w:r>
               <w:t>Distinct</w:t>
             </w:r>
             <w:proofErr w:type="spellEnd"/>
             <w:r>
-              <w:t>() usuwa powtórzenia, więc liczba elementów po jego zastosowaniu musi być równa długości zestawu.</w:t>
+              <w:t>(</w:t>
+            </w:r>
+            <w:proofErr w:type="gramEnd"/>
+            <w:r>
+              <w:t>) usuwa powtórzenia, więc liczba elementów po jego zastosowaniu musi być równa długości zestawu.</w:t>
             </w:r>
           </w:p>
         </w:tc>
@@ -4669,12 +4924,17 @@
               <w:t xml:space="preserve">Dane zawierają liczbę 50, spoza zakresu. Metoda próbuje zwiększyć </w:t>
             </w:r>
             <w:proofErr w:type="spellStart"/>
+            <w:proofErr w:type="gramStart"/>
             <w:r>
               <w:t>wystapienia</w:t>
             </w:r>
             <w:proofErr w:type="spellEnd"/>
             <w:r>
-              <w:t xml:space="preserve">[49], ale tablica ma indeksy 0–48. </w:t>
+              <w:t>[</w:t>
+            </w:r>
+            <w:proofErr w:type="gramEnd"/>
+            <w:r>
+              <w:t xml:space="preserve">49], ale tablica ma indeksy 0–48. </w:t>
             </w:r>
             <w:proofErr w:type="spellStart"/>
             <w:r>
@@ -5268,20 +5528,30 @@
               <w:t xml:space="preserve">Wywołuje </w:t>
             </w:r>
             <w:proofErr w:type="spellStart"/>
+            <w:proofErr w:type="gramStart"/>
             <w:r>
               <w:t>LosujZestaw</w:t>
             </w:r>
             <w:proofErr w:type="spellEnd"/>
             <w:r>
-              <w:t xml:space="preserve">() wielokrotnie, przekazuje uzyskane dane do </w:t>
+              <w:t>(</w:t>
+            </w:r>
+            <w:proofErr w:type="gramEnd"/>
+            <w:r>
+              <w:t xml:space="preserve">) wielokrotnie, przekazuje uzyskane dane do </w:t>
             </w:r>
             <w:proofErr w:type="spellStart"/>
+            <w:proofErr w:type="gramStart"/>
             <w:r>
               <w:t>WyswietlLosowania</w:t>
             </w:r>
             <w:proofErr w:type="spellEnd"/>
             <w:r>
-              <w:t xml:space="preserve">() i przechwytuje wyjście konsoli za pomocą </w:t>
+              <w:t>(</w:t>
+            </w:r>
+            <w:proofErr w:type="gramEnd"/>
+            <w:r>
+              <w:t xml:space="preserve">) i przechwytuje wyjście konsoli za pomocą </w:t>
             </w:r>
             <w:proofErr w:type="spellStart"/>
             <w:r>
@@ -5474,7 +5744,15 @@
               <w:cnfStyle w:val="000000100000" w:firstRow="0" w:lastRow="0" w:firstColumn="0" w:lastColumn="0" w:oddVBand="0" w:evenVBand="0" w:oddHBand="1" w:evenHBand="0" w:firstRowFirstColumn="0" w:firstRowLastColumn="0" w:lastRowFirstColumn="0" w:lastRowLastColumn="0"/>
             </w:pPr>
             <w:r>
-              <w:t xml:space="preserve">Generuje znaną liczbę zestawów (np. 5) i weryfikuje w wypisanym strumieniu wyjściowym, czy łączna suma wystąpień wszystkich liczb wynosi dokładnie </w:t>
+              <w:t xml:space="preserve">Generuje znaną liczbę zestawów (np. 5) i weryfikuje w wypisanym strumieniu </w:t>
+            </w:r>
+            <w:proofErr w:type="gramStart"/>
+            <w:r>
+              <w:t>wyjściowym,</w:t>
+            </w:r>
+            <w:proofErr w:type="gramEnd"/>
+            <w:r>
+              <w:t xml:space="preserve"> czy łączna suma wystąpień wszystkich liczb wynosi dokładnie </w:t>
             </w:r>
             <m:oMath>
               <m:r>
@@ -5915,11 +6193,490 @@
         <w:t>Implementacja testów</w:t>
       </w:r>
     </w:p>
-    <w:p>
-      <w:pPr>
-        <w:jc w:val="center"/>
-      </w:pPr>
-    </w:p>
+    <w:tbl>
+      <w:tblPr>
+        <w:tblStyle w:val="Zwykatabela1"/>
+        <w:tblW w:w="10206" w:type="dxa"/>
+        <w:tblInd w:w="-572" w:type="dxa"/>
+        <w:tblLayout w:type="fixed"/>
+        <w:tblLook w:val="04A0" w:firstRow="1" w:lastRow="0" w:firstColumn="1" w:lastColumn="0" w:noHBand="0" w:noVBand="1"/>
+      </w:tblPr>
+      <w:tblGrid>
+        <w:gridCol w:w="319"/>
+        <w:gridCol w:w="1038"/>
+        <w:gridCol w:w="2329"/>
+        <w:gridCol w:w="3402"/>
+        <w:gridCol w:w="3118"/>
+      </w:tblGrid>
+      <w:tr>
+        <w:trPr>
+          <w:cnfStyle w:val="100000000000" w:firstRow="1" w:lastRow="0" w:firstColumn="0" w:lastColumn="0" w:oddVBand="0" w:evenVBand="0" w:oddHBand="0" w:evenHBand="0" w:firstRowFirstColumn="0" w:firstRowLastColumn="0" w:lastRowFirstColumn="0" w:lastRowLastColumn="0"/>
+          <w:trHeight w:val="486"/>
+        </w:trPr>
+        <w:tc>
+          <w:tcPr>
+            <w:cnfStyle w:val="001000000000" w:firstRow="0" w:lastRow="0" w:firstColumn="1" w:lastColumn="0" w:oddVBand="0" w:evenVBand="0" w:oddHBand="0" w:evenHBand="0" w:firstRowFirstColumn="0" w:firstRowLastColumn="0" w:lastRowFirstColumn="0" w:lastRowLastColumn="0"/>
+            <w:tcW w:w="319" w:type="dxa"/>
+            <w:hideMark/>
+          </w:tcPr>
+          <w:p>
+            <w:pPr>
+              <w:spacing w:after="160" w:line="278" w:lineRule="auto"/>
+            </w:pPr>
+            <w:r>
+              <w:t>#</w:t>
+            </w:r>
+          </w:p>
+        </w:tc>
+        <w:tc>
+          <w:tcPr>
+            <w:tcW w:w="1038" w:type="dxa"/>
+            <w:hideMark/>
+          </w:tcPr>
+          <w:p>
+            <w:pPr>
+              <w:spacing w:after="160" w:line="278" w:lineRule="auto"/>
+              <w:cnfStyle w:val="100000000000" w:firstRow="1" w:lastRow="0" w:firstColumn="0" w:lastColumn="0" w:oddVBand="0" w:evenVBand="0" w:oddHBand="0" w:evenHBand="0" w:firstRowFirstColumn="0" w:firstRowLastColumn="0" w:lastRowFirstColumn="0" w:lastRowLastColumn="0"/>
+            </w:pPr>
+            <w:r>
+              <w:t>Typ</w:t>
+            </w:r>
+          </w:p>
+        </w:tc>
+        <w:tc>
+          <w:tcPr>
+            <w:tcW w:w="2329" w:type="dxa"/>
+            <w:hideMark/>
+          </w:tcPr>
+          <w:p>
+            <w:pPr>
+              <w:spacing w:after="160" w:line="278" w:lineRule="auto"/>
+              <w:cnfStyle w:val="100000000000" w:firstRow="1" w:lastRow="0" w:firstColumn="0" w:lastColumn="0" w:oddVBand="0" w:evenVBand="0" w:oddHBand="0" w:evenHBand="0" w:firstRowFirstColumn="0" w:firstRowLastColumn="0" w:lastRowFirstColumn="0" w:lastRowLastColumn="0"/>
+            </w:pPr>
+            <w:r>
+              <w:t>Metoda testowa</w:t>
+            </w:r>
+          </w:p>
+        </w:tc>
+        <w:tc>
+          <w:tcPr>
+            <w:tcW w:w="3402" w:type="dxa"/>
+            <w:hideMark/>
+          </w:tcPr>
+          <w:p>
+            <w:pPr>
+              <w:spacing w:after="160" w:line="278" w:lineRule="auto"/>
+              <w:cnfStyle w:val="100000000000" w:firstRow="1" w:lastRow="0" w:firstColumn="0" w:lastColumn="0" w:oddVBand="0" w:evenVBand="0" w:oddHBand="0" w:evenHBand="0" w:firstRowFirstColumn="0" w:firstRowLastColumn="0" w:lastRowFirstColumn="0" w:lastRowLastColumn="0"/>
+            </w:pPr>
+            <w:r>
+              <w:t>Opis</w:t>
+            </w:r>
+          </w:p>
+        </w:tc>
+        <w:tc>
+          <w:tcPr>
+            <w:tcW w:w="3118" w:type="dxa"/>
+            <w:hideMark/>
+          </w:tcPr>
+          <w:p>
+            <w:pPr>
+              <w:spacing w:after="160" w:line="278" w:lineRule="auto"/>
+              <w:cnfStyle w:val="100000000000" w:firstRow="1" w:lastRow="0" w:firstColumn="0" w:lastColumn="0" w:oddVBand="0" w:evenVBand="0" w:oddHBand="0" w:evenHBand="0" w:firstRowFirstColumn="0" w:firstRowLastColumn="0" w:lastRowFirstColumn="0" w:lastRowLastColumn="0"/>
+            </w:pPr>
+            <w:r>
+              <w:t>Oczekiwany wynik</w:t>
+            </w:r>
+          </w:p>
+        </w:tc>
+      </w:tr>
+      <w:tr>
+        <w:trPr>
+          <w:cnfStyle w:val="000000100000" w:firstRow="0" w:lastRow="0" w:firstColumn="0" w:lastColumn="0" w:oddVBand="0" w:evenVBand="0" w:oddHBand="1" w:evenHBand="0" w:firstRowFirstColumn="0" w:firstRowLastColumn="0" w:lastRowFirstColumn="0" w:lastRowLastColumn="0"/>
+          <w:trHeight w:val="1725"/>
+        </w:trPr>
+        <w:tc>
+          <w:tcPr>
+            <w:cnfStyle w:val="001000000000" w:firstRow="0" w:lastRow="0" w:firstColumn="1" w:lastColumn="0" w:oddVBand="0" w:evenVBand="0" w:oddHBand="0" w:evenHBand="0" w:firstRowFirstColumn="0" w:firstRowLastColumn="0" w:lastRowFirstColumn="0" w:lastRowLastColumn="0"/>
+            <w:tcW w:w="319" w:type="dxa"/>
+            <w:hideMark/>
+          </w:tcPr>
+          <w:p>
+            <w:pPr>
+              <w:spacing w:after="160" w:line="278" w:lineRule="auto"/>
+            </w:pPr>
+            <w:r>
+              <w:t>1</w:t>
+            </w:r>
+          </w:p>
+        </w:tc>
+        <w:tc>
+          <w:tcPr>
+            <w:tcW w:w="1038" w:type="dxa"/>
+            <w:hideMark/>
+          </w:tcPr>
+          <w:p>
+            <w:pPr>
+              <w:spacing w:after="160" w:line="278" w:lineRule="auto"/>
+              <w:cnfStyle w:val="000000100000" w:firstRow="0" w:lastRow="0" w:firstColumn="0" w:lastColumn="0" w:oddVBand="0" w:evenVBand="0" w:oddHBand="1" w:evenHBand="0" w:firstRowFirstColumn="0" w:firstRowLastColumn="0" w:lastRowFirstColumn="0" w:lastRowLastColumn="0"/>
+            </w:pPr>
+            <w:r>
+              <w:t>poprawny</w:t>
+            </w:r>
+          </w:p>
+        </w:tc>
+        <w:tc>
+          <w:tcPr>
+            <w:tcW w:w="2329" w:type="dxa"/>
+            <w:hideMark/>
+          </w:tcPr>
+          <w:p>
+            <w:pPr>
+              <w:spacing w:after="160" w:line="278" w:lineRule="auto"/>
+              <w:cnfStyle w:val="000000100000" w:firstRow="0" w:lastRow="0" w:firstColumn="0" w:lastColumn="0" w:oddVBand="0" w:evenVBand="0" w:oddHBand="1" w:evenHBand="0" w:firstRowFirstColumn="0" w:firstRowLastColumn="0" w:lastRowFirstColumn="0" w:lastRowLastColumn="0"/>
+            </w:pPr>
+            <w:proofErr w:type="spellStart"/>
+            <w:r>
+              <w:t>System_UruchomienieAplikacji_ZwracaKodSukcesuZero</w:t>
+            </w:r>
+            <w:proofErr w:type="spellEnd"/>
+          </w:p>
+        </w:tc>
+        <w:tc>
+          <w:tcPr>
+            <w:tcW w:w="3402" w:type="dxa"/>
+            <w:hideMark/>
+          </w:tcPr>
+          <w:p>
+            <w:pPr>
+              <w:spacing w:after="160" w:line="278" w:lineRule="auto"/>
+              <w:cnfStyle w:val="000000100000" w:firstRow="0" w:lastRow="0" w:firstColumn="0" w:lastColumn="0" w:oddVBand="0" w:evenVBand="0" w:oddHBand="1" w:evenHBand="0" w:firstRowFirstColumn="0" w:firstRowLastColumn="0" w:lastRowFirstColumn="0" w:lastRowLastColumn="0"/>
+            </w:pPr>
+            <w:r>
+              <w:t>Uruchamia skompilowany plik wykonywalny aplikacji w osobnym procesie systemowym, przekazując na wejście poprawną liczbę losowań (np. "1").</w:t>
+            </w:r>
+          </w:p>
+        </w:tc>
+        <w:tc>
+          <w:tcPr>
+            <w:tcW w:w="3118" w:type="dxa"/>
+            <w:hideMark/>
+          </w:tcPr>
+          <w:p>
+            <w:pPr>
+              <w:spacing w:after="160" w:line="278" w:lineRule="auto"/>
+              <w:cnfStyle w:val="000000100000" w:firstRow="0" w:lastRow="0" w:firstColumn="0" w:lastColumn="0" w:oddVBand="0" w:evenVBand="0" w:oddHBand="1" w:evenHBand="0" w:firstRowFirstColumn="0" w:firstRowLastColumn="0" w:lastRowFirstColumn="0" w:lastRowLastColumn="0"/>
+            </w:pPr>
+            <w:proofErr w:type="spellStart"/>
+            <w:r>
+              <w:t>Process</w:t>
+            </w:r>
+            <w:proofErr w:type="spellEnd"/>
+            <w:r>
+              <w:t xml:space="preserve"> kończy się kodem wyjścia 0 (</w:t>
+            </w:r>
+            <w:proofErr w:type="spellStart"/>
+            <w:r>
+              <w:rPr>
+                <w:i/>
+                <w:iCs/>
+              </w:rPr>
+              <w:t>ExitCode</w:t>
+            </w:r>
+            <w:proofErr w:type="spellEnd"/>
+            <w:r>
+              <w:rPr>
+                <w:i/>
+                <w:iCs/>
+              </w:rPr>
+              <w:t xml:space="preserve"> = 0</w:t>
+            </w:r>
+            <w:r>
+              <w:t>), a w konsoli pojawia się pełny komunikat startowy i końcowy. Test zdany.</w:t>
+            </w:r>
+          </w:p>
+        </w:tc>
+      </w:tr>
+      <w:tr>
+        <w:trPr>
+          <w:trHeight w:val="1437"/>
+        </w:trPr>
+        <w:tc>
+          <w:tcPr>
+            <w:cnfStyle w:val="001000000000" w:firstRow="0" w:lastRow="0" w:firstColumn="1" w:lastColumn="0" w:oddVBand="0" w:evenVBand="0" w:oddHBand="0" w:evenHBand="0" w:firstRowFirstColumn="0" w:firstRowLastColumn="0" w:lastRowFirstColumn="0" w:lastRowLastColumn="0"/>
+            <w:tcW w:w="319" w:type="dxa"/>
+            <w:hideMark/>
+          </w:tcPr>
+          <w:p>
+            <w:pPr>
+              <w:spacing w:after="160" w:line="278" w:lineRule="auto"/>
+            </w:pPr>
+            <w:r>
+              <w:t>2</w:t>
+            </w:r>
+          </w:p>
+        </w:tc>
+        <w:tc>
+          <w:tcPr>
+            <w:tcW w:w="1038" w:type="dxa"/>
+            <w:hideMark/>
+          </w:tcPr>
+          <w:p>
+            <w:pPr>
+              <w:spacing w:after="160" w:line="278" w:lineRule="auto"/>
+              <w:cnfStyle w:val="000000000000" w:firstRow="0" w:lastRow="0" w:firstColumn="0" w:lastColumn="0" w:oddVBand="0" w:evenVBand="0" w:oddHBand="0" w:evenHBand="0" w:firstRowFirstColumn="0" w:firstRowLastColumn="0" w:lastRowFirstColumn="0" w:lastRowLastColumn="0"/>
+            </w:pPr>
+            <w:r>
+              <w:t>poprawny</w:t>
+            </w:r>
+          </w:p>
+        </w:tc>
+        <w:tc>
+          <w:tcPr>
+            <w:tcW w:w="2329" w:type="dxa"/>
+            <w:hideMark/>
+          </w:tcPr>
+          <w:p>
+            <w:pPr>
+              <w:spacing w:after="160" w:line="278" w:lineRule="auto"/>
+              <w:cnfStyle w:val="000000000000" w:firstRow="0" w:lastRow="0" w:firstColumn="0" w:lastColumn="0" w:oddVBand="0" w:evenVBand="0" w:oddHBand="0" w:evenHBand="0" w:firstRowFirstColumn="0" w:firstRowLastColumn="0" w:lastRowFirstColumn="0" w:lastRowLastColumn="0"/>
+            </w:pPr>
+            <w:proofErr w:type="spellStart"/>
+            <w:r>
+              <w:t>System_GenerowanieWieluZestawow_FormatWyjsciaZgodnyZWymaganiami</w:t>
+            </w:r>
+            <w:proofErr w:type="spellEnd"/>
+          </w:p>
+        </w:tc>
+        <w:tc>
+          <w:tcPr>
+            <w:tcW w:w="3402" w:type="dxa"/>
+            <w:hideMark/>
+          </w:tcPr>
+          <w:p>
+            <w:pPr>
+              <w:spacing w:after="160" w:line="278" w:lineRule="auto"/>
+              <w:cnfStyle w:val="000000000000" w:firstRow="0" w:lastRow="0" w:firstColumn="0" w:lastColumn="0" w:oddVBand="0" w:evenVBand="0" w:oddHBand="0" w:evenHBand="0" w:firstRowFirstColumn="0" w:firstRowLastColumn="0" w:lastRowFirstColumn="0" w:lastRowLastColumn="0"/>
+            </w:pPr>
+            <w:r>
+              <w:t>Uruchamia proces systemowy dla argumentu wejściowego "3" i sprawdza pełną strukturę tekstu zwróconego przez system.</w:t>
+            </w:r>
+          </w:p>
+        </w:tc>
+        <w:tc>
+          <w:tcPr>
+            <w:tcW w:w="3118" w:type="dxa"/>
+            <w:hideMark/>
+          </w:tcPr>
+          <w:p>
+            <w:pPr>
+              <w:spacing w:after="160" w:line="278" w:lineRule="auto"/>
+              <w:cnfStyle w:val="000000000000" w:firstRow="0" w:lastRow="0" w:firstColumn="0" w:lastColumn="0" w:oddVBand="0" w:evenVBand="0" w:oddHBand="0" w:evenHBand="0" w:firstRowFirstColumn="0" w:firstRowLastColumn="0" w:lastRowFirstColumn="0" w:lastRowLastColumn="0"/>
+            </w:pPr>
+            <w:r>
+              <w:t xml:space="preserve">Wyjście systemu zawiera dokładnie 3 linie z nagłówkami Losowanie </w:t>
+            </w:r>
+            <w:proofErr w:type="gramStart"/>
+            <w:r>
+              <w:t>1:,</w:t>
+            </w:r>
+            <w:proofErr w:type="gramEnd"/>
+            <w:r>
+              <w:t xml:space="preserve"> Losowanie </w:t>
+            </w:r>
+            <w:proofErr w:type="gramStart"/>
+            <w:r>
+              <w:t>2:,</w:t>
+            </w:r>
+            <w:proofErr w:type="gramEnd"/>
+            <w:r>
+              <w:t xml:space="preserve"> Losowanie 3: oraz pełną listę 49 statystyk. Test zdany.</w:t>
+            </w:r>
+          </w:p>
+        </w:tc>
+      </w:tr>
+      <w:tr>
+        <w:trPr>
+          <w:cnfStyle w:val="000000100000" w:firstRow="0" w:lastRow="0" w:firstColumn="0" w:lastColumn="0" w:oddVBand="0" w:evenVBand="0" w:oddHBand="1" w:evenHBand="0" w:firstRowFirstColumn="0" w:firstRowLastColumn="0" w:lastRowFirstColumn="0" w:lastRowLastColumn="0"/>
+          <w:trHeight w:val="1392"/>
+        </w:trPr>
+        <w:tc>
+          <w:tcPr>
+            <w:cnfStyle w:val="001000000000" w:firstRow="0" w:lastRow="0" w:firstColumn="1" w:lastColumn="0" w:oddVBand="0" w:evenVBand="0" w:oddHBand="0" w:evenHBand="0" w:firstRowFirstColumn="0" w:firstRowLastColumn="0" w:lastRowFirstColumn="0" w:lastRowLastColumn="0"/>
+            <w:tcW w:w="319" w:type="dxa"/>
+            <w:hideMark/>
+          </w:tcPr>
+          <w:p>
+            <w:pPr>
+              <w:spacing w:after="160" w:line="278" w:lineRule="auto"/>
+            </w:pPr>
+            <w:r>
+              <w:t>3</w:t>
+            </w:r>
+          </w:p>
+        </w:tc>
+        <w:tc>
+          <w:tcPr>
+            <w:tcW w:w="1038" w:type="dxa"/>
+            <w:hideMark/>
+          </w:tcPr>
+          <w:p>
+            <w:pPr>
+              <w:spacing w:after="160" w:line="278" w:lineRule="auto"/>
+              <w:cnfStyle w:val="000000100000" w:firstRow="0" w:lastRow="0" w:firstColumn="0" w:lastColumn="0" w:oddVBand="0" w:evenVBand="0" w:oddHBand="1" w:evenHBand="0" w:firstRowFirstColumn="0" w:firstRowLastColumn="0" w:lastRowFirstColumn="0" w:lastRowLastColumn="0"/>
+            </w:pPr>
+            <w:r>
+              <w:t>poprawny</w:t>
+            </w:r>
+          </w:p>
+        </w:tc>
+        <w:tc>
+          <w:tcPr>
+            <w:tcW w:w="2329" w:type="dxa"/>
+            <w:hideMark/>
+          </w:tcPr>
+          <w:p>
+            <w:pPr>
+              <w:spacing w:after="160" w:line="278" w:lineRule="auto"/>
+              <w:cnfStyle w:val="000000100000" w:firstRow="0" w:lastRow="0" w:firstColumn="0" w:lastColumn="0" w:oddVBand="0" w:evenVBand="0" w:oddHBand="1" w:evenHBand="0" w:firstRowFirstColumn="0" w:firstRowLastColumn="0" w:lastRowFirstColumn="0" w:lastRowLastColumn="0"/>
+            </w:pPr>
+            <w:proofErr w:type="spellStart"/>
+            <w:r>
+              <w:t>System_SzybkosceDzialania_WykonanieDlaDuzejLiczbyLosowan</w:t>
+            </w:r>
+            <w:proofErr w:type="spellEnd"/>
+          </w:p>
+        </w:tc>
+        <w:tc>
+          <w:tcPr>
+            <w:tcW w:w="3402" w:type="dxa"/>
+            <w:hideMark/>
+          </w:tcPr>
+          <w:p>
+            <w:pPr>
+              <w:spacing w:after="160" w:line="278" w:lineRule="auto"/>
+              <w:cnfStyle w:val="000000100000" w:firstRow="0" w:lastRow="0" w:firstColumn="0" w:lastColumn="0" w:oddVBand="0" w:evenVBand="0" w:oddHBand="1" w:evenHBand="0" w:firstRowFirstColumn="0" w:firstRowLastColumn="0" w:lastRowFirstColumn="0" w:lastRowLastColumn="0"/>
+            </w:pPr>
+            <w:r>
+              <w:t>Uruchamia proces z dużą liczbą losowań (np. "1000") i mierzy całkowity czas wykonania procesu w systemie operacyjnym.</w:t>
+            </w:r>
+          </w:p>
+        </w:tc>
+        <w:tc>
+          <w:tcPr>
+            <w:tcW w:w="3118" w:type="dxa"/>
+            <w:hideMark/>
+          </w:tcPr>
+          <w:p>
+            <w:pPr>
+              <w:spacing w:after="160" w:line="278" w:lineRule="auto"/>
+              <w:cnfStyle w:val="000000100000" w:firstRow="0" w:lastRow="0" w:firstColumn="0" w:lastColumn="0" w:oddVBand="0" w:evenVBand="0" w:oddHBand="1" w:evenHBand="0" w:firstRowFirstColumn="0" w:firstRowLastColumn="0" w:lastRowFirstColumn="0" w:lastRowLastColumn="0"/>
+            </w:pPr>
+            <w:r>
+              <w:t>Cały proces uruchamia się, generuje dane i kończy działanie w czasie poniżej 2 sekund. Test zdany.</w:t>
+            </w:r>
+          </w:p>
+        </w:tc>
+      </w:tr>
+      <w:tr>
+        <w:trPr>
+          <w:trHeight w:val="1448"/>
+        </w:trPr>
+        <w:tc>
+          <w:tcPr>
+            <w:cnfStyle w:val="001000000000" w:firstRow="0" w:lastRow="0" w:firstColumn="1" w:lastColumn="0" w:oddVBand="0" w:evenVBand="0" w:oddHBand="0" w:evenHBand="0" w:firstRowFirstColumn="0" w:firstRowLastColumn="0" w:lastRowFirstColumn="0" w:lastRowLastColumn="0"/>
+            <w:tcW w:w="319" w:type="dxa"/>
+            <w:hideMark/>
+          </w:tcPr>
+          <w:p>
+            <w:pPr>
+              <w:spacing w:after="160" w:line="278" w:lineRule="auto"/>
+            </w:pPr>
+            <w:r>
+              <w:t>4</w:t>
+            </w:r>
+          </w:p>
+        </w:tc>
+        <w:tc>
+          <w:tcPr>
+            <w:tcW w:w="1038" w:type="dxa"/>
+            <w:hideMark/>
+          </w:tcPr>
+          <w:p>
+            <w:pPr>
+              <w:spacing w:after="160" w:line="278" w:lineRule="auto"/>
+              <w:cnfStyle w:val="000000000000" w:firstRow="0" w:lastRow="0" w:firstColumn="0" w:lastColumn="0" w:oddVBand="0" w:evenVBand="0" w:oddHBand="0" w:evenHBand="0" w:firstRowFirstColumn="0" w:firstRowLastColumn="0" w:lastRowFirstColumn="0" w:lastRowLastColumn="0"/>
+            </w:pPr>
+            <w:r>
+              <w:t>niepoprawny</w:t>
+            </w:r>
+          </w:p>
+        </w:tc>
+        <w:tc>
+          <w:tcPr>
+            <w:tcW w:w="2329" w:type="dxa"/>
+            <w:hideMark/>
+          </w:tcPr>
+          <w:p>
+            <w:pPr>
+              <w:spacing w:after="160" w:line="278" w:lineRule="auto"/>
+              <w:cnfStyle w:val="000000000000" w:firstRow="0" w:lastRow="0" w:firstColumn="0" w:lastColumn="0" w:oddVBand="0" w:evenVBand="0" w:oddHBand="0" w:evenHBand="0" w:firstRowFirstColumn="0" w:firstRowLastColumn="0" w:lastRowFirstColumn="0" w:lastRowLastColumn="0"/>
+            </w:pPr>
+            <w:proofErr w:type="spellStart"/>
+            <w:r>
+              <w:t>System_BledneDaneWejsciowe_ZwracaObsluzonyBdadIObrywaProces</w:t>
+            </w:r>
+            <w:proofErr w:type="spellEnd"/>
+          </w:p>
+        </w:tc>
+        <w:tc>
+          <w:tcPr>
+            <w:tcW w:w="3402" w:type="dxa"/>
+            <w:hideMark/>
+          </w:tcPr>
+          <w:p>
+            <w:pPr>
+              <w:spacing w:after="160" w:line="278" w:lineRule="auto"/>
+              <w:cnfStyle w:val="000000000000" w:firstRow="0" w:lastRow="0" w:firstColumn="0" w:lastColumn="0" w:oddVBand="0" w:evenVBand="0" w:oddHBand="0" w:evenHBand="0" w:firstRowFirstColumn="0" w:firstRowLastColumn="0" w:lastRowFirstColumn="0" w:lastRowLastColumn="0"/>
+            </w:pPr>
+            <w:r>
+              <w:t>Uruchamia proces systemowy przekazując niepoprawny ciąg znaków (np. "</w:t>
+            </w:r>
+            <w:proofErr w:type="spellStart"/>
+            <w:r>
+              <w:t>nie_liczba</w:t>
+            </w:r>
+            <w:proofErr w:type="spellEnd"/>
+            <w:r>
+              <w:t>").</w:t>
+            </w:r>
+          </w:p>
+        </w:tc>
+        <w:tc>
+          <w:tcPr>
+            <w:tcW w:w="3118" w:type="dxa"/>
+            <w:hideMark/>
+          </w:tcPr>
+          <w:p>
+            <w:pPr>
+              <w:spacing w:after="160" w:line="278" w:lineRule="auto"/>
+              <w:cnfStyle w:val="000000000000" w:firstRow="0" w:lastRow="0" w:firstColumn="0" w:lastColumn="0" w:oddVBand="0" w:evenVBand="0" w:oddHBand="0" w:evenHBand="0" w:firstRowFirstColumn="0" w:firstRowLastColumn="0" w:lastRowFirstColumn="0" w:lastRowLastColumn="0"/>
+            </w:pPr>
+            <w:r>
+              <w:t>Proces wypisuje w systemie komunikat o błędzie i natychmiast bezpiecznie zamyka się z kodem wyjścia 0 (brak awarii/</w:t>
+            </w:r>
+            <w:proofErr w:type="spellStart"/>
+            <w:r>
+              <w:t>crasha</w:t>
+            </w:r>
+            <w:proofErr w:type="spellEnd"/>
+            <w:r>
+              <w:t xml:space="preserve"> aplikacji). Test zdany.</w:t>
+            </w:r>
+          </w:p>
+        </w:tc>
+      </w:tr>
+    </w:tbl>
+    <w:p/>
     <w:sectPr>
       <w:footerReference w:type="default" r:id="rId17"/>
       <w:pgSz w:w="11906" w:h="16838"/>

</xml_diff>

<commit_message>
Utworzenie czwartego testu systemowego - stabilności procesu systemowego przy błędnych danych wejściowych
</commit_message>
<xml_diff>
--- a/Testowanie aplikacji - Marcin_Migacz_5P2.docx
+++ b/Testowanie aplikacji - Marcin_Migacz_5P2.docx
@@ -283,20 +283,8 @@
           <w:sz w:val="28"/>
           <w:szCs w:val="28"/>
         </w:rPr>
-        <w:t xml:space="preserve">NOWY SĄCZ </w:t>
-      </w:r>
-      <w:proofErr w:type="gramStart"/>
-      <w:r>
-        <w:rPr>
-          <w:rFonts w:asciiTheme="majorHAnsi" w:hAnsiTheme="majorHAnsi"/>
-          <w:b/>
-          <w:bCs/>
-          <w:sz w:val="28"/>
-          <w:szCs w:val="28"/>
-        </w:rPr>
-        <w:t>2026r.</w:t>
-      </w:r>
-      <w:proofErr w:type="gramEnd"/>
+        <w:t>NOWY SĄCZ 2026r.</w:t>
+      </w:r>
     </w:p>
     <w:p>
       <w:pPr>
@@ -1296,23 +1284,7 @@
         <w:ind w:firstLine="360"/>
       </w:pPr>
       <w:r>
-        <w:t xml:space="preserve">Testowanie oprogramowania to proces </w:t>
-      </w:r>
-      <w:proofErr w:type="gramStart"/>
-      <w:r>
-        <w:t>sprawdzania,</w:t>
-      </w:r>
-      <w:proofErr w:type="gramEnd"/>
-      <w:r>
-        <w:t xml:space="preserve"> czy program działa zgodnie z </w:t>
-      </w:r>
-      <w:proofErr w:type="gramStart"/>
-      <w:r>
-        <w:t>wymaganiami,</w:t>
-      </w:r>
-      <w:proofErr w:type="gramEnd"/>
-      <w:r>
-        <w:t xml:space="preserve"> oraz wykrywania w nim błędów przed przekazaniem go użytkownikom. Błąd (defekt) to wada w kodzie, która może doprowadzić do awarii, czyli widocznego niepoprawnego działania systemu. Celem testowania jest nie tylko znajdowanie usterek, ale też ograniczanie ryzyka jego wdrożenia. Ze względu na poziom wyróżnia się testy jednostkowe, integracyjne, systemowe i akceptacyjne, które sprawdzają kolejno pojedyncze elementy, ich współpracę, cały system oraz zgodność z oczekiwaniami klienta. Ze względu na cel dzielimy je na funkcjonalne (co system robi) i niefunkcjonalne (jak działa: wydajność, bezpieczeństwo, użyteczność), a osobną grupę stanowią testy regresyjne, które po zmianach w kodzie sprawdzają, czy nie zepsuto istniejących funkcji. Wyróżnia się też podejścia czarnej skrzynki (bez znajomości kodu), białej skrzynki (z analizą wnętrza programu) i szarej skrzynki (mieszane). Pierwsza zasada testowania mówi, że testy ujawniają obecność błędów, ale nie dowodzą ich braku. Druga głosi, że testowanie wyczerpujące jest niemożliwe, więc wysiłek kieruje się na obszary o największym ryzyku. Trzecia zasada to wczesne testowanie, bo błąd znaleziony na etapie projektu kosztuje znacznie mniej niż ten znaleziony po wdrożeniu. Kolejne zasady mówią, że defekty grupują się w niewielu modułach, a wielokrotne uruchamianie tych samych testów przestaje wykrywać nowe błędy. Ostatnie zasady to zależność testów od kontekstu oraz złudzenie braku błędów: program bez usterek nadal nie jest wartościowy, jeśli nie spełnia potrzeb użytkownika. Proces testowy zaczyna się od planowania i nadzoru, czyli określenia zakresu, zasobów i kryteriów zakończenia. Następnie następuje analiza i projektowanie testów, w których powstają przypadki testowe z danymi wejściowymi i oczekiwanymi wynikami. Potem testy są implementowane i wykonywane, a wyniki rzeczywiste porównuje się z oczekiwanymi, po czym raportuje się znalezione błędy, wykonuje retesty po poprawkach i zamyka proces podsumowaniem.</w:t>
+        <w:t>Testowanie oprogramowania to proces sprawdzania, czy program działa zgodnie z wymaganiami, oraz wykrywania w nim błędów przed przekazaniem go użytkownikom. Błąd (defekt) to wada w kodzie, która może doprowadzić do awarii, czyli widocznego niepoprawnego działania systemu. Celem testowania jest nie tylko znajdowanie usterek, ale też ograniczanie ryzyka jego wdrożenia. Ze względu na poziom wyróżnia się testy jednostkowe, integracyjne, systemowe i akceptacyjne, które sprawdzają kolejno pojedyncze elementy, ich współpracę, cały system oraz zgodność z oczekiwaniami klienta. Ze względu na cel dzielimy je na funkcjonalne (co system robi) i niefunkcjonalne (jak działa: wydajność, bezpieczeństwo, użyteczność), a osobną grupę stanowią testy regresyjne, które po zmianach w kodzie sprawdzają, czy nie zepsuto istniejących funkcji. Wyróżnia się też podejścia czarnej skrzynki (bez znajomości kodu), białej skrzynki (z analizą wnętrza programu) i szarej skrzynki (mieszane). Pierwsza zasada testowania mówi, że testy ujawniają obecność błędów, ale nie dowodzą ich braku. Druga głosi, że testowanie wyczerpujące jest niemożliwe, więc wysiłek kieruje się na obszary o największym ryzyku. Trzecia zasada to wczesne testowanie, bo błąd znaleziony na etapie projektu kosztuje znacznie mniej niż ten znaleziony po wdrożeniu. Kolejne zasady mówią, że defekty grupują się w niewielu modułach, a wielokrotne uruchamianie tych samych testów przestaje wykrywać nowe błędy. Ostatnie zasady to zależność testów od kontekstu oraz złudzenie braku błędów: program bez usterek nadal nie jest wartościowy, jeśli nie spełnia potrzeb użytkownika. Proces testowy zaczyna się od planowania i nadzoru, czyli określenia zakresu, zasobów i kryteriów zakończenia. Następnie następuje analiza i projektowanie testów, w których powstają przypadki testowe z danymi wejściowymi i oczekiwanymi wynikami. Potem testy są implementowane i wykonywane, a wyniki rzeczywiste porównuje się z oczekiwanymi, po czym raportuje się znalezione błędy, wykonuje retesty po poprawkach i zamyka proces podsumowaniem.</w:t>
       </w:r>
     </w:p>
     <w:p>
@@ -1366,17 +1338,8 @@
           <w:i/>
           <w:iCs/>
         </w:rPr>
-        <w:t xml:space="preserve">unit </w:t>
-      </w:r>
-      <w:proofErr w:type="spellStart"/>
-      <w:r>
-        <w:rPr>
-          <w:i/>
-          <w:iCs/>
-        </w:rPr>
-        <w:t>tests</w:t>
-      </w:r>
-      <w:proofErr w:type="spellEnd"/>
+        <w:t>unit tests</w:t>
+      </w:r>
       <w:r>
         <w:t>) sprawdzają najmniejsze samodzielne fragmenty programu, np. pojedynczą metodę lub klasę, w izolacji od reszty systemu. Każdy test podaje określone dane wejściowe, uruchamia testowaną jednostkę i porównuje jej wynik z oczekiwanym. Są szybkie, w pełni automatyczne i powtarzalne, więc można je uruchamiać po każdej zmianie kodu.</w:t>
       </w:r>
@@ -1419,66 +1382,10 @@
           <w:b/>
           <w:bCs/>
         </w:rPr>
-        <w:t xml:space="preserve"> </w:t>
-      </w:r>
-      <w:proofErr w:type="spellStart"/>
-      <w:r>
-        <w:rPr>
-          <w:b/>
-          <w:bCs/>
-        </w:rPr>
-        <w:t>xUnit</w:t>
-      </w:r>
-      <w:proofErr w:type="spellEnd"/>
-      <w:r>
-        <w:rPr>
-          <w:b/>
-          <w:bCs/>
-        </w:rPr>
-        <w:t>.</w:t>
-      </w:r>
-      <w:r>
-        <w:t xml:space="preserve"> </w:t>
-      </w:r>
-      <w:proofErr w:type="spellStart"/>
-      <w:r>
-        <w:t>xUnit</w:t>
-      </w:r>
-      <w:proofErr w:type="spellEnd"/>
-      <w:r>
-        <w:t xml:space="preserve"> to popularny, darmowy </w:t>
-      </w:r>
-      <w:proofErr w:type="spellStart"/>
-      <w:r>
-        <w:t>framework</w:t>
-      </w:r>
-      <w:proofErr w:type="spellEnd"/>
-      <w:r>
-        <w:t xml:space="preserve"> do testów jednostkowych w .NET (C#). Testy są zwykłymi metodami oznaczonymi atrybutem [</w:t>
-      </w:r>
-      <w:proofErr w:type="spellStart"/>
-      <w:r>
-        <w:t>Fact</w:t>
-      </w:r>
-      <w:proofErr w:type="spellEnd"/>
-      <w:r>
-        <w:t>] (test bez parametrów) lub [</w:t>
-      </w:r>
-      <w:proofErr w:type="spellStart"/>
-      <w:r>
-        <w:t>Theory</w:t>
-      </w:r>
-      <w:proofErr w:type="spellEnd"/>
-      <w:r>
-        <w:t xml:space="preserve">] (test z wieloma zestawami danych). Do sprawdzania wyników służą asercje klasy </w:t>
-      </w:r>
-      <w:proofErr w:type="spellStart"/>
-      <w:r>
-        <w:t>Assert</w:t>
-      </w:r>
-      <w:proofErr w:type="spellEnd"/>
-      <w:r>
-        <w:t>. Test przechodzi, gdy wszystkie asercje są spełnione, a nie przechodzi, gdy któraś zawiedzie lub wystąpi nieoczekiwany wyjątek</w:t>
+        <w:t xml:space="preserve"> xUnit.</w:t>
+      </w:r>
+      <w:r>
+        <w:t xml:space="preserve"> xUnit to popularny, darmowy framework do testów jednostkowych w .NET (C#). Testy są zwykłymi metodami oznaczonymi atrybutem [Fact] (test bez parametrów) lub [Theory] (test z wieloma zestawami danych). Do sprawdzania wyników służą asercje klasy Assert. Test przechodzi, gdy wszystkie asercje są spełnione, a nie przechodzi, gdy któraś zawiedzie lub wystąpi nieoczekiwany wyjątek</w:t>
       </w:r>
       <w:r>
         <w:t>.</w:t>
@@ -1795,14 +1702,12 @@
                 <w:szCs w:val="22"/>
               </w:rPr>
             </w:pPr>
-            <w:proofErr w:type="spellStart"/>
             <w:r>
               <w:rPr>
                 <w:szCs w:val="22"/>
               </w:rPr>
               <w:t>LiczbWZestawie</w:t>
             </w:r>
-            <w:proofErr w:type="spellEnd"/>
           </w:p>
         </w:tc>
         <w:tc>
@@ -1856,14 +1761,12 @@
                 <w:szCs w:val="22"/>
               </w:rPr>
             </w:pPr>
-            <w:proofErr w:type="spellStart"/>
             <w:r>
               <w:rPr>
                 <w:szCs w:val="22"/>
               </w:rPr>
               <w:t>MinLiczba</w:t>
             </w:r>
-            <w:proofErr w:type="spellEnd"/>
           </w:p>
         </w:tc>
         <w:tc>
@@ -1917,14 +1820,12 @@
                 <w:szCs w:val="22"/>
               </w:rPr>
             </w:pPr>
-            <w:proofErr w:type="spellStart"/>
             <w:r>
               <w:rPr>
                 <w:szCs w:val="22"/>
               </w:rPr>
               <w:t>MaxLiczba</w:t>
             </w:r>
-            <w:proofErr w:type="spellEnd"/>
           </w:p>
         </w:tc>
         <w:tc>
@@ -2002,7 +1903,6 @@
         </w:rPr>
         <w:t xml:space="preserve">Funkcja </w:t>
       </w:r>
-      <w:proofErr w:type="spellStart"/>
       <w:r>
         <w:rPr>
           <w:b/>
@@ -2012,7 +1912,6 @@
         </w:rPr>
         <w:t>Main</w:t>
       </w:r>
-      <w:proofErr w:type="spellEnd"/>
     </w:p>
     <w:p>
       <w:pPr>
@@ -2027,8 +1926,6 @@
           <w:szCs w:val="22"/>
         </w:rPr>
       </w:pPr>
-      <w:proofErr w:type="spellStart"/>
-      <w:proofErr w:type="gramStart"/>
       <w:r>
         <w:rPr>
           <w:rFonts w:asciiTheme="majorHAnsi" w:hAnsiTheme="majorHAnsi"/>
@@ -2037,157 +1934,22 @@
           <w:color w:val="BF4E14" w:themeColor="accent2" w:themeShade="BF"/>
           <w:szCs w:val="22"/>
         </w:rPr>
-        <w:t>int.TryParse</w:t>
-      </w:r>
-      <w:proofErr w:type="spellEnd"/>
-      <w:proofErr w:type="gramEnd"/>
-      <w:r>
-        <w:rPr>
-          <w:rFonts w:asciiTheme="majorHAnsi" w:hAnsiTheme="majorHAnsi"/>
-          <w:b/>
-          <w:bCs/>
+        <w:t>int.TryParse(Console.ReadLine(), out int ileZestawow)</w:t>
+      </w:r>
+      <w:r>
+        <w:rPr>
+          <w:rFonts w:asciiTheme="majorHAnsi" w:hAnsiTheme="majorHAnsi"/>
           <w:color w:val="BF4E14" w:themeColor="accent2" w:themeShade="BF"/>
           <w:szCs w:val="22"/>
         </w:rPr>
-        <w:t>(</w:t>
-      </w:r>
-      <w:proofErr w:type="spellStart"/>
-      <w:r>
-        <w:rPr>
-          <w:rFonts w:asciiTheme="majorHAnsi" w:hAnsiTheme="majorHAnsi"/>
-          <w:b/>
-          <w:bCs/>
-          <w:color w:val="BF4E14" w:themeColor="accent2" w:themeShade="BF"/>
-          <w:szCs w:val="22"/>
-        </w:rPr>
-        <w:t>Console.ReadLine</w:t>
-      </w:r>
-      <w:proofErr w:type="spellEnd"/>
-      <w:r>
-        <w:rPr>
-          <w:rFonts w:asciiTheme="majorHAnsi" w:hAnsiTheme="majorHAnsi"/>
-          <w:b/>
-          <w:bCs/>
-          <w:color w:val="BF4E14" w:themeColor="accent2" w:themeShade="BF"/>
-          <w:szCs w:val="22"/>
-        </w:rPr>
-        <w:t xml:space="preserve">(), out </w:t>
-      </w:r>
-      <w:proofErr w:type="spellStart"/>
-      <w:r>
-        <w:rPr>
-          <w:rFonts w:asciiTheme="majorHAnsi" w:hAnsiTheme="majorHAnsi"/>
-          <w:b/>
-          <w:bCs/>
-          <w:color w:val="BF4E14" w:themeColor="accent2" w:themeShade="BF"/>
-          <w:szCs w:val="22"/>
-        </w:rPr>
-        <w:t>int</w:t>
-      </w:r>
-      <w:proofErr w:type="spellEnd"/>
-      <w:r>
-        <w:rPr>
-          <w:rFonts w:asciiTheme="majorHAnsi" w:hAnsiTheme="majorHAnsi"/>
-          <w:b/>
-          <w:bCs/>
-          <w:color w:val="BF4E14" w:themeColor="accent2" w:themeShade="BF"/>
-          <w:szCs w:val="22"/>
-        </w:rPr>
         <w:t xml:space="preserve"> </w:t>
       </w:r>
-      <w:proofErr w:type="spellStart"/>
-      <w:proofErr w:type="gramStart"/>
-      <w:r>
-        <w:rPr>
-          <w:rFonts w:asciiTheme="majorHAnsi" w:hAnsiTheme="majorHAnsi"/>
-          <w:b/>
-          <w:bCs/>
-          <w:color w:val="BF4E14" w:themeColor="accent2" w:themeShade="BF"/>
-          <w:szCs w:val="22"/>
-        </w:rPr>
-        <w:t>ileZestawow</w:t>
-      </w:r>
-      <w:proofErr w:type="spellEnd"/>
-      <w:r>
-        <w:rPr>
-          <w:rFonts w:asciiTheme="majorHAnsi" w:hAnsiTheme="majorHAnsi"/>
-          <w:b/>
-          <w:bCs/>
-          <w:color w:val="BF4E14" w:themeColor="accent2" w:themeShade="BF"/>
-          <w:szCs w:val="22"/>
-        </w:rPr>
-        <w:t>)</w:t>
-      </w:r>
-      <w:r>
-        <w:rPr>
-          <w:rFonts w:asciiTheme="majorHAnsi" w:hAnsiTheme="majorHAnsi"/>
-          <w:color w:val="BF4E14" w:themeColor="accent2" w:themeShade="BF"/>
-          <w:szCs w:val="22"/>
-        </w:rPr>
-        <w:t xml:space="preserve"> </w:t>
-      </w:r>
-      <w:r>
-        <w:rPr>
-          <w:rFonts w:asciiTheme="majorHAnsi" w:hAnsiTheme="majorHAnsi"/>
-          <w:szCs w:val="22"/>
-        </w:rPr>
-        <w:t xml:space="preserve"> -</w:t>
-      </w:r>
-      <w:proofErr w:type="gramEnd"/>
-      <w:r>
-        <w:rPr>
-          <w:rFonts w:asciiTheme="majorHAnsi" w:hAnsiTheme="majorHAnsi"/>
-          <w:szCs w:val="22"/>
-        </w:rPr>
-        <w:t xml:space="preserve"> wczytuje tekst z klawiatury i próbuje zamienić go na liczbę całkowitą. Jeśli się uda, zwraca </w:t>
-      </w:r>
-      <w:proofErr w:type="spellStart"/>
-      <w:r>
-        <w:rPr>
-          <w:rFonts w:asciiTheme="majorHAnsi" w:hAnsiTheme="majorHAnsi"/>
-          <w:szCs w:val="22"/>
-        </w:rPr>
-        <w:t>true</w:t>
-      </w:r>
-      <w:proofErr w:type="spellEnd"/>
-      <w:r>
-        <w:rPr>
-          <w:rFonts w:asciiTheme="majorHAnsi" w:hAnsiTheme="majorHAnsi"/>
-          <w:szCs w:val="22"/>
-        </w:rPr>
-        <w:t xml:space="preserve">, a wynik trafia do zmiennej </w:t>
-      </w:r>
-      <w:proofErr w:type="spellStart"/>
-      <w:r>
-        <w:rPr>
-          <w:rFonts w:asciiTheme="majorHAnsi" w:hAnsiTheme="majorHAnsi"/>
-          <w:szCs w:val="22"/>
-        </w:rPr>
-        <w:t>ileZestawow</w:t>
-      </w:r>
-      <w:proofErr w:type="spellEnd"/>
-      <w:r>
-        <w:rPr>
-          <w:rFonts w:asciiTheme="majorHAnsi" w:hAnsiTheme="majorHAnsi"/>
-          <w:szCs w:val="22"/>
-        </w:rPr>
-        <w:t xml:space="preserve">. Jeśli użytkownik wpisze tekst (np. abc), zwraca </w:t>
-      </w:r>
-      <w:proofErr w:type="spellStart"/>
-      <w:r>
-        <w:rPr>
-          <w:rFonts w:asciiTheme="majorHAnsi" w:hAnsiTheme="majorHAnsi"/>
-          <w:szCs w:val="22"/>
-        </w:rPr>
-        <w:t>false</w:t>
-      </w:r>
-      <w:proofErr w:type="spellEnd"/>
-      <w:r>
-        <w:rPr>
-          <w:rFonts w:asciiTheme="majorHAnsi" w:hAnsiTheme="majorHAnsi"/>
-          <w:szCs w:val="22"/>
-        </w:rPr>
-        <w:t xml:space="preserve"> i program nie ulega awarii.</w:t>
+      <w:r>
+        <w:rPr>
+          <w:rFonts w:asciiTheme="majorHAnsi" w:hAnsiTheme="majorHAnsi"/>
+          <w:szCs w:val="22"/>
+        </w:rPr>
+        <w:t xml:space="preserve"> - wczytuje tekst z klawiatury i próbuje zamienić go na liczbę całkowitą. Jeśli się uda, zwraca true, a wynik trafia do zmiennej ileZestawow. Jeśli użytkownik wpisze tekst (np. abc), zwraca false i program nie ulega awarii.</w:t>
       </w:r>
     </w:p>
     <w:p>
@@ -2204,7 +1966,6 @@
           <w:szCs w:val="22"/>
         </w:rPr>
       </w:pPr>
-      <w:proofErr w:type="spellStart"/>
       <w:r>
         <w:rPr>
           <w:rFonts w:asciiTheme="majorHAnsi" w:hAnsiTheme="majorHAnsi"/>
@@ -2212,17 +1973,7 @@
           <w:bCs/>
           <w:szCs w:val="22"/>
         </w:rPr>
-        <w:t>if</w:t>
-      </w:r>
-      <w:proofErr w:type="spellEnd"/>
-      <w:r>
-        <w:rPr>
-          <w:rFonts w:asciiTheme="majorHAnsi" w:hAnsiTheme="majorHAnsi"/>
-          <w:b/>
-          <w:bCs/>
-          <w:szCs w:val="22"/>
-        </w:rPr>
-        <w:t xml:space="preserve"> (poprawne dane):</w:t>
+        <w:t>if (poprawne dane):</w:t>
       </w:r>
     </w:p>
     <w:p>
@@ -2237,7 +1988,6 @@
           <w:szCs w:val="22"/>
         </w:rPr>
       </w:pPr>
-      <w:proofErr w:type="spellStart"/>
       <w:r>
         <w:rPr>
           <w:rFonts w:asciiTheme="majorHAnsi" w:hAnsiTheme="majorHAnsi"/>
@@ -2246,86 +1996,7 @@
           <w:color w:val="BF4E14" w:themeColor="accent2" w:themeShade="BF"/>
           <w:szCs w:val="22"/>
         </w:rPr>
-        <w:t>new</w:t>
-      </w:r>
-      <w:proofErr w:type="spellEnd"/>
-      <w:r>
-        <w:rPr>
-          <w:rFonts w:asciiTheme="majorHAnsi" w:hAnsiTheme="majorHAnsi"/>
-          <w:b/>
-          <w:bCs/>
-          <w:color w:val="BF4E14" w:themeColor="accent2" w:themeShade="BF"/>
-          <w:szCs w:val="22"/>
-        </w:rPr>
-        <w:t xml:space="preserve"> </w:t>
-      </w:r>
-      <w:proofErr w:type="spellStart"/>
-      <w:proofErr w:type="gramStart"/>
-      <w:r>
-        <w:rPr>
-          <w:rFonts w:asciiTheme="majorHAnsi" w:hAnsiTheme="majorHAnsi"/>
-          <w:b/>
-          <w:bCs/>
-          <w:color w:val="BF4E14" w:themeColor="accent2" w:themeShade="BF"/>
-          <w:szCs w:val="22"/>
-        </w:rPr>
-        <w:t>int</w:t>
-      </w:r>
-      <w:proofErr w:type="spellEnd"/>
-      <w:r>
-        <w:rPr>
-          <w:rFonts w:asciiTheme="majorHAnsi" w:hAnsiTheme="majorHAnsi"/>
-          <w:b/>
-          <w:bCs/>
-          <w:color w:val="BF4E14" w:themeColor="accent2" w:themeShade="BF"/>
-          <w:szCs w:val="22"/>
-        </w:rPr>
-        <w:t>[</w:t>
-      </w:r>
-      <w:proofErr w:type="spellStart"/>
-      <w:proofErr w:type="gramEnd"/>
-      <w:r>
-        <w:rPr>
-          <w:rFonts w:asciiTheme="majorHAnsi" w:hAnsiTheme="majorHAnsi"/>
-          <w:b/>
-          <w:bCs/>
-          <w:color w:val="BF4E14" w:themeColor="accent2" w:themeShade="BF"/>
-          <w:szCs w:val="22"/>
-        </w:rPr>
-        <w:t>ileZestawow</w:t>
-      </w:r>
-      <w:proofErr w:type="spellEnd"/>
-      <w:r>
-        <w:rPr>
-          <w:rFonts w:asciiTheme="majorHAnsi" w:hAnsiTheme="majorHAnsi"/>
-          <w:b/>
-          <w:bCs/>
-          <w:color w:val="BF4E14" w:themeColor="accent2" w:themeShade="BF"/>
-          <w:szCs w:val="22"/>
-        </w:rPr>
-        <w:t xml:space="preserve">, </w:t>
-      </w:r>
-      <w:proofErr w:type="spellStart"/>
-      <w:r>
-        <w:rPr>
-          <w:rFonts w:asciiTheme="majorHAnsi" w:hAnsiTheme="majorHAnsi"/>
-          <w:b/>
-          <w:bCs/>
-          <w:color w:val="BF4E14" w:themeColor="accent2" w:themeShade="BF"/>
-          <w:szCs w:val="22"/>
-        </w:rPr>
-        <w:t>LiczbWZestawie</w:t>
-      </w:r>
-      <w:proofErr w:type="spellEnd"/>
-      <w:r>
-        <w:rPr>
-          <w:rFonts w:asciiTheme="majorHAnsi" w:hAnsiTheme="majorHAnsi"/>
-          <w:b/>
-          <w:bCs/>
-          <w:color w:val="BF4E14" w:themeColor="accent2" w:themeShade="BF"/>
-          <w:szCs w:val="22"/>
-        </w:rPr>
-        <w:t>]</w:t>
+        <w:t>new int[ileZestawow, LiczbWZestawie]</w:t>
       </w:r>
       <w:r>
         <w:rPr>
@@ -2360,48 +2031,7 @@
           <w:rFonts w:asciiTheme="majorHAnsi" w:hAnsiTheme="majorHAnsi"/>
           <w:szCs w:val="22"/>
         </w:rPr>
-        <w:t>Pętla zewnętrzna for (</w:t>
-      </w:r>
-      <w:proofErr w:type="gramStart"/>
-      <w:r>
-        <w:rPr>
-          <w:rFonts w:asciiTheme="majorHAnsi" w:hAnsiTheme="majorHAnsi"/>
-          <w:szCs w:val="22"/>
-        </w:rPr>
-        <w:t>i...</w:t>
-      </w:r>
-      <w:proofErr w:type="gramEnd"/>
-      <w:r>
-        <w:rPr>
-          <w:rFonts w:asciiTheme="majorHAnsi" w:hAnsiTheme="majorHAnsi"/>
-          <w:szCs w:val="22"/>
-        </w:rPr>
-        <w:t xml:space="preserve">) wykonuje się raz dla każdego zestawu. W każdym obiegu wywołuje </w:t>
-      </w:r>
-      <w:proofErr w:type="spellStart"/>
-      <w:proofErr w:type="gramStart"/>
-      <w:r>
-        <w:rPr>
-          <w:rFonts w:asciiTheme="majorHAnsi" w:hAnsiTheme="majorHAnsi"/>
-          <w:szCs w:val="22"/>
-        </w:rPr>
-        <w:t>LosujZestaw</w:t>
-      </w:r>
-      <w:proofErr w:type="spellEnd"/>
-      <w:r>
-        <w:rPr>
-          <w:rFonts w:asciiTheme="majorHAnsi" w:hAnsiTheme="majorHAnsi"/>
-          <w:szCs w:val="22"/>
-        </w:rPr>
-        <w:t>(</w:t>
-      </w:r>
-      <w:proofErr w:type="gramEnd"/>
-      <w:r>
-        <w:rPr>
-          <w:rFonts w:asciiTheme="majorHAnsi" w:hAnsiTheme="majorHAnsi"/>
-          <w:szCs w:val="22"/>
-        </w:rPr>
-        <w:t>), która zwraca 6-elementową tablicę.</w:t>
+        <w:t>Pętla zewnętrzna for (i...) wykonuje się raz dla każdego zestawu. W każdym obiegu wywołuje LosujZestaw(), która zwraca 6-elementową tablicę.</w:t>
       </w:r>
     </w:p>
     <w:p>
@@ -2421,23 +2051,7 @@
           <w:rFonts w:asciiTheme="majorHAnsi" w:hAnsiTheme="majorHAnsi"/>
           <w:szCs w:val="22"/>
         </w:rPr>
-        <w:t>Pętla wewnętrzna for (</w:t>
-      </w:r>
-      <w:proofErr w:type="gramStart"/>
-      <w:r>
-        <w:rPr>
-          <w:rFonts w:asciiTheme="majorHAnsi" w:hAnsiTheme="majorHAnsi"/>
-          <w:szCs w:val="22"/>
-        </w:rPr>
-        <w:t>j...</w:t>
-      </w:r>
-      <w:proofErr w:type="gramEnd"/>
-      <w:r>
-        <w:rPr>
-          <w:rFonts w:asciiTheme="majorHAnsi" w:hAnsiTheme="majorHAnsi"/>
-          <w:szCs w:val="22"/>
-        </w:rPr>
-        <w:t>) przepisuje 6 wylosowanych liczb do wiersza i tablicy losowania.</w:t>
+        <w:t>Pętla wewnętrzna for (j...) przepisuje 6 wylosowanych liczb do wiersza i tablicy losowania.</w:t>
       </w:r>
     </w:p>
     <w:p>
@@ -2452,8 +2066,6 @@
           <w:szCs w:val="22"/>
         </w:rPr>
       </w:pPr>
-      <w:proofErr w:type="spellStart"/>
-      <w:proofErr w:type="gramStart"/>
       <w:r>
         <w:rPr>
           <w:rFonts w:asciiTheme="majorHAnsi" w:hAnsiTheme="majorHAnsi"/>
@@ -2462,41 +2074,7 @@
           <w:color w:val="BF4E14" w:themeColor="accent2" w:themeShade="BF"/>
           <w:szCs w:val="22"/>
         </w:rPr>
-        <w:t>WyswietlLosowania</w:t>
-      </w:r>
-      <w:proofErr w:type="spellEnd"/>
-      <w:r>
-        <w:rPr>
-          <w:rFonts w:asciiTheme="majorHAnsi" w:hAnsiTheme="majorHAnsi"/>
-          <w:b/>
-          <w:bCs/>
-          <w:color w:val="BF4E14" w:themeColor="accent2" w:themeShade="BF"/>
-          <w:szCs w:val="22"/>
-        </w:rPr>
-        <w:t>(</w:t>
-      </w:r>
-      <w:proofErr w:type="spellStart"/>
-      <w:proofErr w:type="gramEnd"/>
-      <w:r>
-        <w:rPr>
-          <w:rFonts w:asciiTheme="majorHAnsi" w:hAnsiTheme="majorHAnsi"/>
-          <w:b/>
-          <w:bCs/>
-          <w:color w:val="BF4E14" w:themeColor="accent2" w:themeShade="BF"/>
-          <w:szCs w:val="22"/>
-        </w:rPr>
-        <w:t>ileZestawow</w:t>
-      </w:r>
-      <w:proofErr w:type="spellEnd"/>
-      <w:r>
-        <w:rPr>
-          <w:rFonts w:asciiTheme="majorHAnsi" w:hAnsiTheme="majorHAnsi"/>
-          <w:b/>
-          <w:bCs/>
-          <w:color w:val="BF4E14" w:themeColor="accent2" w:themeShade="BF"/>
-          <w:szCs w:val="22"/>
-        </w:rPr>
-        <w:t>, losowania)</w:t>
+        <w:t>WyswietlLosowania(ileZestawow, losowania)</w:t>
       </w:r>
       <w:r>
         <w:rPr>
@@ -2528,7 +2106,6 @@
           <w:szCs w:val="22"/>
         </w:rPr>
       </w:pPr>
-      <w:proofErr w:type="spellStart"/>
       <w:r>
         <w:rPr>
           <w:rFonts w:asciiTheme="majorHAnsi" w:hAnsiTheme="majorHAnsi"/>
@@ -2536,25 +2113,27 @@
           <w:bCs/>
           <w:szCs w:val="22"/>
         </w:rPr>
-        <w:t>else</w:t>
-      </w:r>
-      <w:proofErr w:type="spellEnd"/>
-      <w:r>
+        <w:t>else (błędne dane):</w:t>
+      </w:r>
+      <w:r>
+        <w:rPr>
+          <w:rFonts w:asciiTheme="majorHAnsi" w:hAnsiTheme="majorHAnsi"/>
+          <w:szCs w:val="22"/>
+        </w:rPr>
+        <w:t xml:space="preserve"> wypisuje komunikat o niepoprawnej wartości i kończy program instrukcją return.</w:t>
+      </w:r>
+    </w:p>
+    <w:p>
+      <w:pPr>
+        <w:spacing w:after="0" w:line="240" w:lineRule="auto"/>
+        <w:ind w:left="720"/>
         <w:rPr>
           <w:rFonts w:asciiTheme="majorHAnsi" w:hAnsiTheme="majorHAnsi"/>
           <w:b/>
           <w:bCs/>
           <w:szCs w:val="22"/>
         </w:rPr>
-        <w:t xml:space="preserve"> (błędne dane):</w:t>
-      </w:r>
-      <w:r>
-        <w:rPr>
-          <w:rFonts w:asciiTheme="majorHAnsi" w:hAnsiTheme="majorHAnsi"/>
-          <w:szCs w:val="22"/>
-        </w:rPr>
-        <w:t xml:space="preserve"> wypisuje komunikat o niepoprawnej wartości i kończy program instrukcją return.</w:t>
-      </w:r>
+      </w:pPr>
     </w:p>
     <w:p>
       <w:pPr>
@@ -2582,38 +2161,24 @@
     </w:p>
     <w:p>
       <w:pPr>
-        <w:spacing w:after="0" w:line="240" w:lineRule="auto"/>
-        <w:ind w:left="720"/>
+        <w:rPr>
+          <w:rFonts w:asciiTheme="majorHAnsi" w:hAnsiTheme="majorHAnsi"/>
+        </w:rPr>
+      </w:pPr>
+      <w:r>
+        <w:rPr>
+          <w:rFonts w:asciiTheme="majorHAnsi" w:hAnsiTheme="majorHAnsi"/>
+        </w:rPr>
+        <w:t xml:space="preserve">• </w:t>
+      </w:r>
+      <w:r>
         <w:rPr>
           <w:rFonts w:asciiTheme="majorHAnsi" w:hAnsiTheme="majorHAnsi"/>
           <w:b/>
           <w:bCs/>
-          <w:szCs w:val="22"/>
-        </w:rPr>
-      </w:pPr>
-    </w:p>
-    <w:p>
-      <w:pPr>
-        <w:rPr>
-          <w:rFonts w:asciiTheme="majorHAnsi" w:hAnsiTheme="majorHAnsi"/>
-        </w:rPr>
-      </w:pPr>
-      <w:r>
-        <w:rPr>
-          <w:rFonts w:asciiTheme="majorHAnsi" w:hAnsiTheme="majorHAnsi"/>
-        </w:rPr>
-        <w:t xml:space="preserve">• </w:t>
-      </w:r>
-      <w:r>
-        <w:rPr>
-          <w:rFonts w:asciiTheme="majorHAnsi" w:hAnsiTheme="majorHAnsi"/>
-          <w:b/>
-          <w:bCs/>
         </w:rPr>
         <w:t xml:space="preserve">Funkcja </w:t>
       </w:r>
-      <w:proofErr w:type="spellStart"/>
-      <w:proofErr w:type="gramStart"/>
       <w:r>
         <w:rPr>
           <w:rFonts w:asciiTheme="majorHAnsi" w:hAnsiTheme="majorHAnsi"/>
@@ -2621,33 +2186,13 @@
           <w:bCs/>
           <w:color w:val="BF4E14" w:themeColor="accent2" w:themeShade="BF"/>
         </w:rPr>
-        <w:t>LosujZestaw</w:t>
-      </w:r>
-      <w:proofErr w:type="spellEnd"/>
-      <w:r>
-        <w:rPr>
-          <w:rFonts w:asciiTheme="majorHAnsi" w:hAnsiTheme="majorHAnsi"/>
-          <w:b/>
-          <w:bCs/>
+        <w:t>LosujZestaw()</w:t>
+      </w:r>
+      <w:r>
+        <w:rPr>
+          <w:rFonts w:asciiTheme="majorHAnsi" w:hAnsiTheme="majorHAnsi"/>
           <w:color w:val="BF4E14" w:themeColor="accent2" w:themeShade="BF"/>
         </w:rPr>
-        <w:t>(</w:t>
-      </w:r>
-      <w:proofErr w:type="gramEnd"/>
-      <w:r>
-        <w:rPr>
-          <w:rFonts w:asciiTheme="majorHAnsi" w:hAnsiTheme="majorHAnsi"/>
-          <w:b/>
-          <w:bCs/>
-          <w:color w:val="BF4E14" w:themeColor="accent2" w:themeShade="BF"/>
-        </w:rPr>
-        <w:t>)</w:t>
-      </w:r>
-      <w:r>
-        <w:rPr>
-          <w:rFonts w:asciiTheme="majorHAnsi" w:hAnsiTheme="majorHAnsi"/>
-          <w:color w:val="BF4E14" w:themeColor="accent2" w:themeShade="BF"/>
-        </w:rPr>
         <w:t xml:space="preserve"> </w:t>
       </w:r>
       <w:r>
@@ -2661,32 +2206,7 @@
           <w:rFonts w:asciiTheme="majorHAnsi" w:hAnsiTheme="majorHAnsi"/>
           <w:lang w:eastAsia="pl-PL"/>
         </w:rPr>
-        <w:t xml:space="preserve">losuje jeden zestaw 6 różnych liczb z przedziału 1–49. Nie przyjmuje argumentów i zwraca tablicę </w:t>
-      </w:r>
-      <w:proofErr w:type="spellStart"/>
-      <w:proofErr w:type="gramStart"/>
-      <w:r>
-        <w:rPr>
-          <w:rFonts w:asciiTheme="majorHAnsi" w:hAnsiTheme="majorHAnsi"/>
-          <w:lang w:eastAsia="pl-PL"/>
-        </w:rPr>
-        <w:t>int</w:t>
-      </w:r>
-      <w:proofErr w:type="spellEnd"/>
-      <w:r>
-        <w:rPr>
-          <w:rFonts w:asciiTheme="majorHAnsi" w:hAnsiTheme="majorHAnsi"/>
-          <w:lang w:eastAsia="pl-PL"/>
-        </w:rPr>
-        <w:t>[</w:t>
-      </w:r>
-      <w:proofErr w:type="gramEnd"/>
-      <w:r>
-        <w:rPr>
-          <w:rFonts w:asciiTheme="majorHAnsi" w:hAnsiTheme="majorHAnsi"/>
-          <w:lang w:eastAsia="pl-PL"/>
-        </w:rPr>
-        <w:t>] z wylosowanymi liczbami.</w:t>
+        <w:t>losuje jeden zestaw 6 różnych liczb z przedziału 1–49. Nie przyjmuje argumentów i zwraca tablicę int[] z wylosowanymi liczbami.</w:t>
       </w:r>
     </w:p>
     <w:p>
@@ -2702,8 +2222,6 @@
           <w:lang w:eastAsia="pl-PL"/>
         </w:rPr>
       </w:pPr>
-      <w:proofErr w:type="spellStart"/>
-      <w:proofErr w:type="gramStart"/>
       <w:r>
         <w:rPr>
           <w:rFonts w:asciiTheme="majorHAnsi" w:hAnsiTheme="majorHAnsi"/>
@@ -2713,139 +2231,33 @@
           <w:szCs w:val="22"/>
           <w:lang w:eastAsia="pl-PL"/>
         </w:rPr>
-        <w:t>int</w:t>
-      </w:r>
-      <w:proofErr w:type="spellEnd"/>
-      <w:r>
-        <w:rPr>
-          <w:rFonts w:asciiTheme="majorHAnsi" w:hAnsiTheme="majorHAnsi"/>
-          <w:b/>
-          <w:bCs/>
+        <w:t>int[] zestaw = new int[LiczbWZestawie]</w:t>
+      </w:r>
+      <w:r>
+        <w:rPr>
+          <w:rFonts w:asciiTheme="majorHAnsi" w:hAnsiTheme="majorHAnsi"/>
           <w:color w:val="BF4E14" w:themeColor="accent2" w:themeShade="BF"/>
           <w:szCs w:val="22"/>
           <w:lang w:eastAsia="pl-PL"/>
         </w:rPr>
-        <w:t>[</w:t>
-      </w:r>
-      <w:proofErr w:type="gramEnd"/>
-      <w:r>
-        <w:rPr>
-          <w:rFonts w:asciiTheme="majorHAnsi" w:hAnsiTheme="majorHAnsi"/>
-          <w:b/>
-          <w:bCs/>
+        <w:t xml:space="preserve"> </w:t>
+      </w:r>
+      <w:r>
+        <w:rPr>
+          <w:rFonts w:asciiTheme="majorHAnsi" w:hAnsiTheme="majorHAnsi"/>
           <w:color w:val="BF4E14" w:themeColor="accent2" w:themeShade="BF"/>
           <w:szCs w:val="22"/>
           <w:lang w:eastAsia="pl-PL"/>
         </w:rPr>
-        <w:t xml:space="preserve">] zestaw = </w:t>
-      </w:r>
-      <w:proofErr w:type="spellStart"/>
-      <w:r>
-        <w:rPr>
-          <w:rFonts w:asciiTheme="majorHAnsi" w:hAnsiTheme="majorHAnsi"/>
-          <w:b/>
-          <w:bCs/>
-          <w:color w:val="BF4E14" w:themeColor="accent2" w:themeShade="BF"/>
+        <w:t xml:space="preserve"> </w:t>
+      </w:r>
+      <w:r>
+        <w:rPr>
+          <w:rFonts w:asciiTheme="majorHAnsi" w:hAnsiTheme="majorHAnsi"/>
           <w:szCs w:val="22"/>
           <w:lang w:eastAsia="pl-PL"/>
         </w:rPr>
-        <w:t>new</w:t>
-      </w:r>
-      <w:proofErr w:type="spellEnd"/>
-      <w:r>
-        <w:rPr>
-          <w:rFonts w:asciiTheme="majorHAnsi" w:hAnsiTheme="majorHAnsi"/>
-          <w:b/>
-          <w:bCs/>
-          <w:color w:val="BF4E14" w:themeColor="accent2" w:themeShade="BF"/>
-          <w:szCs w:val="22"/>
-          <w:lang w:eastAsia="pl-PL"/>
-        </w:rPr>
-        <w:t xml:space="preserve"> </w:t>
-      </w:r>
-      <w:proofErr w:type="spellStart"/>
-      <w:proofErr w:type="gramStart"/>
-      <w:r>
-        <w:rPr>
-          <w:rFonts w:asciiTheme="majorHAnsi" w:hAnsiTheme="majorHAnsi"/>
-          <w:b/>
-          <w:bCs/>
-          <w:color w:val="BF4E14" w:themeColor="accent2" w:themeShade="BF"/>
-          <w:szCs w:val="22"/>
-          <w:lang w:eastAsia="pl-PL"/>
-        </w:rPr>
-        <w:t>int</w:t>
-      </w:r>
-      <w:proofErr w:type="spellEnd"/>
-      <w:r>
-        <w:rPr>
-          <w:rFonts w:asciiTheme="majorHAnsi" w:hAnsiTheme="majorHAnsi"/>
-          <w:b/>
-          <w:bCs/>
-          <w:color w:val="BF4E14" w:themeColor="accent2" w:themeShade="BF"/>
-          <w:szCs w:val="22"/>
-          <w:lang w:eastAsia="pl-PL"/>
-        </w:rPr>
-        <w:t>[</w:t>
-      </w:r>
-      <w:proofErr w:type="spellStart"/>
-      <w:r>
-        <w:rPr>
-          <w:rFonts w:asciiTheme="majorHAnsi" w:hAnsiTheme="majorHAnsi"/>
-          <w:b/>
-          <w:bCs/>
-          <w:color w:val="BF4E14" w:themeColor="accent2" w:themeShade="BF"/>
-          <w:szCs w:val="22"/>
-          <w:lang w:eastAsia="pl-PL"/>
-        </w:rPr>
-        <w:t>LiczbWZestawie</w:t>
-      </w:r>
-      <w:proofErr w:type="spellEnd"/>
-      <w:r>
-        <w:rPr>
-          <w:rFonts w:asciiTheme="majorHAnsi" w:hAnsiTheme="majorHAnsi"/>
-          <w:b/>
-          <w:bCs/>
-          <w:color w:val="BF4E14" w:themeColor="accent2" w:themeShade="BF"/>
-          <w:szCs w:val="22"/>
-          <w:lang w:eastAsia="pl-PL"/>
-        </w:rPr>
-        <w:t>]</w:t>
-      </w:r>
-      <w:r>
-        <w:rPr>
-          <w:rFonts w:asciiTheme="majorHAnsi" w:hAnsiTheme="majorHAnsi"/>
-          <w:color w:val="BF4E14" w:themeColor="accent2" w:themeShade="BF"/>
-          <w:szCs w:val="22"/>
-          <w:lang w:eastAsia="pl-PL"/>
-        </w:rPr>
-        <w:t xml:space="preserve"> </w:t>
-      </w:r>
-      <w:r>
-        <w:rPr>
-          <w:rFonts w:asciiTheme="majorHAnsi" w:hAnsiTheme="majorHAnsi"/>
-          <w:color w:val="BF4E14" w:themeColor="accent2" w:themeShade="BF"/>
-          <w:szCs w:val="22"/>
-          <w:lang w:eastAsia="pl-PL"/>
-        </w:rPr>
-        <w:t xml:space="preserve"> </w:t>
-      </w:r>
-      <w:r>
-        <w:rPr>
-          <w:rFonts w:asciiTheme="majorHAnsi" w:hAnsiTheme="majorHAnsi"/>
-          <w:szCs w:val="22"/>
-          <w:lang w:eastAsia="pl-PL"/>
-        </w:rPr>
-        <w:t>-</w:t>
-      </w:r>
-      <w:proofErr w:type="gramEnd"/>
-      <w:r>
-        <w:rPr>
-          <w:rFonts w:asciiTheme="majorHAnsi" w:hAnsiTheme="majorHAnsi"/>
-          <w:szCs w:val="22"/>
-          <w:lang w:eastAsia="pl-PL"/>
-        </w:rPr>
-        <w:t xml:space="preserve"> t</w:t>
+        <w:t>- t</w:t>
       </w:r>
       <w:r>
         <w:rPr>
@@ -2869,7 +2281,6 @@
           <w:lang w:eastAsia="pl-PL"/>
         </w:rPr>
       </w:pPr>
-      <w:proofErr w:type="spellStart"/>
       <w:r>
         <w:rPr>
           <w:rFonts w:asciiTheme="majorHAnsi" w:hAnsiTheme="majorHAnsi"/>
@@ -2879,80 +2290,7 @@
           <w:szCs w:val="22"/>
           <w:lang w:eastAsia="pl-PL"/>
         </w:rPr>
-        <w:t>Random</w:t>
-      </w:r>
-      <w:proofErr w:type="spellEnd"/>
-      <w:r>
-        <w:rPr>
-          <w:rFonts w:asciiTheme="majorHAnsi" w:hAnsiTheme="majorHAnsi"/>
-          <w:b/>
-          <w:bCs/>
-          <w:color w:val="BF4E14" w:themeColor="accent2" w:themeShade="BF"/>
-          <w:szCs w:val="22"/>
-          <w:lang w:eastAsia="pl-PL"/>
-        </w:rPr>
-        <w:t xml:space="preserve"> generator = </w:t>
-      </w:r>
-      <w:proofErr w:type="spellStart"/>
-      <w:r>
-        <w:rPr>
-          <w:rFonts w:asciiTheme="majorHAnsi" w:hAnsiTheme="majorHAnsi"/>
-          <w:b/>
-          <w:bCs/>
-          <w:color w:val="BF4E14" w:themeColor="accent2" w:themeShade="BF"/>
-          <w:szCs w:val="22"/>
-          <w:lang w:eastAsia="pl-PL"/>
-        </w:rPr>
-        <w:t>new</w:t>
-      </w:r>
-      <w:proofErr w:type="spellEnd"/>
-      <w:r>
-        <w:rPr>
-          <w:rFonts w:asciiTheme="majorHAnsi" w:hAnsiTheme="majorHAnsi"/>
-          <w:b/>
-          <w:bCs/>
-          <w:color w:val="BF4E14" w:themeColor="accent2" w:themeShade="BF"/>
-          <w:szCs w:val="22"/>
-          <w:lang w:eastAsia="pl-PL"/>
-        </w:rPr>
-        <w:t xml:space="preserve"> </w:t>
-      </w:r>
-      <w:proofErr w:type="spellStart"/>
-      <w:proofErr w:type="gramStart"/>
-      <w:r>
-        <w:rPr>
-          <w:rFonts w:asciiTheme="majorHAnsi" w:hAnsiTheme="majorHAnsi"/>
-          <w:b/>
-          <w:bCs/>
-          <w:color w:val="BF4E14" w:themeColor="accent2" w:themeShade="BF"/>
-          <w:szCs w:val="22"/>
-          <w:lang w:eastAsia="pl-PL"/>
-        </w:rPr>
-        <w:t>Random</w:t>
-      </w:r>
-      <w:proofErr w:type="spellEnd"/>
-      <w:r>
-        <w:rPr>
-          <w:rFonts w:asciiTheme="majorHAnsi" w:hAnsiTheme="majorHAnsi"/>
-          <w:b/>
-          <w:bCs/>
-          <w:color w:val="BF4E14" w:themeColor="accent2" w:themeShade="BF"/>
-          <w:szCs w:val="22"/>
-          <w:lang w:eastAsia="pl-PL"/>
-        </w:rPr>
-        <w:t>(</w:t>
-      </w:r>
-      <w:proofErr w:type="gramEnd"/>
-      <w:r>
-        <w:rPr>
-          <w:rFonts w:asciiTheme="majorHAnsi" w:hAnsiTheme="majorHAnsi"/>
-          <w:b/>
-          <w:bCs/>
-          <w:color w:val="BF4E14" w:themeColor="accent2" w:themeShade="BF"/>
-          <w:szCs w:val="22"/>
-          <w:lang w:eastAsia="pl-PL"/>
-        </w:rPr>
-        <w:t>)</w:t>
+        <w:t>Random generator = new Random()</w:t>
       </w:r>
       <w:r>
         <w:rPr>
@@ -2992,7 +2330,6 @@
           <w:lang w:eastAsia="pl-PL"/>
         </w:rPr>
       </w:pPr>
-      <w:proofErr w:type="spellStart"/>
       <w:r>
         <w:rPr>
           <w:rFonts w:asciiTheme="majorHAnsi" w:hAnsiTheme="majorHAnsi"/>
@@ -3002,19 +2339,7 @@
           <w:szCs w:val="22"/>
           <w:lang w:eastAsia="pl-PL"/>
         </w:rPr>
-        <w:t>int</w:t>
-      </w:r>
-      <w:proofErr w:type="spellEnd"/>
-      <w:r>
-        <w:rPr>
-          <w:rFonts w:asciiTheme="majorHAnsi" w:hAnsiTheme="majorHAnsi"/>
-          <w:b/>
-          <w:bCs/>
-          <w:color w:val="BF4E14" w:themeColor="accent2" w:themeShade="BF"/>
-          <w:szCs w:val="22"/>
-          <w:lang w:eastAsia="pl-PL"/>
-        </w:rPr>
-        <w:t xml:space="preserve"> i = 0</w:t>
+        <w:t>int i = 0</w:t>
       </w:r>
       <w:r>
         <w:rPr>
@@ -3055,7 +2380,6 @@
         </w:rPr>
         <w:t xml:space="preserve">Pętla </w:t>
       </w:r>
-      <w:proofErr w:type="spellStart"/>
       <w:r>
         <w:rPr>
           <w:rFonts w:asciiTheme="majorHAnsi" w:hAnsiTheme="majorHAnsi"/>
@@ -3065,43 +2389,7 @@
           <w:szCs w:val="22"/>
           <w:lang w:eastAsia="pl-PL"/>
         </w:rPr>
-        <w:t>while</w:t>
-      </w:r>
-      <w:proofErr w:type="spellEnd"/>
-      <w:r>
-        <w:rPr>
-          <w:rFonts w:asciiTheme="majorHAnsi" w:hAnsiTheme="majorHAnsi"/>
-          <w:b/>
-          <w:bCs/>
-          <w:color w:val="BF4E14" w:themeColor="accent2" w:themeShade="BF"/>
-          <w:szCs w:val="22"/>
-          <w:lang w:eastAsia="pl-PL"/>
-        </w:rPr>
-        <w:t xml:space="preserve"> (i &lt; </w:t>
-      </w:r>
-      <w:proofErr w:type="spellStart"/>
-      <w:r>
-        <w:rPr>
-          <w:rFonts w:asciiTheme="majorHAnsi" w:hAnsiTheme="majorHAnsi"/>
-          <w:b/>
-          <w:bCs/>
-          <w:color w:val="BF4E14" w:themeColor="accent2" w:themeShade="BF"/>
-          <w:szCs w:val="22"/>
-          <w:lang w:eastAsia="pl-PL"/>
-        </w:rPr>
-        <w:t>LiczbWZestawie</w:t>
-      </w:r>
-      <w:proofErr w:type="spellEnd"/>
-      <w:r>
-        <w:rPr>
-          <w:rFonts w:asciiTheme="majorHAnsi" w:hAnsiTheme="majorHAnsi"/>
-          <w:b/>
-          <w:bCs/>
-          <w:color w:val="BF4E14" w:themeColor="accent2" w:themeShade="BF"/>
-          <w:szCs w:val="22"/>
-          <w:lang w:eastAsia="pl-PL"/>
-        </w:rPr>
-        <w:t>)</w:t>
+        <w:t>while (i &lt; LiczbWZestawie)</w:t>
       </w:r>
       <w:r>
         <w:rPr>
@@ -3134,8 +2422,6 @@
           <w:lang w:eastAsia="pl-PL"/>
         </w:rPr>
       </w:pPr>
-      <w:proofErr w:type="spellStart"/>
-      <w:proofErr w:type="gramStart"/>
       <w:r>
         <w:rPr>
           <w:rFonts w:asciiTheme="majorHAnsi" w:hAnsiTheme="majorHAnsi"/>
@@ -3145,111 +2431,32 @@
           <w:szCs w:val="22"/>
           <w:lang w:eastAsia="pl-PL"/>
         </w:rPr>
-        <w:t>generator.Next</w:t>
-      </w:r>
-      <w:proofErr w:type="spellEnd"/>
-      <w:proofErr w:type="gramEnd"/>
-      <w:r>
-        <w:rPr>
-          <w:rFonts w:asciiTheme="majorHAnsi" w:hAnsiTheme="majorHAnsi"/>
-          <w:b/>
-          <w:bCs/>
+        <w:t>generator.Next(MinLiczba, MaxLiczba + 1)</w:t>
+      </w:r>
+      <w:r>
+        <w:rPr>
+          <w:rFonts w:asciiTheme="majorHAnsi" w:hAnsiTheme="majorHAnsi"/>
           <w:color w:val="BF4E14" w:themeColor="accent2" w:themeShade="BF"/>
           <w:szCs w:val="22"/>
           <w:lang w:eastAsia="pl-PL"/>
         </w:rPr>
-        <w:t>(</w:t>
-      </w:r>
-      <w:proofErr w:type="spellStart"/>
-      <w:r>
-        <w:rPr>
-          <w:rFonts w:asciiTheme="majorHAnsi" w:hAnsiTheme="majorHAnsi"/>
-          <w:b/>
-          <w:bCs/>
-          <w:color w:val="BF4E14" w:themeColor="accent2" w:themeShade="BF"/>
+        <w:t xml:space="preserve"> </w:t>
+      </w:r>
+      <w:r>
+        <w:rPr>
+          <w:rFonts w:asciiTheme="majorHAnsi" w:hAnsiTheme="majorHAnsi"/>
           <w:szCs w:val="22"/>
           <w:lang w:eastAsia="pl-PL"/>
         </w:rPr>
-        <w:t>MinLiczba</w:t>
-      </w:r>
-      <w:proofErr w:type="spellEnd"/>
-      <w:r>
-        <w:rPr>
-          <w:rFonts w:asciiTheme="majorHAnsi" w:hAnsiTheme="majorHAnsi"/>
-          <w:b/>
-          <w:bCs/>
-          <w:color w:val="BF4E14" w:themeColor="accent2" w:themeShade="BF"/>
+        <w:t xml:space="preserve">losuje liczbę całkowitą. </w:t>
+      </w:r>
+      <w:r>
+        <w:rPr>
+          <w:rFonts w:asciiTheme="majorHAnsi" w:hAnsiTheme="majorHAnsi"/>
           <w:szCs w:val="22"/>
           <w:lang w:eastAsia="pl-PL"/>
         </w:rPr>
-        <w:t xml:space="preserve">, </w:t>
-      </w:r>
-      <w:proofErr w:type="spellStart"/>
-      <w:r>
-        <w:rPr>
-          <w:rFonts w:asciiTheme="majorHAnsi" w:hAnsiTheme="majorHAnsi"/>
-          <w:b/>
-          <w:bCs/>
-          <w:color w:val="BF4E14" w:themeColor="accent2" w:themeShade="BF"/>
-          <w:szCs w:val="22"/>
-          <w:lang w:eastAsia="pl-PL"/>
-        </w:rPr>
-        <w:t>MaxLiczba</w:t>
-      </w:r>
-      <w:proofErr w:type="spellEnd"/>
-      <w:r>
-        <w:rPr>
-          <w:rFonts w:asciiTheme="majorHAnsi" w:hAnsiTheme="majorHAnsi"/>
-          <w:b/>
-          <w:bCs/>
-          <w:color w:val="BF4E14" w:themeColor="accent2" w:themeShade="BF"/>
-          <w:szCs w:val="22"/>
-          <w:lang w:eastAsia="pl-PL"/>
-        </w:rPr>
-        <w:t xml:space="preserve"> + 1)</w:t>
-      </w:r>
-      <w:r>
-        <w:rPr>
-          <w:rFonts w:asciiTheme="majorHAnsi" w:hAnsiTheme="majorHAnsi"/>
-          <w:color w:val="BF4E14" w:themeColor="accent2" w:themeShade="BF"/>
-          <w:szCs w:val="22"/>
-          <w:lang w:eastAsia="pl-PL"/>
-        </w:rPr>
-        <w:t xml:space="preserve"> </w:t>
-      </w:r>
-      <w:r>
-        <w:rPr>
-          <w:rFonts w:asciiTheme="majorHAnsi" w:hAnsiTheme="majorHAnsi"/>
-          <w:szCs w:val="22"/>
-          <w:lang w:eastAsia="pl-PL"/>
-        </w:rPr>
-        <w:t xml:space="preserve">losuje liczbę całkowitą. </w:t>
-      </w:r>
-      <w:r>
-        <w:rPr>
-          <w:rFonts w:asciiTheme="majorHAnsi" w:hAnsiTheme="majorHAnsi"/>
-          <w:szCs w:val="22"/>
-          <w:lang w:eastAsia="pl-PL"/>
-        </w:rPr>
-        <w:t xml:space="preserve">Górna granica w </w:t>
-      </w:r>
-      <w:proofErr w:type="spellStart"/>
-      <w:r>
-        <w:rPr>
-          <w:rFonts w:asciiTheme="majorHAnsi" w:hAnsiTheme="majorHAnsi"/>
-          <w:szCs w:val="22"/>
-          <w:lang w:eastAsia="pl-PL"/>
-        </w:rPr>
-        <w:t>Next</w:t>
-      </w:r>
-      <w:proofErr w:type="spellEnd"/>
-      <w:r>
-        <w:rPr>
-          <w:rFonts w:asciiTheme="majorHAnsi" w:hAnsiTheme="majorHAnsi"/>
-          <w:szCs w:val="22"/>
-          <w:lang w:eastAsia="pl-PL"/>
-        </w:rPr>
-        <w:t xml:space="preserve"> wynosi o 1 mniej niż dana liczba, dlatego </w:t>
+        <w:t xml:space="preserve">Górna granica w Next wynosi o 1 mniej niż dana liczba, dlatego </w:t>
       </w:r>
       <w:r>
         <w:rPr>
@@ -3273,8 +2480,6 @@
           <w:lang w:eastAsia="pl-PL"/>
         </w:rPr>
       </w:pPr>
-      <w:proofErr w:type="spellStart"/>
-      <w:proofErr w:type="gramStart"/>
       <w:r>
         <w:rPr>
           <w:rFonts w:asciiTheme="majorHAnsi" w:hAnsiTheme="majorHAnsi"/>
@@ -3284,10 +2489,43 @@
           <w:szCs w:val="22"/>
           <w:lang w:eastAsia="pl-PL"/>
         </w:rPr>
-        <w:t>zestaw.Contains</w:t>
-      </w:r>
-      <w:proofErr w:type="spellEnd"/>
-      <w:proofErr w:type="gramEnd"/>
+        <w:t>zestaw.Contains(wylosowana)</w:t>
+      </w:r>
+      <w:r>
+        <w:rPr>
+          <w:rFonts w:asciiTheme="majorHAnsi" w:hAnsiTheme="majorHAnsi"/>
+          <w:color w:val="BF4E14" w:themeColor="accent2" w:themeShade="BF"/>
+          <w:szCs w:val="22"/>
+          <w:lang w:eastAsia="pl-PL"/>
+        </w:rPr>
+        <w:t xml:space="preserve"> </w:t>
+      </w:r>
+      <w:r>
+        <w:rPr>
+          <w:rFonts w:asciiTheme="majorHAnsi" w:hAnsiTheme="majorHAnsi"/>
+          <w:szCs w:val="22"/>
+          <w:lang w:eastAsia="pl-PL"/>
+        </w:rPr>
+        <w:t xml:space="preserve">sprawdza, czy taka liczba już jest w zestawie: </w:t>
+      </w:r>
+    </w:p>
+    <w:p>
+      <w:pPr>
+        <w:ind w:left="1068"/>
+        <w:rPr>
+          <w:rFonts w:asciiTheme="majorHAnsi" w:hAnsiTheme="majorHAnsi"/>
+          <w:szCs w:val="22"/>
+          <w:lang w:eastAsia="pl-PL"/>
+        </w:rPr>
+      </w:pPr>
+      <w:r>
+        <w:rPr>
+          <w:rFonts w:asciiTheme="majorHAnsi" w:hAnsiTheme="majorHAnsi"/>
+          <w:szCs w:val="22"/>
+          <w:lang w:eastAsia="pl-PL"/>
+        </w:rPr>
+        <w:t xml:space="preserve">jeśli tak, </w:t>
+      </w:r>
       <w:r>
         <w:rPr>
           <w:rFonts w:asciiTheme="majorHAnsi" w:hAnsiTheme="majorHAnsi"/>
@@ -3297,99 +2535,33 @@
           <w:szCs w:val="22"/>
           <w:lang w:eastAsia="pl-PL"/>
         </w:rPr>
-        <w:t>(wylosowana)</w:t>
-      </w:r>
-      <w:r>
-        <w:rPr>
-          <w:rFonts w:asciiTheme="majorHAnsi" w:hAnsiTheme="majorHAnsi"/>
-          <w:color w:val="BF4E14" w:themeColor="accent2" w:themeShade="BF"/>
+        <w:t>continue</w:t>
+      </w:r>
+      <w:r>
+        <w:rPr>
+          <w:rFonts w:asciiTheme="majorHAnsi" w:hAnsiTheme="majorHAnsi"/>
           <w:szCs w:val="22"/>
           <w:lang w:eastAsia="pl-PL"/>
         </w:rPr>
-        <w:t xml:space="preserve"> </w:t>
-      </w:r>
-      <w:r>
+        <w:t xml:space="preserve"> przerywa obieg pętli i losowanie zaczyna się od nowa, a licznik i się nie zwiększa,</w:t>
+      </w:r>
+    </w:p>
+    <w:p>
+      <w:pPr>
+        <w:ind w:left="360" w:firstLine="708"/>
         <w:rPr>
           <w:rFonts w:asciiTheme="majorHAnsi" w:hAnsiTheme="majorHAnsi"/>
           <w:szCs w:val="22"/>
           <w:lang w:eastAsia="pl-PL"/>
         </w:rPr>
-        <w:t xml:space="preserve">sprawdza, czy taka liczba już jest w zestawie: </w:t>
-      </w:r>
-    </w:p>
-    <w:p>
-      <w:pPr>
-        <w:ind w:left="1068"/>
+      </w:pPr>
+      <w:r>
         <w:rPr>
           <w:rFonts w:asciiTheme="majorHAnsi" w:hAnsiTheme="majorHAnsi"/>
           <w:szCs w:val="22"/>
           <w:lang w:eastAsia="pl-PL"/>
         </w:rPr>
-      </w:pPr>
-      <w:r>
-        <w:rPr>
-          <w:rFonts w:asciiTheme="majorHAnsi" w:hAnsiTheme="majorHAnsi"/>
-          <w:szCs w:val="22"/>
-          <w:lang w:eastAsia="pl-PL"/>
-        </w:rPr>
-        <w:t xml:space="preserve">jeśli tak, </w:t>
-      </w:r>
-      <w:proofErr w:type="spellStart"/>
-      <w:r>
-        <w:rPr>
-          <w:rFonts w:asciiTheme="majorHAnsi" w:hAnsiTheme="majorHAnsi"/>
-          <w:b/>
-          <w:bCs/>
-          <w:color w:val="BF4E14" w:themeColor="accent2" w:themeShade="BF"/>
-          <w:szCs w:val="22"/>
-          <w:lang w:eastAsia="pl-PL"/>
-        </w:rPr>
-        <w:t>continue</w:t>
-      </w:r>
-      <w:proofErr w:type="spellEnd"/>
-      <w:r>
-        <w:rPr>
-          <w:rFonts w:asciiTheme="majorHAnsi" w:hAnsiTheme="majorHAnsi"/>
-          <w:szCs w:val="22"/>
-          <w:lang w:eastAsia="pl-PL"/>
-        </w:rPr>
-        <w:t xml:space="preserve"> przerywa obieg pętli i losowanie zaczyna się od nowa, a licznik i się nie zwiększa,</w:t>
-      </w:r>
-    </w:p>
-    <w:p>
-      <w:pPr>
-        <w:ind w:left="360" w:firstLine="708"/>
-        <w:rPr>
-          <w:rFonts w:asciiTheme="majorHAnsi" w:hAnsiTheme="majorHAnsi"/>
-          <w:szCs w:val="22"/>
-          <w:lang w:eastAsia="pl-PL"/>
-        </w:rPr>
-      </w:pPr>
-      <w:r>
-        <w:rPr>
-          <w:rFonts w:asciiTheme="majorHAnsi" w:hAnsiTheme="majorHAnsi"/>
-          <w:szCs w:val="22"/>
-          <w:lang w:eastAsia="pl-PL"/>
-        </w:rPr>
-        <w:t xml:space="preserve">jeśli nie, liczba zostaje zapisana pod indeksem </w:t>
-      </w:r>
-      <w:proofErr w:type="gramStart"/>
-      <w:r>
-        <w:rPr>
-          <w:rFonts w:asciiTheme="majorHAnsi" w:hAnsiTheme="majorHAnsi"/>
-          <w:szCs w:val="22"/>
-          <w:lang w:eastAsia="pl-PL"/>
-        </w:rPr>
-        <w:t>i,</w:t>
-      </w:r>
-      <w:proofErr w:type="gramEnd"/>
-      <w:r>
-        <w:rPr>
-          <w:rFonts w:asciiTheme="majorHAnsi" w:hAnsiTheme="majorHAnsi"/>
-          <w:szCs w:val="22"/>
-          <w:lang w:eastAsia="pl-PL"/>
-        </w:rPr>
-        <w:t xml:space="preserve"> a następnie i++ przesuwa licznik.</w:t>
+        <w:t>jeśli nie, liczba zostaje zapisana pod indeksem i, a następnie i++ przesuwa licznik.</w:t>
       </w:r>
     </w:p>
     <w:p>
@@ -3465,8 +2637,6 @@
         </w:rPr>
         <w:t xml:space="preserve">Funkcja </w:t>
       </w:r>
-      <w:proofErr w:type="spellStart"/>
-      <w:proofErr w:type="gramStart"/>
       <w:r>
         <w:rPr>
           <w:rFonts w:asciiTheme="majorHAnsi" w:hAnsiTheme="majorHAnsi"/>
@@ -3474,27 +2644,7 @@
           <w:bCs/>
           <w:color w:val="BF4E14" w:themeColor="accent2" w:themeShade="BF"/>
         </w:rPr>
-        <w:t>WyswietlLosowania</w:t>
-      </w:r>
-      <w:proofErr w:type="spellEnd"/>
-      <w:r>
-        <w:rPr>
-          <w:rFonts w:asciiTheme="majorHAnsi" w:hAnsiTheme="majorHAnsi"/>
-          <w:b/>
-          <w:bCs/>
-          <w:color w:val="BF4E14" w:themeColor="accent2" w:themeShade="BF"/>
-        </w:rPr>
-        <w:t>(</w:t>
-      </w:r>
-      <w:proofErr w:type="gramEnd"/>
-      <w:r>
-        <w:rPr>
-          <w:rFonts w:asciiTheme="majorHAnsi" w:hAnsiTheme="majorHAnsi"/>
-          <w:b/>
-          <w:bCs/>
-          <w:color w:val="BF4E14" w:themeColor="accent2" w:themeShade="BF"/>
-        </w:rPr>
-        <w:t>)</w:t>
+        <w:t>WyswietlLosowania()</w:t>
       </w:r>
       <w:r>
         <w:rPr>
@@ -3535,8 +2685,6 @@
           <w:szCs w:val="22"/>
         </w:rPr>
       </w:pPr>
-      <w:proofErr w:type="spellStart"/>
-      <w:proofErr w:type="gramStart"/>
       <w:r>
         <w:rPr>
           <w:rFonts w:asciiTheme="majorHAnsi" w:hAnsiTheme="majorHAnsi"/>
@@ -3545,119 +2693,7 @@
           <w:color w:val="BF4E14" w:themeColor="accent2" w:themeShade="BF"/>
           <w:szCs w:val="22"/>
         </w:rPr>
-        <w:t>int</w:t>
-      </w:r>
-      <w:proofErr w:type="spellEnd"/>
-      <w:r>
-        <w:rPr>
-          <w:rFonts w:asciiTheme="majorHAnsi" w:hAnsiTheme="majorHAnsi"/>
-          <w:b/>
-          <w:bCs/>
-          <w:color w:val="BF4E14" w:themeColor="accent2" w:themeShade="BF"/>
-          <w:szCs w:val="22"/>
-        </w:rPr>
-        <w:t>[</w:t>
-      </w:r>
-      <w:proofErr w:type="gramEnd"/>
-      <w:r>
-        <w:rPr>
-          <w:rFonts w:asciiTheme="majorHAnsi" w:hAnsiTheme="majorHAnsi"/>
-          <w:b/>
-          <w:bCs/>
-          <w:color w:val="BF4E14" w:themeColor="accent2" w:themeShade="BF"/>
-          <w:szCs w:val="22"/>
-        </w:rPr>
-        <w:t xml:space="preserve">] </w:t>
-      </w:r>
-      <w:proofErr w:type="spellStart"/>
-      <w:r>
-        <w:rPr>
-          <w:rFonts w:asciiTheme="majorHAnsi" w:hAnsiTheme="majorHAnsi"/>
-          <w:b/>
-          <w:bCs/>
-          <w:color w:val="BF4E14" w:themeColor="accent2" w:themeShade="BF"/>
-          <w:szCs w:val="22"/>
-        </w:rPr>
-        <w:t>wystapienia</w:t>
-      </w:r>
-      <w:proofErr w:type="spellEnd"/>
-      <w:r>
-        <w:rPr>
-          <w:rFonts w:asciiTheme="majorHAnsi" w:hAnsiTheme="majorHAnsi"/>
-          <w:b/>
-          <w:bCs/>
-          <w:color w:val="BF4E14" w:themeColor="accent2" w:themeShade="BF"/>
-          <w:szCs w:val="22"/>
-        </w:rPr>
-        <w:t xml:space="preserve"> = </w:t>
-      </w:r>
-      <w:proofErr w:type="spellStart"/>
-      <w:r>
-        <w:rPr>
-          <w:rFonts w:asciiTheme="majorHAnsi" w:hAnsiTheme="majorHAnsi"/>
-          <w:b/>
-          <w:bCs/>
-          <w:color w:val="BF4E14" w:themeColor="accent2" w:themeShade="BF"/>
-          <w:szCs w:val="22"/>
-        </w:rPr>
-        <w:t>new</w:t>
-      </w:r>
-      <w:proofErr w:type="spellEnd"/>
-      <w:r>
-        <w:rPr>
-          <w:rFonts w:asciiTheme="majorHAnsi" w:hAnsiTheme="majorHAnsi"/>
-          <w:b/>
-          <w:bCs/>
-          <w:color w:val="BF4E14" w:themeColor="accent2" w:themeShade="BF"/>
-          <w:szCs w:val="22"/>
-        </w:rPr>
-        <w:t xml:space="preserve"> </w:t>
-      </w:r>
-      <w:proofErr w:type="spellStart"/>
-      <w:proofErr w:type="gramStart"/>
-      <w:r>
-        <w:rPr>
-          <w:rFonts w:asciiTheme="majorHAnsi" w:hAnsiTheme="majorHAnsi"/>
-          <w:b/>
-          <w:bCs/>
-          <w:color w:val="BF4E14" w:themeColor="accent2" w:themeShade="BF"/>
-          <w:szCs w:val="22"/>
-        </w:rPr>
-        <w:t>int</w:t>
-      </w:r>
-      <w:proofErr w:type="spellEnd"/>
-      <w:r>
-        <w:rPr>
-          <w:rFonts w:asciiTheme="majorHAnsi" w:hAnsiTheme="majorHAnsi"/>
-          <w:b/>
-          <w:bCs/>
-          <w:color w:val="BF4E14" w:themeColor="accent2" w:themeShade="BF"/>
-          <w:szCs w:val="22"/>
-        </w:rPr>
-        <w:t>[</w:t>
-      </w:r>
-      <w:proofErr w:type="spellStart"/>
-      <w:proofErr w:type="gramEnd"/>
-      <w:r>
-        <w:rPr>
-          <w:rFonts w:asciiTheme="majorHAnsi" w:hAnsiTheme="majorHAnsi"/>
-          <w:b/>
-          <w:bCs/>
-          <w:color w:val="BF4E14" w:themeColor="accent2" w:themeShade="BF"/>
-          <w:szCs w:val="22"/>
-        </w:rPr>
-        <w:t>MaxLiczba</w:t>
-      </w:r>
-      <w:proofErr w:type="spellEnd"/>
-      <w:r>
-        <w:rPr>
-          <w:rFonts w:asciiTheme="majorHAnsi" w:hAnsiTheme="majorHAnsi"/>
-          <w:b/>
-          <w:bCs/>
-          <w:color w:val="BF4E14" w:themeColor="accent2" w:themeShade="BF"/>
-          <w:szCs w:val="22"/>
-        </w:rPr>
-        <w:t xml:space="preserve">] </w:t>
+        <w:t xml:space="preserve">int[] wystapienia = new int[MaxLiczba] </w:t>
       </w:r>
       <w:r>
         <w:rPr>
@@ -3726,7 +2762,6 @@
           <w:szCs w:val="22"/>
         </w:rPr>
       </w:pPr>
-      <w:proofErr w:type="spellStart"/>
       <w:r>
         <w:rPr>
           <w:rFonts w:asciiTheme="majorHAnsi" w:hAnsiTheme="majorHAnsi"/>
@@ -3735,18 +2770,7 @@
           <w:color w:val="BF4E14" w:themeColor="accent2" w:themeShade="BF"/>
           <w:szCs w:val="22"/>
         </w:rPr>
-        <w:t>Console.Write</w:t>
-      </w:r>
-      <w:proofErr w:type="spellEnd"/>
-      <w:r>
-        <w:rPr>
-          <w:rFonts w:asciiTheme="majorHAnsi" w:hAnsiTheme="majorHAnsi"/>
-          <w:b/>
-          <w:bCs/>
-          <w:color w:val="BF4E14" w:themeColor="accent2" w:themeShade="BF"/>
-          <w:szCs w:val="22"/>
-        </w:rPr>
-        <w:t>($"Losowanie {i + 1}: ")</w:t>
+        <w:t>Console.Write($"Losowanie {i + 1}: ")</w:t>
       </w:r>
       <w:r>
         <w:rPr>
@@ -3791,8 +2815,6 @@
           <w:szCs w:val="22"/>
         </w:rPr>
       </w:pPr>
-      <w:proofErr w:type="spellStart"/>
-      <w:proofErr w:type="gramStart"/>
       <w:r>
         <w:rPr>
           <w:rFonts w:asciiTheme="majorHAnsi" w:hAnsiTheme="majorHAnsi"/>
@@ -3801,51 +2823,7 @@
           <w:color w:val="BF4E14" w:themeColor="accent2" w:themeShade="BF"/>
           <w:szCs w:val="22"/>
         </w:rPr>
-        <w:t>wystapienia</w:t>
-      </w:r>
-      <w:proofErr w:type="spellEnd"/>
-      <w:r>
-        <w:rPr>
-          <w:rFonts w:asciiTheme="majorHAnsi" w:hAnsiTheme="majorHAnsi"/>
-          <w:b/>
-          <w:bCs/>
-          <w:color w:val="BF4E14" w:themeColor="accent2" w:themeShade="BF"/>
-          <w:szCs w:val="22"/>
-        </w:rPr>
-        <w:t>[losowania[i,</w:t>
-      </w:r>
-      <w:proofErr w:type="gramEnd"/>
-      <w:r>
-        <w:rPr>
-          <w:rFonts w:asciiTheme="majorHAnsi" w:hAnsiTheme="majorHAnsi"/>
-          <w:b/>
-          <w:bCs/>
-          <w:color w:val="BF4E14" w:themeColor="accent2" w:themeShade="BF"/>
-          <w:szCs w:val="22"/>
-        </w:rPr>
-        <w:t xml:space="preserve"> j] - </w:t>
-      </w:r>
-      <w:proofErr w:type="gramStart"/>
-      <w:r>
-        <w:rPr>
-          <w:rFonts w:asciiTheme="majorHAnsi" w:hAnsiTheme="majorHAnsi"/>
-          <w:b/>
-          <w:bCs/>
-          <w:color w:val="BF4E14" w:themeColor="accent2" w:themeShade="BF"/>
-          <w:szCs w:val="22"/>
-        </w:rPr>
-        <w:t>1]+</w:t>
-      </w:r>
-      <w:proofErr w:type="gramEnd"/>
-      <w:r>
-        <w:rPr>
-          <w:rFonts w:asciiTheme="majorHAnsi" w:hAnsiTheme="majorHAnsi"/>
-          <w:b/>
-          <w:bCs/>
-          <w:color w:val="BF4E14" w:themeColor="accent2" w:themeShade="BF"/>
-          <w:szCs w:val="22"/>
-        </w:rPr>
-        <w:t xml:space="preserve">+ </w:t>
+        <w:t xml:space="preserve">wystapienia[losowania[i, j] - 1]++ </w:t>
       </w:r>
       <w:r>
         <w:rPr>
@@ -3884,7 +2862,6 @@
           <w:szCs w:val="22"/>
         </w:rPr>
       </w:pPr>
-      <w:proofErr w:type="spellStart"/>
       <w:r>
         <w:rPr>
           <w:rFonts w:asciiTheme="majorHAnsi" w:hAnsiTheme="majorHAnsi"/>
@@ -3893,40 +2870,7 @@
           <w:color w:val="BF4E14" w:themeColor="accent2" w:themeShade="BF"/>
           <w:szCs w:val="22"/>
         </w:rPr>
-        <w:t>Console.Write</w:t>
-      </w:r>
-      <w:proofErr w:type="spellEnd"/>
-      <w:r>
-        <w:rPr>
-          <w:rFonts w:asciiTheme="majorHAnsi" w:hAnsiTheme="majorHAnsi"/>
-          <w:b/>
-          <w:bCs/>
-          <w:color w:val="BF4E14" w:themeColor="accent2" w:themeShade="BF"/>
-          <w:szCs w:val="22"/>
-        </w:rPr>
-        <w:t>(</w:t>
-      </w:r>
-      <w:proofErr w:type="gramStart"/>
-      <w:r>
-        <w:rPr>
-          <w:rFonts w:asciiTheme="majorHAnsi" w:hAnsiTheme="majorHAnsi"/>
-          <w:b/>
-          <w:bCs/>
-          <w:color w:val="BF4E14" w:themeColor="accent2" w:themeShade="BF"/>
-          <w:szCs w:val="22"/>
-        </w:rPr>
-        <w:t>losowania[i,</w:t>
-      </w:r>
-      <w:proofErr w:type="gramEnd"/>
-      <w:r>
-        <w:rPr>
-          <w:rFonts w:asciiTheme="majorHAnsi" w:hAnsiTheme="majorHAnsi"/>
-          <w:b/>
-          <w:bCs/>
-          <w:color w:val="BF4E14" w:themeColor="accent2" w:themeShade="BF"/>
-          <w:szCs w:val="22"/>
-        </w:rPr>
-        <w:t xml:space="preserve"> j] + " ")</w:t>
+        <w:t>Console.Write(losowania[i, j] + " ")</w:t>
       </w:r>
       <w:r>
         <w:rPr>
@@ -3971,7 +2915,6 @@
           <w:szCs w:val="22"/>
         </w:rPr>
       </w:pPr>
-      <w:proofErr w:type="spellStart"/>
       <w:r>
         <w:rPr>
           <w:rFonts w:asciiTheme="majorHAnsi" w:hAnsiTheme="majorHAnsi"/>
@@ -3980,18 +2923,7 @@
           <w:color w:val="BF4E14" w:themeColor="accent2" w:themeShade="BF"/>
           <w:szCs w:val="22"/>
         </w:rPr>
-        <w:t>Console.WriteLine</w:t>
-      </w:r>
-      <w:proofErr w:type="spellEnd"/>
-      <w:r>
-        <w:rPr>
-          <w:rFonts w:asciiTheme="majorHAnsi" w:hAnsiTheme="majorHAnsi"/>
-          <w:b/>
-          <w:bCs/>
-          <w:color w:val="BF4E14" w:themeColor="accent2" w:themeShade="BF"/>
-          <w:szCs w:val="22"/>
-        </w:rPr>
-        <w:t>("")</w:t>
+        <w:t>Console.WriteLine("")</w:t>
       </w:r>
       <w:r>
         <w:rPr>
@@ -4594,11 +3526,9 @@
             <w:pPr>
               <w:cnfStyle w:val="000000100000" w:firstRow="0" w:lastRow="0" w:firstColumn="0" w:lastColumn="0" w:oddVBand="0" w:evenVBand="0" w:oddHBand="1" w:evenHBand="0" w:firstRowFirstColumn="0" w:firstRowLastColumn="0" w:lastRowFirstColumn="0" w:lastRowLastColumn="0"/>
             </w:pPr>
-            <w:proofErr w:type="spellStart"/>
             <w:r>
               <w:t>LosujZestaw_ZwracaSzescLiczb</w:t>
             </w:r>
-            <w:proofErr w:type="spellEnd"/>
           </w:p>
         </w:tc>
         <w:tc>
@@ -4611,38 +3541,7 @@
               <w:cnfStyle w:val="000000100000" w:firstRow="0" w:lastRow="0" w:firstColumn="0" w:lastColumn="0" w:oddVBand="0" w:evenVBand="0" w:oddHBand="1" w:evenHBand="0" w:firstRowFirstColumn="0" w:firstRowLastColumn="0" w:lastRowFirstColumn="0" w:lastRowLastColumn="0"/>
             </w:pPr>
             <w:r>
-              <w:t xml:space="preserve">Wywołuje </w:t>
-            </w:r>
-            <w:proofErr w:type="spellStart"/>
-            <w:proofErr w:type="gramStart"/>
-            <w:r>
-              <w:t>LosujZestaw</w:t>
-            </w:r>
-            <w:proofErr w:type="spellEnd"/>
-            <w:r>
-              <w:t>(</w:t>
-            </w:r>
-            <w:proofErr w:type="gramEnd"/>
-            <w:r>
-              <w:t xml:space="preserve">) i sprawdza </w:t>
-            </w:r>
-            <w:proofErr w:type="spellStart"/>
-            <w:r>
-              <w:t>Assert.Equal</w:t>
-            </w:r>
-            <w:proofErr w:type="spellEnd"/>
-            <w:r>
-              <w:t xml:space="preserve">(6, </w:t>
-            </w:r>
-            <w:proofErr w:type="spellStart"/>
-            <w:proofErr w:type="gramStart"/>
-            <w:r>
-              <w:t>zestaw.Length</w:t>
-            </w:r>
-            <w:proofErr w:type="spellEnd"/>
-            <w:proofErr w:type="gramEnd"/>
-            <w:r>
-              <w:t>).</w:t>
+              <w:t>Wywołuje LosujZestaw() i sprawdza Assert.Equal(6, zestaw.Length).</w:t>
             </w:r>
           </w:p>
         </w:tc>
@@ -4710,11 +3609,9 @@
             <w:pPr>
               <w:cnfStyle w:val="000000000000" w:firstRow="0" w:lastRow="0" w:firstColumn="0" w:lastColumn="0" w:oddVBand="0" w:evenVBand="0" w:oddHBand="0" w:evenHBand="0" w:firstRowFirstColumn="0" w:firstRowLastColumn="0" w:lastRowFirstColumn="0" w:lastRowLastColumn="0"/>
             </w:pPr>
-            <w:proofErr w:type="spellStart"/>
             <w:r>
               <w:t>LosujZestaw_LiczbySaUnikalne</w:t>
             </w:r>
-            <w:proofErr w:type="spellEnd"/>
           </w:p>
         </w:tc>
         <w:tc>
@@ -4727,20 +3624,7 @@
               <w:cnfStyle w:val="000000000000" w:firstRow="0" w:lastRow="0" w:firstColumn="0" w:lastColumn="0" w:oddVBand="0" w:evenVBand="0" w:oddHBand="0" w:evenHBand="0" w:firstRowFirstColumn="0" w:firstRowLastColumn="0" w:lastRowFirstColumn="0" w:lastRowLastColumn="0"/>
             </w:pPr>
             <w:r>
-              <w:t xml:space="preserve">Losuje 1000 zestawów. </w:t>
-            </w:r>
-            <w:proofErr w:type="spellStart"/>
-            <w:proofErr w:type="gramStart"/>
-            <w:r>
-              <w:t>Distinct</w:t>
-            </w:r>
-            <w:proofErr w:type="spellEnd"/>
-            <w:r>
-              <w:t>(</w:t>
-            </w:r>
-            <w:proofErr w:type="gramEnd"/>
-            <w:r>
-              <w:t>) usuwa powtórzenia, więc liczba elementów po jego zastosowaniu musi być równa długości zestawu.</w:t>
+              <w:t>Losuje 1000 zestawów. Distinct() usuwa powtórzenia, więc liczba elementów po jego zastosowaniu musi być równa długości zestawu.</w:t>
             </w:r>
           </w:p>
         </w:tc>
@@ -4811,11 +3695,9 @@
             <w:pPr>
               <w:cnfStyle w:val="000000100000" w:firstRow="0" w:lastRow="0" w:firstColumn="0" w:lastColumn="0" w:oddVBand="0" w:evenVBand="0" w:oddHBand="1" w:evenHBand="0" w:firstRowFirstColumn="0" w:firstRowLastColumn="0" w:lastRowFirstColumn="0" w:lastRowLastColumn="0"/>
             </w:pPr>
-            <w:proofErr w:type="spellStart"/>
             <w:r>
               <w:t>LosujZestaw_LiczbySaZZakresu</w:t>
             </w:r>
-            <w:proofErr w:type="spellEnd"/>
           </w:p>
         </w:tc>
         <w:tc>
@@ -4828,15 +3710,7 @@
               <w:cnfStyle w:val="000000100000" w:firstRow="0" w:lastRow="0" w:firstColumn="0" w:lastColumn="0" w:oddVBand="0" w:evenVBand="0" w:oddHBand="1" w:evenHBand="0" w:firstRowFirstColumn="0" w:firstRowLastColumn="0" w:lastRowFirstColumn="0" w:lastRowLastColumn="0"/>
             </w:pPr>
             <w:r>
-              <w:t xml:space="preserve">Losuje 1000 zestawów i dla każdej liczby sprawdza </w:t>
-            </w:r>
-            <w:proofErr w:type="spellStart"/>
-            <w:r>
-              <w:t>Assert.True</w:t>
-            </w:r>
-            <w:proofErr w:type="spellEnd"/>
-            <w:r>
-              <w:t>(liczba &gt;= 1 &amp;&amp; liczba &lt;= 49).</w:t>
+              <w:t>Losuje 1000 zestawów i dla każdej liczby sprawdza Assert.True(liczba &gt;= 1 &amp;&amp; liczba &lt;= 49).</w:t>
             </w:r>
           </w:p>
         </w:tc>
@@ -4904,11 +3778,9 @@
             <w:pPr>
               <w:cnfStyle w:val="000000000000" w:firstRow="0" w:lastRow="0" w:firstColumn="0" w:lastColumn="0" w:oddVBand="0" w:evenVBand="0" w:oddHBand="0" w:evenHBand="0" w:firstRowFirstColumn="0" w:firstRowLastColumn="0" w:lastRowFirstColumn="0" w:lastRowLastColumn="0"/>
             </w:pPr>
-            <w:proofErr w:type="spellStart"/>
             <w:r>
               <w:t>WyswietlLosowania_LiczbaPoza_Zakresem_RzucaWyjatek</w:t>
             </w:r>
-            <w:proofErr w:type="spellEnd"/>
           </w:p>
         </w:tc>
         <w:tc>
@@ -4921,36 +3793,7 @@
               <w:cnfStyle w:val="000000000000" w:firstRow="0" w:lastRow="0" w:firstColumn="0" w:lastColumn="0" w:oddVBand="0" w:evenVBand="0" w:oddHBand="0" w:evenHBand="0" w:firstRowFirstColumn="0" w:firstRowLastColumn="0" w:lastRowFirstColumn="0" w:lastRowLastColumn="0"/>
             </w:pPr>
             <w:r>
-              <w:t xml:space="preserve">Dane zawierają liczbę 50, spoza zakresu. Metoda próbuje zwiększyć </w:t>
-            </w:r>
-            <w:proofErr w:type="spellStart"/>
-            <w:proofErr w:type="gramStart"/>
-            <w:r>
-              <w:t>wystapienia</w:t>
-            </w:r>
-            <w:proofErr w:type="spellEnd"/>
-            <w:r>
-              <w:t>[</w:t>
-            </w:r>
-            <w:proofErr w:type="gramEnd"/>
-            <w:r>
-              <w:t xml:space="preserve">49], ale tablica ma indeksy 0–48. </w:t>
-            </w:r>
-            <w:proofErr w:type="spellStart"/>
-            <w:r>
-              <w:t>Assert.Throws</w:t>
-            </w:r>
-            <w:proofErr w:type="spellEnd"/>
-            <w:r>
-              <w:t xml:space="preserve"> sprawdza, że rzucany jest </w:t>
-            </w:r>
-            <w:proofErr w:type="spellStart"/>
-            <w:r>
-              <w:t>IndexOutOfRangeException</w:t>
-            </w:r>
-            <w:proofErr w:type="spellEnd"/>
-            <w:r>
-              <w:t>.</w:t>
+              <w:t>Dane zawierają liczbę 50, spoza zakresu. Metoda próbuje zwiększyć wystapienia[49], ale tablica ma indeksy 0–48. Assert.Throws sprawdza, że rzucany jest IndexOutOfRangeException.</w:t>
             </w:r>
           </w:p>
         </w:tc>
@@ -5287,31 +4130,13 @@
       <w:r>
         <w:t xml:space="preserve"> – Testy integracyjne (ang. </w:t>
       </w:r>
-      <w:proofErr w:type="spellStart"/>
       <w:r>
         <w:rPr>
           <w:i/>
           <w:iCs/>
         </w:rPr>
-        <w:t>integration</w:t>
-      </w:r>
-      <w:proofErr w:type="spellEnd"/>
-      <w:r>
-        <w:rPr>
-          <w:i/>
-          <w:iCs/>
-        </w:rPr>
-        <w:t xml:space="preserve"> </w:t>
-      </w:r>
-      <w:proofErr w:type="spellStart"/>
-      <w:r>
-        <w:rPr>
-          <w:i/>
-          <w:iCs/>
-        </w:rPr>
-        <w:t>tests</w:t>
-      </w:r>
-      <w:proofErr w:type="spellEnd"/>
+        <w:t>integration tests</w:t>
+      </w:r>
       <w:r>
         <w:t>) sprawdzają, czy połączone moduły i komponenty aplikacji współpracują ze sobą prawidłowo. W przeciwieństwie do testów jednostkowych nie izolują kodu, lecz weryfikują jego interakcje z prawdziwymi elementami zewnętrznymi, takimi jak baza danych, pliki systemowe, zewnętrzne interfejsy API czy kolejki komunikatów.</w:t>
       </w:r>
@@ -5525,41 +4350,7 @@
               <w:cnfStyle w:val="000000100000" w:firstRow="0" w:lastRow="0" w:firstColumn="0" w:lastColumn="0" w:oddVBand="0" w:evenVBand="0" w:oddHBand="1" w:evenHBand="0" w:firstRowFirstColumn="0" w:firstRowLastColumn="0" w:lastRowFirstColumn="0" w:lastRowLastColumn="0"/>
             </w:pPr>
             <w:r>
-              <w:t xml:space="preserve">Wywołuje </w:t>
-            </w:r>
-            <w:proofErr w:type="spellStart"/>
-            <w:proofErr w:type="gramStart"/>
-            <w:r>
-              <w:t>LosujZestaw</w:t>
-            </w:r>
-            <w:proofErr w:type="spellEnd"/>
-            <w:r>
-              <w:t>(</w:t>
-            </w:r>
-            <w:proofErr w:type="gramEnd"/>
-            <w:r>
-              <w:t xml:space="preserve">) wielokrotnie, przekazuje uzyskane dane do </w:t>
-            </w:r>
-            <w:proofErr w:type="spellStart"/>
-            <w:proofErr w:type="gramStart"/>
-            <w:r>
-              <w:t>WyswietlLosowania</w:t>
-            </w:r>
-            <w:proofErr w:type="spellEnd"/>
-            <w:r>
-              <w:t>(</w:t>
-            </w:r>
-            <w:proofErr w:type="gramEnd"/>
-            <w:r>
-              <w:t xml:space="preserve">) i przechwytuje wyjście konsoli za pomocą </w:t>
-            </w:r>
-            <w:proofErr w:type="spellStart"/>
-            <w:r>
-              <w:t>StringWriter</w:t>
-            </w:r>
-            <w:proofErr w:type="spellEnd"/>
-            <w:r>
-              <w:t>.</w:t>
+              <w:t>Wywołuje LosujZestaw() wielokrotnie, przekazuje uzyskane dane do WyswietlLosowania() i przechwytuje wyjście konsoli za pomocą StringWriter.</w:t>
             </w:r>
           </w:p>
         </w:tc>
@@ -5574,15 +4365,7 @@
               <w:cnfStyle w:val="000000100000" w:firstRow="0" w:lastRow="0" w:firstColumn="0" w:lastColumn="0" w:oddVBand="0" w:evenVBand="0" w:oddHBand="1" w:evenHBand="0" w:firstRowFirstColumn="0" w:firstRowLastColumn="0" w:lastRowFirstColumn="0" w:lastRowLastColumn="0"/>
             </w:pPr>
             <w:r>
-              <w:t xml:space="preserve">Metoda </w:t>
-            </w:r>
-            <w:proofErr w:type="spellStart"/>
-            <w:r>
-              <w:t>WyswietlLosowania</w:t>
-            </w:r>
-            <w:proofErr w:type="spellEnd"/>
-            <w:r>
-              <w:t xml:space="preserve"> wykonuje się poprawnie, a na konsoli pojawiają się nagłówki losowań oraz statystyki wystąpień. Test zdany.</w:t>
+              <w:t>Metoda WyswietlLosowania wykonuje się poprawnie, a na konsoli pojawiają się nagłówki losowań oraz statystyki wystąpień. Test zdany.</w:t>
             </w:r>
           </w:p>
         </w:tc>
@@ -5628,11 +4411,9 @@
               <w:spacing w:after="160" w:line="278" w:lineRule="auto"/>
               <w:cnfStyle w:val="000000000000" w:firstRow="0" w:lastRow="0" w:firstColumn="0" w:lastColumn="0" w:oddVBand="0" w:evenVBand="0" w:oddHBand="0" w:evenHBand="0" w:firstRowFirstColumn="0" w:firstRowLastColumn="0" w:lastRowFirstColumn="0" w:lastRowLastColumn="0"/>
             </w:pPr>
-            <w:proofErr w:type="spellStart"/>
             <w:r>
               <w:t>Integracja_Main_PoprawneDane_WypisujeZestawyIStatystyki</w:t>
             </w:r>
-            <w:proofErr w:type="spellEnd"/>
           </w:p>
         </w:tc>
         <w:tc>
@@ -5646,23 +4427,7 @@
               <w:cnfStyle w:val="000000000000" w:firstRow="0" w:lastRow="0" w:firstColumn="0" w:lastColumn="0" w:oddVBand="0" w:evenVBand="0" w:oddHBand="0" w:evenHBand="0" w:firstRowFirstColumn="0" w:firstRowLastColumn="0" w:lastRowFirstColumn="0" w:lastRowLastColumn="0"/>
             </w:pPr>
             <w:r>
-              <w:t xml:space="preserve">Symuluje wpisanie w konsoli poprawnej liczby zestawów (np. "2"), przekierowując </w:t>
-            </w:r>
-            <w:proofErr w:type="spellStart"/>
-            <w:r>
-              <w:t>Console.In</w:t>
-            </w:r>
-            <w:proofErr w:type="spellEnd"/>
-            <w:r>
-              <w:t xml:space="preserve"> i </w:t>
-            </w:r>
-            <w:proofErr w:type="spellStart"/>
-            <w:r>
-              <w:t>Console.Out</w:t>
-            </w:r>
-            <w:proofErr w:type="spellEnd"/>
-            <w:r>
-              <w:t>.</w:t>
+              <w:t>Symuluje wpisanie w konsoli poprawnej liczby zestawów (np. "2"), przekierowując Console.In i Console.Out.</w:t>
             </w:r>
           </w:p>
         </w:tc>
@@ -5726,11 +4491,9 @@
               <w:spacing w:after="160" w:line="278" w:lineRule="auto"/>
               <w:cnfStyle w:val="000000100000" w:firstRow="0" w:lastRow="0" w:firstColumn="0" w:lastColumn="0" w:oddVBand="0" w:evenVBand="0" w:oddHBand="1" w:evenHBand="0" w:firstRowFirstColumn="0" w:firstRowLastColumn="0" w:lastRowFirstColumn="0" w:lastRowLastColumn="0"/>
             </w:pPr>
-            <w:proofErr w:type="spellStart"/>
             <w:r>
               <w:t>Integracja_WyswietlLosowania_PoprawnieZliczaSumeWystapienLiczb</w:t>
             </w:r>
-            <w:proofErr w:type="spellEnd"/>
           </w:p>
         </w:tc>
         <w:tc>
@@ -5744,15 +4507,7 @@
               <w:cnfStyle w:val="000000100000" w:firstRow="0" w:lastRow="0" w:firstColumn="0" w:lastColumn="0" w:oddVBand="0" w:evenVBand="0" w:oddHBand="1" w:evenHBand="0" w:firstRowFirstColumn="0" w:firstRowLastColumn="0" w:lastRowFirstColumn="0" w:lastRowLastColumn="0"/>
             </w:pPr>
             <w:r>
-              <w:t xml:space="preserve">Generuje znaną liczbę zestawów (np. 5) i weryfikuje w wypisanym strumieniu </w:t>
-            </w:r>
-            <w:proofErr w:type="gramStart"/>
-            <w:r>
-              <w:t>wyjściowym,</w:t>
-            </w:r>
-            <w:proofErr w:type="gramEnd"/>
-            <w:r>
-              <w:t xml:space="preserve"> czy łączna suma wystąpień wszystkich liczb wynosi dokładnie </w:t>
+              <w:t xml:space="preserve">Generuje znaną liczbę zestawów (np. 5) i weryfikuje w wypisanym strumieniu wyjściowym, czy łączna suma wystąpień wszystkich liczb wynosi dokładnie </w:t>
             </w:r>
             <m:oMath>
               <m:r>
@@ -5824,11 +4579,9 @@
               <w:spacing w:after="160" w:line="278" w:lineRule="auto"/>
               <w:cnfStyle w:val="000000000000" w:firstRow="0" w:lastRow="0" w:firstColumn="0" w:lastColumn="0" w:oddVBand="0" w:evenVBand="0" w:oddHBand="0" w:evenHBand="0" w:firstRowFirstColumn="0" w:firstRowLastColumn="0" w:lastRowFirstColumn="0" w:lastRowLastColumn="0"/>
             </w:pPr>
-            <w:proofErr w:type="spellStart"/>
             <w:r>
               <w:t>Integracja_Main_NiepoprawneDane_WypisujeKomunikatOBledzie</w:t>
             </w:r>
-            <w:proofErr w:type="spellEnd"/>
           </w:p>
         </w:tc>
         <w:tc>
@@ -5842,15 +4595,7 @@
               <w:cnfStyle w:val="000000000000" w:firstRow="0" w:lastRow="0" w:firstColumn="0" w:lastColumn="0" w:oddVBand="0" w:evenVBand="0" w:oddHBand="0" w:evenHBand="0" w:firstRowFirstColumn="0" w:firstRowLastColumn="0" w:lastRowFirstColumn="0" w:lastRowLastColumn="0"/>
             </w:pPr>
             <w:r>
-              <w:t xml:space="preserve">Symuluje wpisanie błędnych danych (np. "abc" lub "-5") poprzez przekierowanie </w:t>
-            </w:r>
-            <w:proofErr w:type="spellStart"/>
-            <w:r>
-              <w:t>Console.In</w:t>
-            </w:r>
-            <w:proofErr w:type="spellEnd"/>
-            <w:r>
-              <w:t>.</w:t>
+              <w:t>Symuluje wpisanie błędnych danych (np. "abc" lub "-5") poprzez przekierowanie Console.In.</w:t>
             </w:r>
           </w:p>
         </w:tc>
@@ -6094,10 +4839,7 @@
       </w:pPr>
       <w:r>
         <w:lastRenderedPageBreak/>
-        <w:t>Testy</w:t>
-      </w:r>
-      <w:r>
-        <w:t xml:space="preserve"> systemowe</w:t>
+        <w:t>Testy systemowe</w:t>
       </w:r>
     </w:p>
     <w:p>
@@ -6122,17 +4864,8 @@
           <w:i/>
           <w:iCs/>
         </w:rPr>
-        <w:t xml:space="preserve">system </w:t>
-      </w:r>
-      <w:proofErr w:type="spellStart"/>
-      <w:r>
-        <w:rPr>
-          <w:i/>
-          <w:iCs/>
-        </w:rPr>
-        <w:t>tests</w:t>
-      </w:r>
-      <w:proofErr w:type="spellEnd"/>
+        <w:t>system tests</w:t>
+      </w:r>
       <w:r>
         <w:t>) sprawdzają cały, kompletnie zmontowany i zintegrowany produkt programistyczny jako jedną całość. Weryfikują, czy aplikacja spełnia wszystkie określone wymagania funkcjonalne i niefunkcjonalne (np. wydajność, bezpieczeństwo, użyteczność) w środowisku zbliżonym do produkcyjnego.</w:t>
       </w:r>
@@ -6169,16 +4902,7 @@
         <w:ind w:firstLine="360"/>
       </w:pPr>
       <w:r>
-        <w:t>Podobnie jak poprzednio t</w:t>
-      </w:r>
-      <w:r>
-        <w:t xml:space="preserve">en rozdział będzie się opierać na programie opisanym w </w:t>
-      </w:r>
-      <w:r>
-        <w:t xml:space="preserve">pierwszym </w:t>
-      </w:r>
-      <w:r>
-        <w:t>punkcie. Szczegóły jego implementacji znajdują się w rozdziale 1.1. dokumentacji.</w:t>
+        <w:t>Podobnie jak poprzednio ten rozdział będzie się opierać na programie opisanym w pierwszym punkcie. Szczegóły jego implementacji znajdują się w rozdziale 1.1. dokumentacji.</w:t>
       </w:r>
     </w:p>
     <w:p>
@@ -6334,11 +5058,9 @@
               <w:spacing w:after="160" w:line="278" w:lineRule="auto"/>
               <w:cnfStyle w:val="000000100000" w:firstRow="0" w:lastRow="0" w:firstColumn="0" w:lastColumn="0" w:oddVBand="0" w:evenVBand="0" w:oddHBand="1" w:evenHBand="0" w:firstRowFirstColumn="0" w:firstRowLastColumn="0" w:lastRowFirstColumn="0" w:lastRowLastColumn="0"/>
             </w:pPr>
-            <w:proofErr w:type="spellStart"/>
             <w:r>
               <w:t>System_UruchomienieAplikacji_ZwracaKodSukcesuZero</w:t>
             </w:r>
-            <w:proofErr w:type="spellEnd"/>
           </w:p>
         </w:tc>
         <w:tc>
@@ -6366,29 +5088,15 @@
               <w:spacing w:after="160" w:line="278" w:lineRule="auto"/>
               <w:cnfStyle w:val="000000100000" w:firstRow="0" w:lastRow="0" w:firstColumn="0" w:lastColumn="0" w:oddVBand="0" w:evenVBand="0" w:oddHBand="1" w:evenHBand="0" w:firstRowFirstColumn="0" w:firstRowLastColumn="0" w:lastRowFirstColumn="0" w:lastRowLastColumn="0"/>
             </w:pPr>
-            <w:proofErr w:type="spellStart"/>
-            <w:r>
-              <w:t>Process</w:t>
-            </w:r>
-            <w:proofErr w:type="spellEnd"/>
-            <w:r>
-              <w:t xml:space="preserve"> kończy się kodem wyjścia 0 (</w:t>
-            </w:r>
-            <w:proofErr w:type="spellStart"/>
+            <w:r>
+              <w:t>Process kończy się kodem wyjścia 0 (</w:t>
+            </w:r>
             <w:r>
               <w:rPr>
                 <w:i/>
                 <w:iCs/>
               </w:rPr>
-              <w:t>ExitCode</w:t>
-            </w:r>
-            <w:proofErr w:type="spellEnd"/>
-            <w:r>
-              <w:rPr>
-                <w:i/>
-                <w:iCs/>
-              </w:rPr>
-              <w:t xml:space="preserve"> = 0</w:t>
+              <w:t>ExitCode = 0</w:t>
             </w:r>
             <w:r>
               <w:t>), a w konsoli pojawia się pełny komunikat startowy i końcowy. Test zdany.</w:t>
@@ -6440,11 +5148,9 @@
               <w:spacing w:after="160" w:line="278" w:lineRule="auto"/>
               <w:cnfStyle w:val="000000000000" w:firstRow="0" w:lastRow="0" w:firstColumn="0" w:lastColumn="0" w:oddVBand="0" w:evenVBand="0" w:oddHBand="0" w:evenHBand="0" w:firstRowFirstColumn="0" w:firstRowLastColumn="0" w:lastRowFirstColumn="0" w:lastRowLastColumn="0"/>
             </w:pPr>
-            <w:proofErr w:type="spellStart"/>
             <w:r>
               <w:t>System_GenerowanieWieluZestawow_FormatWyjsciaZgodnyZWymaganiami</w:t>
             </w:r>
-            <w:proofErr w:type="spellEnd"/>
           </w:p>
         </w:tc>
         <w:tc>
@@ -6473,23 +5179,7 @@
               <w:cnfStyle w:val="000000000000" w:firstRow="0" w:lastRow="0" w:firstColumn="0" w:lastColumn="0" w:oddVBand="0" w:evenVBand="0" w:oddHBand="0" w:evenHBand="0" w:firstRowFirstColumn="0" w:firstRowLastColumn="0" w:lastRowFirstColumn="0" w:lastRowLastColumn="0"/>
             </w:pPr>
             <w:r>
-              <w:t xml:space="preserve">Wyjście systemu zawiera dokładnie 3 linie z nagłówkami Losowanie </w:t>
-            </w:r>
-            <w:proofErr w:type="gramStart"/>
-            <w:r>
-              <w:t>1:,</w:t>
-            </w:r>
-            <w:proofErr w:type="gramEnd"/>
-            <w:r>
-              <w:t xml:space="preserve"> Losowanie </w:t>
-            </w:r>
-            <w:proofErr w:type="gramStart"/>
-            <w:r>
-              <w:t>2:,</w:t>
-            </w:r>
-            <w:proofErr w:type="gramEnd"/>
-            <w:r>
-              <w:t xml:space="preserve"> Losowanie 3: oraz pełną listę 49 statystyk. Test zdany.</w:t>
+              <w:t>Wyjście systemu zawiera dokładnie 3 linie z nagłówkami Losowanie 1:, Losowanie 2:, Losowanie 3: oraz pełną listę 49 statystyk. Test zdany.</w:t>
             </w:r>
           </w:p>
         </w:tc>
@@ -6539,11 +5229,9 @@
               <w:spacing w:after="160" w:line="278" w:lineRule="auto"/>
               <w:cnfStyle w:val="000000100000" w:firstRow="0" w:lastRow="0" w:firstColumn="0" w:lastColumn="0" w:oddVBand="0" w:evenVBand="0" w:oddHBand="1" w:evenHBand="0" w:firstRowFirstColumn="0" w:firstRowLastColumn="0" w:lastRowFirstColumn="0" w:lastRowLastColumn="0"/>
             </w:pPr>
-            <w:proofErr w:type="spellStart"/>
             <w:r>
               <w:t>System_SzybkosceDzialania_WykonanieDlaDuzejLiczbyLosowan</w:t>
             </w:r>
-            <w:proofErr w:type="spellEnd"/>
           </w:p>
         </w:tc>
         <w:tc>
@@ -6621,11 +5309,9 @@
               <w:spacing w:after="160" w:line="278" w:lineRule="auto"/>
               <w:cnfStyle w:val="000000000000" w:firstRow="0" w:lastRow="0" w:firstColumn="0" w:lastColumn="0" w:oddVBand="0" w:evenVBand="0" w:oddHBand="0" w:evenHBand="0" w:firstRowFirstColumn="0" w:firstRowLastColumn="0" w:lastRowFirstColumn="0" w:lastRowLastColumn="0"/>
             </w:pPr>
-            <w:proofErr w:type="spellStart"/>
             <w:r>
               <w:t>System_BledneDaneWejsciowe_ZwracaObsluzonyBdadIObrywaProces</w:t>
             </w:r>
-            <w:proofErr w:type="spellEnd"/>
           </w:p>
         </w:tc>
         <w:tc>
@@ -6639,15 +5325,7 @@
               <w:cnfStyle w:val="000000000000" w:firstRow="0" w:lastRow="0" w:firstColumn="0" w:lastColumn="0" w:oddVBand="0" w:evenVBand="0" w:oddHBand="0" w:evenHBand="0" w:firstRowFirstColumn="0" w:firstRowLastColumn="0" w:lastRowFirstColumn="0" w:lastRowLastColumn="0"/>
             </w:pPr>
             <w:r>
-              <w:t>Uruchamia proces systemowy przekazując niepoprawny ciąg znaków (np. "</w:t>
-            </w:r>
-            <w:proofErr w:type="spellStart"/>
-            <w:r>
-              <w:t>nie_liczba</w:t>
-            </w:r>
-            <w:proofErr w:type="spellEnd"/>
-            <w:r>
-              <w:t>").</w:t>
+              <w:t>Uruchamia proces systemowy przekazując niepoprawny ciąg znaków (np. "nie_liczba").</w:t>
             </w:r>
           </w:p>
         </w:tc>
@@ -6662,23 +5340,175 @@
               <w:cnfStyle w:val="000000000000" w:firstRow="0" w:lastRow="0" w:firstColumn="0" w:lastColumn="0" w:oddVBand="0" w:evenVBand="0" w:oddHBand="0" w:evenHBand="0" w:firstRowFirstColumn="0" w:firstRowLastColumn="0" w:lastRowFirstColumn="0" w:lastRowLastColumn="0"/>
             </w:pPr>
             <w:r>
-              <w:t>Proces wypisuje w systemie komunikat o błędzie i natychmiast bezpiecznie zamyka się z kodem wyjścia 0 (brak awarii/</w:t>
-            </w:r>
-            <w:proofErr w:type="spellStart"/>
-            <w:r>
-              <w:t>crasha</w:t>
-            </w:r>
-            <w:proofErr w:type="spellEnd"/>
-            <w:r>
-              <w:t xml:space="preserve"> aplikacji). Test zdany.</w:t>
+              <w:t>Proces wypisuje w systemie komunikat o błędzie i natychmiast bezpiecznie zamyka się z kodem wyjścia 0 (brak awarii/crasha aplikacji). Test zdany.</w:t>
             </w:r>
           </w:p>
         </w:tc>
       </w:tr>
     </w:tbl>
     <w:p/>
+    <w:p>
+      <w:pPr>
+        <w:jc w:val="left"/>
+      </w:pPr>
+      <w:r>
+        <w:br w:type="page"/>
+      </w:r>
+    </w:p>
+    <w:p>
+      <w:pPr>
+        <w:pStyle w:val="Nagwek1"/>
+        <w:numPr>
+          <w:ilvl w:val="0"/>
+          <w:numId w:val="0"/>
+        </w:numPr>
+        <w:ind w:left="1080"/>
+      </w:pPr>
+      <w:r>
+        <w:lastRenderedPageBreak/>
+        <w:drawing>
+          <wp:inline distT="0" distB="0" distL="0" distR="0" wp14:anchorId="62B9196E" wp14:editId="72117AD5">
+            <wp:extent cx="3477110" cy="3315163"/>
+            <wp:effectExtent l="0" t="0" r="0" b="0"/>
+            <wp:docPr id="1024630926" name="Obraz 1"/>
+            <wp:cNvGraphicFramePr>
+              <a:graphicFrameLocks xmlns:a="http://schemas.openxmlformats.org/drawingml/2006/main" noChangeAspect="1"/>
+            </wp:cNvGraphicFramePr>
+            <a:graphic xmlns:a="http://schemas.openxmlformats.org/drawingml/2006/main">
+              <a:graphicData uri="http://schemas.openxmlformats.org/drawingml/2006/picture">
+                <pic:pic xmlns:pic="http://schemas.openxmlformats.org/drawingml/2006/picture">
+                  <pic:nvPicPr>
+                    <pic:cNvPr id="1024630926" name=""/>
+                    <pic:cNvPicPr/>
+                  </pic:nvPicPr>
+                  <pic:blipFill>
+                    <a:blip r:embed="rId17"/>
+                    <a:stretch>
+                      <a:fillRect/>
+                    </a:stretch>
+                  </pic:blipFill>
+                  <pic:spPr>
+                    <a:xfrm>
+                      <a:off x="0" y="0"/>
+                      <a:ext cx="3477110" cy="3315163"/>
+                    </a:xfrm>
+                    <a:prstGeom prst="rect">
+                      <a:avLst/>
+                    </a:prstGeom>
+                  </pic:spPr>
+                </pic:pic>
+              </a:graphicData>
+            </a:graphic>
+          </wp:inline>
+        </w:drawing>
+      </w:r>
+    </w:p>
+    <w:p>
+      <w:r>
+        <w:drawing>
+          <wp:inline distT="0" distB="0" distL="0" distR="0" wp14:anchorId="52803A1D" wp14:editId="0AD3075C">
+            <wp:extent cx="5760720" cy="5104130"/>
+            <wp:effectExtent l="0" t="0" r="0" b="1270"/>
+            <wp:docPr id="1180637419" name="Obraz 1"/>
+            <wp:cNvGraphicFramePr>
+              <a:graphicFrameLocks xmlns:a="http://schemas.openxmlformats.org/drawingml/2006/main" noChangeAspect="1"/>
+            </wp:cNvGraphicFramePr>
+            <a:graphic xmlns:a="http://schemas.openxmlformats.org/drawingml/2006/main">
+              <a:graphicData uri="http://schemas.openxmlformats.org/drawingml/2006/picture">
+                <pic:pic xmlns:pic="http://schemas.openxmlformats.org/drawingml/2006/picture">
+                  <pic:nvPicPr>
+                    <pic:cNvPr id="1180637419" name=""/>
+                    <pic:cNvPicPr/>
+                  </pic:nvPicPr>
+                  <pic:blipFill>
+                    <a:blip r:embed="rId18"/>
+                    <a:stretch>
+                      <a:fillRect/>
+                    </a:stretch>
+                  </pic:blipFill>
+                  <pic:spPr>
+                    <a:xfrm>
+                      <a:off x="0" y="0"/>
+                      <a:ext cx="5760720" cy="5104130"/>
+                    </a:xfrm>
+                    <a:prstGeom prst="rect">
+                      <a:avLst/>
+                    </a:prstGeom>
+                  </pic:spPr>
+                </pic:pic>
+              </a:graphicData>
+            </a:graphic>
+          </wp:inline>
+        </w:drawing>
+      </w:r>
+    </w:p>
+    <w:p/>
+    <w:p>
+      <w:r>
+        <w:lastRenderedPageBreak/>
+        <w:drawing>
+          <wp:inline distT="0" distB="0" distL="0" distR="0" wp14:anchorId="6957B9E1" wp14:editId="05202FDB">
+            <wp:extent cx="5760720" cy="4117975"/>
+            <wp:effectExtent l="0" t="0" r="0" b="0"/>
+            <wp:docPr id="595385338" name="Obraz 1"/>
+            <wp:cNvGraphicFramePr>
+              <a:graphicFrameLocks xmlns:a="http://schemas.openxmlformats.org/drawingml/2006/main" noChangeAspect="1"/>
+            </wp:cNvGraphicFramePr>
+            <a:graphic xmlns:a="http://schemas.openxmlformats.org/drawingml/2006/main">
+              <a:graphicData uri="http://schemas.openxmlformats.org/drawingml/2006/picture">
+                <pic:pic xmlns:pic="http://schemas.openxmlformats.org/drawingml/2006/picture">
+                  <pic:nvPicPr>
+                    <pic:cNvPr id="595385338" name=""/>
+                    <pic:cNvPicPr/>
+                  </pic:nvPicPr>
+                  <pic:blipFill>
+                    <a:blip r:embed="rId19"/>
+                    <a:stretch>
+                      <a:fillRect/>
+                    </a:stretch>
+                  </pic:blipFill>
+                  <pic:spPr>
+                    <a:xfrm>
+                      <a:off x="0" y="0"/>
+                      <a:ext cx="5760720" cy="4117975"/>
+                    </a:xfrm>
+                    <a:prstGeom prst="rect">
+                      <a:avLst/>
+                    </a:prstGeom>
+                  </pic:spPr>
+                </pic:pic>
+              </a:graphicData>
+            </a:graphic>
+          </wp:inline>
+        </w:drawing>
+      </w:r>
+    </w:p>
+    <w:p/>
+    <w:p/>
+    <w:p/>
+    <w:p>
+      <w:pPr>
+        <w:pStyle w:val="Nagwek1"/>
+        <w:numPr>
+          <w:ilvl w:val="1"/>
+          <w:numId w:val="27"/>
+        </w:numPr>
+      </w:pPr>
+      <w:r>
+        <w:t>GIT</w:t>
+      </w:r>
+    </w:p>
+    <w:p>
+      <w:r>
+        <w:t>Screen z git log commitów wprowadzających przypadki testowe</w:t>
+      </w:r>
+      <w:r>
+        <w:t>:</w:t>
+      </w:r>
+    </w:p>
+    <w:p/>
     <w:sectPr>
-      <w:footerReference w:type="default" r:id="rId17"/>
+      <w:footerReference w:type="default" r:id="rId20"/>
       <w:pgSz w:w="11906" w:h="16838"/>
       <w:pgMar w:top="1417" w:right="1417" w:bottom="1417" w:left="1417" w:header="708" w:footer="708" w:gutter="0"/>
       <w:cols w:space="708"/>
@@ -10449,6 +9279,7 @@
   <w:style w:type="character" w:default="1" w:styleId="Domylnaczcionkaakapitu">
     <w:name w:val="Default Paragraph Font"/>
     <w:uiPriority w:val="1"/>
+    <w:semiHidden/>
     <w:unhideWhenUsed/>
   </w:style>
   <w:style w:type="table" w:default="1" w:styleId="Standardowy">

</xml_diff>

<commit_message>
Utworzenie drugiego testu akceptacyjnego - unikalności i zakresu liczb w zestawach z perspektywy zasad gry
</commit_message>
<xml_diff>
--- a/Testowanie aplikacji - Marcin_Migacz_5P2.docx
+++ b/Testowanie aplikacji - Marcin_Migacz_5P2.docx
@@ -283,8 +283,20 @@
           <w:sz w:val="28"/>
           <w:szCs w:val="28"/>
         </w:rPr>
-        <w:t>NOWY SĄCZ 2026r.</w:t>
-      </w:r>
+        <w:t xml:space="preserve">NOWY SĄCZ </w:t>
+      </w:r>
+      <w:proofErr w:type="gramStart"/>
+      <w:r>
+        <w:rPr>
+          <w:rFonts w:asciiTheme="majorHAnsi" w:hAnsiTheme="majorHAnsi"/>
+          <w:b/>
+          <w:bCs/>
+          <w:sz w:val="28"/>
+          <w:szCs w:val="28"/>
+        </w:rPr>
+        <w:t>2026r.</w:t>
+      </w:r>
+      <w:proofErr w:type="gramEnd"/>
     </w:p>
     <w:p>
       <w:pPr>
@@ -1616,7 +1628,15 @@
         <w:ind w:firstLine="360"/>
       </w:pPr>
       <w:r>
-        <w:t xml:space="preserve">Testowanie oprogramowania to proces sprawdzania, czy program działa zgodnie z wymaganiami oraz wykrywania w nim błędów przed przekazaniem go użytkownikom. Błąd (defekt) to wada w kodzie, która może doprowadzić do awarii, czyli widocznego niepoprawnego działania systemu. </w:t>
+        <w:t xml:space="preserve">Testowanie oprogramowania to proces </w:t>
+      </w:r>
+      <w:proofErr w:type="gramStart"/>
+      <w:r>
+        <w:t>sprawdzania,</w:t>
+      </w:r>
+      <w:proofErr w:type="gramEnd"/>
+      <w:r>
+        <w:t xml:space="preserve"> czy program działa zgodnie z wymaganiami oraz wykrywania w nim błędów przed przekazaniem go użytkownikom. Błąd (defekt) to wada w kodzie, która może doprowadzić do awarii, czyli widocznego niepoprawnego działania systemu. </w:t>
       </w:r>
     </w:p>
     <w:p>
@@ -2356,6 +2376,7 @@
         </w:rPr>
       </w:pPr>
       <w:proofErr w:type="spellStart"/>
+      <w:proofErr w:type="gramStart"/>
       <w:r>
         <w:rPr>
           <w:rFonts w:asciiTheme="majorHAnsi" w:hAnsiTheme="majorHAnsi"/>
@@ -2367,6 +2388,7 @@
         <w:t>int.TryParse</w:t>
       </w:r>
       <w:proofErr w:type="spellEnd"/>
+      <w:proofErr w:type="gramEnd"/>
       <w:r>
         <w:rPr>
           <w:rFonts w:asciiTheme="majorHAnsi" w:hAnsiTheme="majorHAnsi"/>
@@ -2422,6 +2444,7 @@
         <w:t xml:space="preserve"> </w:t>
       </w:r>
       <w:proofErr w:type="spellStart"/>
+      <w:proofErr w:type="gramStart"/>
       <w:r>
         <w:rPr>
           <w:rFonts w:asciiTheme="majorHAnsi" w:hAnsiTheme="majorHAnsi"/>
@@ -2456,7 +2479,15 @@
           <w:rFonts w:asciiTheme="majorHAnsi" w:hAnsiTheme="majorHAnsi"/>
           <w:szCs w:val="22"/>
         </w:rPr>
-        <w:t xml:space="preserve"> - wczytuje tekst z klawiatury i próbuje zamienić go na liczbę całkowitą. Jeśli się uda, zwraca </w:t>
+        <w:t xml:space="preserve"> -</w:t>
+      </w:r>
+      <w:proofErr w:type="gramEnd"/>
+      <w:r>
+        <w:rPr>
+          <w:rFonts w:asciiTheme="majorHAnsi" w:hAnsiTheme="majorHAnsi"/>
+          <w:szCs w:val="22"/>
+        </w:rPr>
+        <w:t xml:space="preserve"> wczytuje tekst z klawiatury i próbuje zamienić go na liczbę całkowitą. Jeśli się uda, zwraca </w:t>
       </w:r>
       <w:proofErr w:type="spellStart"/>
       <w:r>
@@ -2577,6 +2608,7 @@
         <w:t xml:space="preserve"> </w:t>
       </w:r>
       <w:proofErr w:type="spellStart"/>
+      <w:proofErr w:type="gramStart"/>
       <w:r>
         <w:rPr>
           <w:rFonts w:asciiTheme="majorHAnsi" w:hAnsiTheme="majorHAnsi"/>
@@ -2599,6 +2631,7 @@
         <w:t>[</w:t>
       </w:r>
       <w:proofErr w:type="spellStart"/>
+      <w:proofErr w:type="gramEnd"/>
       <w:r>
         <w:rPr>
           <w:rFonts w:asciiTheme="majorHAnsi" w:hAnsiTheme="majorHAnsi"/>
@@ -2675,9 +2708,26 @@
           <w:rFonts w:asciiTheme="majorHAnsi" w:hAnsiTheme="majorHAnsi"/>
           <w:szCs w:val="22"/>
         </w:rPr>
-        <w:t xml:space="preserve">Pętla zewnętrzna for (i...) wykonuje się raz dla każdego zestawu. W każdym obiegu wywołuje </w:t>
+        <w:t>Pętla zewnętrzna for (</w:t>
+      </w:r>
+      <w:proofErr w:type="gramStart"/>
+      <w:r>
+        <w:rPr>
+          <w:rFonts w:asciiTheme="majorHAnsi" w:hAnsiTheme="majorHAnsi"/>
+          <w:szCs w:val="22"/>
+        </w:rPr>
+        <w:t>i...</w:t>
+      </w:r>
+      <w:proofErr w:type="gramEnd"/>
+      <w:r>
+        <w:rPr>
+          <w:rFonts w:asciiTheme="majorHAnsi" w:hAnsiTheme="majorHAnsi"/>
+          <w:szCs w:val="22"/>
+        </w:rPr>
+        <w:t xml:space="preserve">) wykonuje się raz dla każdego zestawu. W każdym obiegu wywołuje </w:t>
       </w:r>
       <w:proofErr w:type="spellStart"/>
+      <w:proofErr w:type="gramStart"/>
       <w:r>
         <w:rPr>
           <w:rFonts w:asciiTheme="majorHAnsi" w:hAnsiTheme="majorHAnsi"/>
@@ -2691,7 +2741,15 @@
           <w:rFonts w:asciiTheme="majorHAnsi" w:hAnsiTheme="majorHAnsi"/>
           <w:szCs w:val="22"/>
         </w:rPr>
-        <w:t>(), która zwraca 6-elementową tablicę.</w:t>
+        <w:t>(</w:t>
+      </w:r>
+      <w:proofErr w:type="gramEnd"/>
+      <w:r>
+        <w:rPr>
+          <w:rFonts w:asciiTheme="majorHAnsi" w:hAnsiTheme="majorHAnsi"/>
+          <w:szCs w:val="22"/>
+        </w:rPr>
+        <w:t>), która zwraca 6-elementową tablicę.</w:t>
       </w:r>
     </w:p>
     <w:p>
@@ -2711,7 +2769,23 @@
           <w:rFonts w:asciiTheme="majorHAnsi" w:hAnsiTheme="majorHAnsi"/>
           <w:szCs w:val="22"/>
         </w:rPr>
-        <w:t>Pętla wewnętrzna for (j...) przepisuje 6 wylosowanych liczb do wiersza i tablicy losowania.</w:t>
+        <w:t>Pętla wewnętrzna for (</w:t>
+      </w:r>
+      <w:proofErr w:type="gramStart"/>
+      <w:r>
+        <w:rPr>
+          <w:rFonts w:asciiTheme="majorHAnsi" w:hAnsiTheme="majorHAnsi"/>
+          <w:szCs w:val="22"/>
+        </w:rPr>
+        <w:t>j...</w:t>
+      </w:r>
+      <w:proofErr w:type="gramEnd"/>
+      <w:r>
+        <w:rPr>
+          <w:rFonts w:asciiTheme="majorHAnsi" w:hAnsiTheme="majorHAnsi"/>
+          <w:szCs w:val="22"/>
+        </w:rPr>
+        <w:t>) przepisuje 6 wylosowanych liczb do wiersza i tablicy losowania.</w:t>
       </w:r>
     </w:p>
     <w:p>
@@ -2727,6 +2801,7 @@
         </w:rPr>
       </w:pPr>
       <w:proofErr w:type="spellStart"/>
+      <w:proofErr w:type="gramStart"/>
       <w:r>
         <w:rPr>
           <w:rFonts w:asciiTheme="majorHAnsi" w:hAnsiTheme="majorHAnsi"/>
@@ -2749,6 +2824,7 @@
         <w:t>(</w:t>
       </w:r>
       <w:proofErr w:type="spellStart"/>
+      <w:proofErr w:type="gramEnd"/>
       <w:r>
         <w:rPr>
           <w:rFonts w:asciiTheme="majorHAnsi" w:hAnsiTheme="majorHAnsi"/>
@@ -2885,6 +2961,7 @@
         <w:t xml:space="preserve">Funkcja </w:t>
       </w:r>
       <w:proofErr w:type="spellStart"/>
+      <w:proofErr w:type="gramStart"/>
       <w:r>
         <w:rPr>
           <w:rFonts w:asciiTheme="majorHAnsi" w:hAnsiTheme="majorHAnsi"/>
@@ -2902,13 +2979,23 @@
           <w:bCs/>
           <w:color w:val="BF4E14" w:themeColor="accent2" w:themeShade="BF"/>
         </w:rPr>
-        <w:t>()</w:t>
-      </w:r>
-      <w:r>
-        <w:rPr>
-          <w:rFonts w:asciiTheme="majorHAnsi" w:hAnsiTheme="majorHAnsi"/>
+        <w:t>(</w:t>
+      </w:r>
+      <w:proofErr w:type="gramEnd"/>
+      <w:r>
+        <w:rPr>
+          <w:rFonts w:asciiTheme="majorHAnsi" w:hAnsiTheme="majorHAnsi"/>
+          <w:b/>
+          <w:bCs/>
           <w:color w:val="BF4E14" w:themeColor="accent2" w:themeShade="BF"/>
         </w:rPr>
+        <w:t>)</w:t>
+      </w:r>
+      <w:r>
+        <w:rPr>
+          <w:rFonts w:asciiTheme="majorHAnsi" w:hAnsiTheme="majorHAnsi"/>
+          <w:color w:val="BF4E14" w:themeColor="accent2" w:themeShade="BF"/>
+        </w:rPr>
         <w:t xml:space="preserve"> </w:t>
       </w:r>
       <w:r>
@@ -2925,6 +3012,7 @@
         <w:t xml:space="preserve">losuje jeden zestaw 6 różnych liczb z przedziału 1–49. Nie przyjmuje argumentów i zwraca tablicę </w:t>
       </w:r>
       <w:proofErr w:type="spellStart"/>
+      <w:proofErr w:type="gramStart"/>
       <w:r>
         <w:rPr>
           <w:rFonts w:asciiTheme="majorHAnsi" w:hAnsiTheme="majorHAnsi"/>
@@ -2938,7 +3026,15 @@
           <w:rFonts w:asciiTheme="majorHAnsi" w:hAnsiTheme="majorHAnsi"/>
           <w:lang w:eastAsia="pl-PL"/>
         </w:rPr>
-        <w:t>[] z wylosowanymi liczbami.</w:t>
+        <w:t>[</w:t>
+      </w:r>
+      <w:proofErr w:type="gramEnd"/>
+      <w:r>
+        <w:rPr>
+          <w:rFonts w:asciiTheme="majorHAnsi" w:hAnsiTheme="majorHAnsi"/>
+          <w:lang w:eastAsia="pl-PL"/>
+        </w:rPr>
+        <w:t>] z wylosowanymi liczbami.</w:t>
       </w:r>
     </w:p>
     <w:p>
@@ -2955,6 +3051,7 @@
         </w:rPr>
       </w:pPr>
       <w:proofErr w:type="spellStart"/>
+      <w:proofErr w:type="gramStart"/>
       <w:r>
         <w:rPr>
           <w:rFonts w:asciiTheme="majorHAnsi" w:hAnsiTheme="majorHAnsi"/>
@@ -2976,7 +3073,19 @@
           <w:szCs w:val="22"/>
           <w:lang w:eastAsia="pl-PL"/>
         </w:rPr>
-        <w:t xml:space="preserve">[] zestaw = </w:t>
+        <w:t>[</w:t>
+      </w:r>
+      <w:proofErr w:type="gramEnd"/>
+      <w:r>
+        <w:rPr>
+          <w:rFonts w:asciiTheme="majorHAnsi" w:hAnsiTheme="majorHAnsi"/>
+          <w:b/>
+          <w:bCs/>
+          <w:color w:val="BF4E14" w:themeColor="accent2" w:themeShade="BF"/>
+          <w:szCs w:val="22"/>
+          <w:lang w:eastAsia="pl-PL"/>
+        </w:rPr>
+        <w:t xml:space="preserve">] zestaw = </w:t>
       </w:r>
       <w:proofErr w:type="spellStart"/>
       <w:r>
@@ -3003,6 +3112,7 @@
         <w:t xml:space="preserve"> </w:t>
       </w:r>
       <w:proofErr w:type="spellStart"/>
+      <w:proofErr w:type="gramStart"/>
       <w:r>
         <w:rPr>
           <w:rFonts w:asciiTheme="majorHAnsi" w:hAnsiTheme="majorHAnsi"/>
@@ -3074,7 +3184,16 @@
           <w:szCs w:val="22"/>
           <w:lang w:eastAsia="pl-PL"/>
         </w:rPr>
-        <w:t>- t</w:t>
+        <w:t>-</w:t>
+      </w:r>
+      <w:proofErr w:type="gramEnd"/>
+      <w:r>
+        <w:rPr>
+          <w:rFonts w:asciiTheme="majorHAnsi" w:hAnsiTheme="majorHAnsi"/>
+          <w:szCs w:val="22"/>
+          <w:lang w:eastAsia="pl-PL"/>
+        </w:rPr>
+        <w:t xml:space="preserve"> t</w:t>
       </w:r>
       <w:r>
         <w:rPr>
@@ -3147,6 +3266,7 @@
         <w:t xml:space="preserve"> </w:t>
       </w:r>
       <w:proofErr w:type="spellStart"/>
+      <w:proofErr w:type="gramStart"/>
       <w:r>
         <w:rPr>
           <w:rFonts w:asciiTheme="majorHAnsi" w:hAnsiTheme="majorHAnsi"/>
@@ -3168,7 +3288,19 @@
           <w:szCs w:val="22"/>
           <w:lang w:eastAsia="pl-PL"/>
         </w:rPr>
-        <w:t>()</w:t>
+        <w:t>(</w:t>
+      </w:r>
+      <w:proofErr w:type="gramEnd"/>
+      <w:r>
+        <w:rPr>
+          <w:rFonts w:asciiTheme="majorHAnsi" w:hAnsiTheme="majorHAnsi"/>
+          <w:b/>
+          <w:bCs/>
+          <w:color w:val="BF4E14" w:themeColor="accent2" w:themeShade="BF"/>
+          <w:szCs w:val="22"/>
+          <w:lang w:eastAsia="pl-PL"/>
+        </w:rPr>
+        <w:t>)</w:t>
       </w:r>
       <w:r>
         <w:rPr>
@@ -3351,6 +3483,7 @@
         </w:rPr>
       </w:pPr>
       <w:proofErr w:type="spellStart"/>
+      <w:proofErr w:type="gramStart"/>
       <w:r>
         <w:rPr>
           <w:rFonts w:asciiTheme="majorHAnsi" w:hAnsiTheme="majorHAnsi"/>
@@ -3363,6 +3496,7 @@
         <w:t>generator.Next</w:t>
       </w:r>
       <w:proofErr w:type="spellEnd"/>
+      <w:proofErr w:type="gramEnd"/>
       <w:r>
         <w:rPr>
           <w:rFonts w:asciiTheme="majorHAnsi" w:hAnsiTheme="majorHAnsi"/>
@@ -3488,6 +3622,7 @@
         </w:rPr>
       </w:pPr>
       <w:proofErr w:type="spellStart"/>
+      <w:proofErr w:type="gramStart"/>
       <w:r>
         <w:rPr>
           <w:rFonts w:asciiTheme="majorHAnsi" w:hAnsiTheme="majorHAnsi"/>
@@ -3500,6 +3635,7 @@
         <w:t>zestaw.Contains</w:t>
       </w:r>
       <w:proofErr w:type="spellEnd"/>
+      <w:proofErr w:type="gramEnd"/>
       <w:r>
         <w:rPr>
           <w:rFonts w:asciiTheme="majorHAnsi" w:hAnsiTheme="majorHAnsi"/>
@@ -3583,7 +3719,25 @@
           <w:szCs w:val="22"/>
           <w:lang w:eastAsia="pl-PL"/>
         </w:rPr>
-        <w:t>jeśli nie, liczba zostaje zapisana pod indeksem i, a następnie i++ przesuwa licznik.</w:t>
+        <w:t xml:space="preserve">jeśli nie, liczba zostaje zapisana pod indeksem </w:t>
+      </w:r>
+      <w:proofErr w:type="gramStart"/>
+      <w:r>
+        <w:rPr>
+          <w:rFonts w:asciiTheme="majorHAnsi" w:hAnsiTheme="majorHAnsi"/>
+          <w:szCs w:val="22"/>
+          <w:lang w:eastAsia="pl-PL"/>
+        </w:rPr>
+        <w:t>i,</w:t>
+      </w:r>
+      <w:proofErr w:type="gramEnd"/>
+      <w:r>
+        <w:rPr>
+          <w:rFonts w:asciiTheme="majorHAnsi" w:hAnsiTheme="majorHAnsi"/>
+          <w:szCs w:val="22"/>
+          <w:lang w:eastAsia="pl-PL"/>
+        </w:rPr>
+        <w:t xml:space="preserve"> a następnie i++ przesuwa licznik.</w:t>
       </w:r>
     </w:p>
     <w:p>
@@ -3660,6 +3814,7 @@
         <w:t xml:space="preserve">Funkcja </w:t>
       </w:r>
       <w:proofErr w:type="spellStart"/>
+      <w:proofErr w:type="gramStart"/>
       <w:r>
         <w:rPr>
           <w:rFonts w:asciiTheme="majorHAnsi" w:hAnsiTheme="majorHAnsi"/>
@@ -3677,7 +3832,17 @@
           <w:bCs/>
           <w:color w:val="BF4E14" w:themeColor="accent2" w:themeShade="BF"/>
         </w:rPr>
-        <w:t>()</w:t>
+        <w:t>(</w:t>
+      </w:r>
+      <w:proofErr w:type="gramEnd"/>
+      <w:r>
+        <w:rPr>
+          <w:rFonts w:asciiTheme="majorHAnsi" w:hAnsiTheme="majorHAnsi"/>
+          <w:b/>
+          <w:bCs/>
+          <w:color w:val="BF4E14" w:themeColor="accent2" w:themeShade="BF"/>
+        </w:rPr>
+        <w:t>)</w:t>
       </w:r>
       <w:r>
         <w:rPr>
@@ -3719,6 +3884,7 @@
         </w:rPr>
       </w:pPr>
       <w:proofErr w:type="spellStart"/>
+      <w:proofErr w:type="gramStart"/>
       <w:r>
         <w:rPr>
           <w:rFonts w:asciiTheme="majorHAnsi" w:hAnsiTheme="majorHAnsi"/>
@@ -3738,7 +3904,18 @@
           <w:color w:val="BF4E14" w:themeColor="accent2" w:themeShade="BF"/>
           <w:szCs w:val="22"/>
         </w:rPr>
-        <w:t xml:space="preserve">[] </w:t>
+        <w:t>[</w:t>
+      </w:r>
+      <w:proofErr w:type="gramEnd"/>
+      <w:r>
+        <w:rPr>
+          <w:rFonts w:asciiTheme="majorHAnsi" w:hAnsiTheme="majorHAnsi"/>
+          <w:b/>
+          <w:bCs/>
+          <w:color w:val="BF4E14" w:themeColor="accent2" w:themeShade="BF"/>
+          <w:szCs w:val="22"/>
+        </w:rPr>
+        <w:t xml:space="preserve">] </w:t>
       </w:r>
       <w:proofErr w:type="spellStart"/>
       <w:r>
@@ -3785,6 +3962,7 @@
         <w:t xml:space="preserve"> </w:t>
       </w:r>
       <w:proofErr w:type="spellStart"/>
+      <w:proofErr w:type="gramStart"/>
       <w:r>
         <w:rPr>
           <w:rFonts w:asciiTheme="majorHAnsi" w:hAnsiTheme="majorHAnsi"/>
@@ -3807,6 +3985,7 @@
         <w:t>[</w:t>
       </w:r>
       <w:proofErr w:type="spellStart"/>
+      <w:proofErr w:type="gramEnd"/>
       <w:r>
         <w:rPr>
           <w:rFonts w:asciiTheme="majorHAnsi" w:hAnsiTheme="majorHAnsi"/>
@@ -3961,6 +4140,7 @@
         </w:rPr>
       </w:pPr>
       <w:proofErr w:type="spellStart"/>
+      <w:proofErr w:type="gramStart"/>
       <w:r>
         <w:rPr>
           <w:rFonts w:asciiTheme="majorHAnsi" w:hAnsiTheme="majorHAnsi"/>
@@ -3980,7 +4160,40 @@
           <w:color w:val="BF4E14" w:themeColor="accent2" w:themeShade="BF"/>
           <w:szCs w:val="22"/>
         </w:rPr>
-        <w:t xml:space="preserve">[losowania[i, j] - 1]++ </w:t>
+        <w:t>[losowania[i,</w:t>
+      </w:r>
+      <w:proofErr w:type="gramEnd"/>
+      <w:r>
+        <w:rPr>
+          <w:rFonts w:asciiTheme="majorHAnsi" w:hAnsiTheme="majorHAnsi"/>
+          <w:b/>
+          <w:bCs/>
+          <w:color w:val="BF4E14" w:themeColor="accent2" w:themeShade="BF"/>
+          <w:szCs w:val="22"/>
+        </w:rPr>
+        <w:t xml:space="preserve"> j] - </w:t>
+      </w:r>
+      <w:proofErr w:type="gramStart"/>
+      <w:r>
+        <w:rPr>
+          <w:rFonts w:asciiTheme="majorHAnsi" w:hAnsiTheme="majorHAnsi"/>
+          <w:b/>
+          <w:bCs/>
+          <w:color w:val="BF4E14" w:themeColor="accent2" w:themeShade="BF"/>
+          <w:szCs w:val="22"/>
+        </w:rPr>
+        <w:t>1]+</w:t>
+      </w:r>
+      <w:proofErr w:type="gramEnd"/>
+      <w:r>
+        <w:rPr>
+          <w:rFonts w:asciiTheme="majorHAnsi" w:hAnsiTheme="majorHAnsi"/>
+          <w:b/>
+          <w:bCs/>
+          <w:color w:val="BF4E14" w:themeColor="accent2" w:themeShade="BF"/>
+          <w:szCs w:val="22"/>
+        </w:rPr>
+        <w:t xml:space="preserve">+ </w:t>
       </w:r>
       <w:r>
         <w:rPr>
@@ -4039,7 +4252,29 @@
           <w:color w:val="BF4E14" w:themeColor="accent2" w:themeShade="BF"/>
           <w:szCs w:val="22"/>
         </w:rPr>
-        <w:t>(losowania[i, j] + " ")</w:t>
+        <w:t>(</w:t>
+      </w:r>
+      <w:proofErr w:type="gramStart"/>
+      <w:r>
+        <w:rPr>
+          <w:rFonts w:asciiTheme="majorHAnsi" w:hAnsiTheme="majorHAnsi"/>
+          <w:b/>
+          <w:bCs/>
+          <w:color w:val="BF4E14" w:themeColor="accent2" w:themeShade="BF"/>
+          <w:szCs w:val="22"/>
+        </w:rPr>
+        <w:t>losowania[i,</w:t>
+      </w:r>
+      <w:proofErr w:type="gramEnd"/>
+      <w:r>
+        <w:rPr>
+          <w:rFonts w:asciiTheme="majorHAnsi" w:hAnsiTheme="majorHAnsi"/>
+          <w:b/>
+          <w:bCs/>
+          <w:color w:val="BF4E14" w:themeColor="accent2" w:themeShade="BF"/>
+          <w:szCs w:val="22"/>
+        </w:rPr>
+        <w:t xml:space="preserve"> j] + " ")</w:t>
       </w:r>
       <w:r>
         <w:rPr>
@@ -4727,12 +4962,17 @@
               <w:t xml:space="preserve">Wywołuje </w:t>
             </w:r>
             <w:proofErr w:type="spellStart"/>
+            <w:proofErr w:type="gramStart"/>
             <w:r>
               <w:t>LosujZestaw</w:t>
             </w:r>
             <w:proofErr w:type="spellEnd"/>
             <w:r>
-              <w:t xml:space="preserve">() i sprawdza </w:t>
+              <w:t>(</w:t>
+            </w:r>
+            <w:proofErr w:type="gramEnd"/>
+            <w:r>
+              <w:t xml:space="preserve">) i sprawdza </w:t>
             </w:r>
             <w:proofErr w:type="spellStart"/>
             <w:r>
@@ -4743,10 +4983,12 @@
               <w:t xml:space="preserve">(6, </w:t>
             </w:r>
             <w:proofErr w:type="spellStart"/>
+            <w:proofErr w:type="gramStart"/>
             <w:r>
               <w:t>zestaw.Length</w:t>
             </w:r>
             <w:proofErr w:type="spellEnd"/>
+            <w:proofErr w:type="gramEnd"/>
             <w:r>
               <w:t>).</w:t>
             </w:r>
@@ -4836,12 +5078,17 @@
               <w:t xml:space="preserve">Losuje 1000 zestawów. </w:t>
             </w:r>
             <w:proofErr w:type="spellStart"/>
+            <w:proofErr w:type="gramStart"/>
             <w:r>
               <w:t>Distinct</w:t>
             </w:r>
             <w:proofErr w:type="spellEnd"/>
             <w:r>
-              <w:t>() usuwa powtórzenia, więc liczba elementów po jego zastosowaniu musi być równa długości zestawu.</w:t>
+              <w:t>(</w:t>
+            </w:r>
+            <w:proofErr w:type="gramEnd"/>
+            <w:r>
+              <w:t>) usuwa powtórzenia, więc liczba elementów po jego zastosowaniu musi być równa długości zestawu.</w:t>
             </w:r>
           </w:p>
         </w:tc>
@@ -5025,12 +5272,17 @@
               <w:t xml:space="preserve">Dane zawierają liczbę 50, spoza zakresu. Metoda próbuje zwiększyć </w:t>
             </w:r>
             <w:proofErr w:type="spellStart"/>
+            <w:proofErr w:type="gramStart"/>
             <w:r>
               <w:t>wystapienia</w:t>
             </w:r>
             <w:proofErr w:type="spellEnd"/>
             <w:r>
-              <w:t xml:space="preserve">[49], ale tablica ma indeksy 0–48. </w:t>
+              <w:t>[</w:t>
+            </w:r>
+            <w:proofErr w:type="gramEnd"/>
+            <w:r>
+              <w:t xml:space="preserve">49], ale tablica ma indeksy 0–48. </w:t>
             </w:r>
             <w:proofErr w:type="spellStart"/>
             <w:r>
@@ -5624,20 +5876,30 @@
               <w:t xml:space="preserve">Wywołuje </w:t>
             </w:r>
             <w:proofErr w:type="spellStart"/>
+            <w:proofErr w:type="gramStart"/>
             <w:r>
               <w:t>LosujZestaw</w:t>
             </w:r>
             <w:proofErr w:type="spellEnd"/>
             <w:r>
-              <w:t xml:space="preserve">() wielokrotnie, przekazuje uzyskane dane do </w:t>
+              <w:t>(</w:t>
+            </w:r>
+            <w:proofErr w:type="gramEnd"/>
+            <w:r>
+              <w:t xml:space="preserve">) wielokrotnie, przekazuje uzyskane dane do </w:t>
             </w:r>
             <w:proofErr w:type="spellStart"/>
+            <w:proofErr w:type="gramStart"/>
             <w:r>
               <w:t>WyswietlLosowania</w:t>
             </w:r>
             <w:proofErr w:type="spellEnd"/>
             <w:r>
-              <w:t xml:space="preserve">() i przechwytuje wyjście konsoli za pomocą </w:t>
+              <w:t>(</w:t>
+            </w:r>
+            <w:proofErr w:type="gramEnd"/>
+            <w:r>
+              <w:t xml:space="preserve">) i przechwytuje wyjście konsoli za pomocą </w:t>
             </w:r>
             <w:proofErr w:type="spellStart"/>
             <w:r>
@@ -5830,7 +6092,15 @@
               <w:cnfStyle w:val="000000100000" w:firstRow="0" w:lastRow="0" w:firstColumn="0" w:lastColumn="0" w:oddVBand="0" w:evenVBand="0" w:oddHBand="1" w:evenHBand="0" w:firstRowFirstColumn="0" w:firstRowLastColumn="0" w:lastRowFirstColumn="0" w:lastRowLastColumn="0"/>
             </w:pPr>
             <w:r>
-              <w:t xml:space="preserve">Generuje znaną liczbę zestawów (np. 5) i weryfikuje w wypisanym strumieniu wyjściowym, czy łączna suma wystąpień wszystkich liczb wynosi dokładnie </w:t>
+              <w:t xml:space="preserve">Generuje znaną liczbę zestawów (np. 5) i weryfikuje w wypisanym strumieniu </w:t>
+            </w:r>
+            <w:proofErr w:type="gramStart"/>
+            <w:r>
+              <w:t>wyjściowym,</w:t>
+            </w:r>
+            <w:proofErr w:type="gramEnd"/>
+            <w:r>
+              <w:t xml:space="preserve"> czy łączna suma wystąpień wszystkich liczb wynosi dokładnie </w:t>
             </w:r>
             <m:oMath>
               <m:r>
@@ -6545,7 +6815,23 @@
               <w:cnfStyle w:val="000000000000" w:firstRow="0" w:lastRow="0" w:firstColumn="0" w:lastColumn="0" w:oddVBand="0" w:evenVBand="0" w:oddHBand="0" w:evenHBand="0" w:firstRowFirstColumn="0" w:firstRowLastColumn="0" w:lastRowFirstColumn="0" w:lastRowLastColumn="0"/>
             </w:pPr>
             <w:r>
-              <w:t>Wyjście systemu zawiera dokładnie 3 linie z nagłówkami Losowanie 1:, Losowanie 2:, Losowanie 3: oraz pełną listę 49 statystyk. Test zdany.</w:t>
+              <w:t xml:space="preserve">Wyjście systemu zawiera dokładnie 3 linie z nagłówkami Losowanie </w:t>
+            </w:r>
+            <w:proofErr w:type="gramStart"/>
+            <w:r>
+              <w:t>1:,</w:t>
+            </w:r>
+            <w:proofErr w:type="gramEnd"/>
+            <w:r>
+              <w:t xml:space="preserve"> Losowanie </w:t>
+            </w:r>
+            <w:proofErr w:type="gramStart"/>
+            <w:r>
+              <w:t>2:,</w:t>
+            </w:r>
+            <w:proofErr w:type="gramEnd"/>
+            <w:r>
+              <w:t xml:space="preserve"> Losowanie 3: oraz pełną listę 49 statystyk. Test zdany.</w:t>
             </w:r>
           </w:p>
         </w:tc>
@@ -6906,6 +7192,9 @@
         <w:jc w:val="center"/>
       </w:pPr>
       <w:r>
+        <w:rPr>
+          <w:noProof/>
+        </w:rPr>
         <w:drawing>
           <wp:inline distT="0" distB="0" distL="0" distR="0" wp14:anchorId="367B6D2A" wp14:editId="0871E621">
             <wp:extent cx="4352544" cy="3354606"/>
@@ -6942,6 +7231,165 @@
           </wp:inline>
         </w:drawing>
       </w:r>
+    </w:p>
+    <w:p>
+      <w:pPr>
+        <w:jc w:val="center"/>
+      </w:pPr>
+    </w:p>
+    <w:p>
+      <w:pPr>
+        <w:pStyle w:val="Nagwek1"/>
+      </w:pPr>
+      <w:r>
+        <w:lastRenderedPageBreak/>
+        <w:t xml:space="preserve">Testy </w:t>
+      </w:r>
+      <w:r>
+        <w:t>akceptacyjne</w:t>
+      </w:r>
+    </w:p>
+    <w:p>
+      <w:pPr>
+        <w:ind w:firstLine="360"/>
+      </w:pPr>
+      <w:r>
+        <w:rPr>
+          <w:b/>
+          <w:bCs/>
+        </w:rPr>
+        <w:t>Czym są?</w:t>
+      </w:r>
+      <w:r>
+        <w:t xml:space="preserve"> - </w:t>
+      </w:r>
+      <w:r>
+        <w:t xml:space="preserve">Testy akceptacyjne (ang. </w:t>
+      </w:r>
+      <w:proofErr w:type="spellStart"/>
+      <w:r>
+        <w:rPr>
+          <w:i/>
+          <w:iCs/>
+        </w:rPr>
+        <w:t>acceptance</w:t>
+      </w:r>
+      <w:proofErr w:type="spellEnd"/>
+      <w:r>
+        <w:rPr>
+          <w:i/>
+          <w:iCs/>
+        </w:rPr>
+        <w:t xml:space="preserve"> </w:t>
+      </w:r>
+      <w:proofErr w:type="spellStart"/>
+      <w:r>
+        <w:rPr>
+          <w:i/>
+          <w:iCs/>
+        </w:rPr>
+        <w:t>tests</w:t>
+      </w:r>
+      <w:proofErr w:type="spellEnd"/>
+      <w:r>
+        <w:t xml:space="preserve">, np. UAT – </w:t>
+      </w:r>
+      <w:r>
+        <w:rPr>
+          <w:i/>
+          <w:iCs/>
+        </w:rPr>
+        <w:t xml:space="preserve">User </w:t>
+      </w:r>
+      <w:proofErr w:type="spellStart"/>
+      <w:r>
+        <w:rPr>
+          <w:i/>
+          <w:iCs/>
+        </w:rPr>
+        <w:t>Acceptance</w:t>
+      </w:r>
+      <w:proofErr w:type="spellEnd"/>
+      <w:r>
+        <w:rPr>
+          <w:i/>
+          <w:iCs/>
+        </w:rPr>
+        <w:t xml:space="preserve"> </w:t>
+      </w:r>
+      <w:proofErr w:type="spellStart"/>
+      <w:r>
+        <w:rPr>
+          <w:i/>
+          <w:iCs/>
+        </w:rPr>
+        <w:t>Testing</w:t>
+      </w:r>
+      <w:proofErr w:type="spellEnd"/>
+      <w:r>
+        <w:t>) to ostateczny etap weryfikacji oprogramowania. Ich celem nie jest szukanie drobnych błędów w kodzie, ale potwierdzenie, że aplikacja spełnia biznesowe potrzeby użytkowników, działa zgodnie z umową i jest gotowa do wdrożenia produkcyjnego.</w:t>
+      </w:r>
+    </w:p>
+    <w:p>
+      <w:pPr>
+        <w:ind w:firstLine="360"/>
+      </w:pPr>
+      <w:r>
+        <w:rPr>
+          <w:b/>
+          <w:bCs/>
+        </w:rPr>
+        <w:t>Kiedy je wykonujemy?</w:t>
+      </w:r>
+      <w:r>
+        <w:t xml:space="preserve"> – Wykonujemy je na samym końcu procesu wytwórczego, bezpośrednio przed wydaniem oprogramowania (lub po zakończeniu danej iteracji/sprintu). Są przeprowadzane głównie przez klienta, zamawiającego lub reprezentatywną grupę użytkowników końcowych.</w:t>
+      </w:r>
+    </w:p>
+    <w:p>
+      <w:pPr>
+        <w:pStyle w:val="Nagwek1"/>
+        <w:numPr>
+          <w:ilvl w:val="1"/>
+          <w:numId w:val="27"/>
+        </w:numPr>
+      </w:pPr>
+      <w:r>
+        <w:t>Implementacja programu</w:t>
+      </w:r>
+    </w:p>
+    <w:p>
+      <w:pPr>
+        <w:ind w:firstLine="360"/>
+      </w:pPr>
+      <w:r>
+        <w:t>Podobnie jak poprzednio</w:t>
+      </w:r>
+      <w:r>
+        <w:t>,</w:t>
+      </w:r>
+      <w:r>
+        <w:t xml:space="preserve"> ten rozdział będzie się opierać na programie opisanym w pierwszym punkcie. Szczegóły jego implementacji znajdują się w rozdziale 1.1. dokumentacji.</w:t>
+      </w:r>
+    </w:p>
+    <w:p>
+      <w:pPr>
+        <w:pStyle w:val="Nagwek1"/>
+        <w:numPr>
+          <w:ilvl w:val="1"/>
+          <w:numId w:val="27"/>
+        </w:numPr>
+      </w:pPr>
+      <w:r>
+        <w:t>Implementacja testów</w:t>
+      </w:r>
+    </w:p>
+    <w:p/>
+    <w:p/>
+    <w:p/>
+    <w:p>
+      <w:pPr>
+        <w:jc w:val="center"/>
+      </w:pPr>
     </w:p>
     <w:sectPr>
       <w:footerReference w:type="default" r:id="rId21"/>
@@ -10069,6 +10517,36 @@
     <w:abstractNumId w:val="15"/>
   </w:num>
   <w:num w:numId="29" w16cid:durableId="118650564">
+    <w:abstractNumId w:val="14"/>
+    <w:lvlOverride w:ilvl="0">
+      <w:startOverride w:val="1"/>
+    </w:lvlOverride>
+    <w:lvlOverride w:ilvl="1">
+      <w:startOverride w:val="1"/>
+    </w:lvlOverride>
+    <w:lvlOverride w:ilvl="2">
+      <w:startOverride w:val="1"/>
+    </w:lvlOverride>
+    <w:lvlOverride w:ilvl="3">
+      <w:startOverride w:val="1"/>
+    </w:lvlOverride>
+    <w:lvlOverride w:ilvl="4">
+      <w:startOverride w:val="1"/>
+    </w:lvlOverride>
+    <w:lvlOverride w:ilvl="5">
+      <w:startOverride w:val="1"/>
+    </w:lvlOverride>
+    <w:lvlOverride w:ilvl="6">
+      <w:startOverride w:val="1"/>
+    </w:lvlOverride>
+    <w:lvlOverride w:ilvl="7">
+      <w:startOverride w:val="1"/>
+    </w:lvlOverride>
+    <w:lvlOverride w:ilvl="8">
+      <w:startOverride w:val="1"/>
+    </w:lvlOverride>
+  </w:num>
+  <w:num w:numId="30" w16cid:durableId="1450665844">
     <w:abstractNumId w:val="14"/>
     <w:lvlOverride w:ilvl="0">
       <w:startOverride w:val="1"/>
@@ -10715,7 +11193,6 @@
   <w:style w:type="character" w:default="1" w:styleId="Domylnaczcionkaakapitu">
     <w:name w:val="Default Paragraph Font"/>
     <w:uiPriority w:val="1"/>
-    <w:semiHidden/>
     <w:unhideWhenUsed/>
   </w:style>
   <w:style w:type="table" w:default="1" w:styleId="Standardowy">

</xml_diff>

<commit_message>
Utworzenie trzeciego testu akceptacyjnego - sprawdzania obecności pełnego zestawienia statystyk dla wszystkich 49 liczb
</commit_message>
<xml_diff>
--- a/Testowanie aplikacji - Marcin_Migacz_5P2.docx
+++ b/Testowanie aplikacji - Marcin_Migacz_5P2.docx
@@ -7243,10 +7243,7 @@
       </w:pPr>
       <w:r>
         <w:lastRenderedPageBreak/>
-        <w:t xml:space="preserve">Testy </w:t>
-      </w:r>
-      <w:r>
-        <w:t>akceptacyjne</w:t>
+        <w:t>Testy akceptacyjne</w:t>
       </w:r>
     </w:p>
     <w:p>
@@ -7362,13 +7359,7 @@
         <w:ind w:firstLine="360"/>
       </w:pPr>
       <w:r>
-        <w:t>Podobnie jak poprzednio</w:t>
-      </w:r>
-      <w:r>
-        <w:t>,</w:t>
-      </w:r>
-      <w:r>
-        <w:t xml:space="preserve"> ten rozdział będzie się opierać na programie opisanym w pierwszym punkcie. Szczegóły jego implementacji znajdują się w rozdziale 1.1. dokumentacji.</w:t>
+        <w:t>Podobnie jak poprzednio, ten rozdział będzie się opierać na programie opisanym w pierwszym punkcie. Szczegóły jego implementacji znajdują się w rozdziale 1.1. dokumentacji.</w:t>
       </w:r>
     </w:p>
     <w:p>
@@ -7384,13 +7375,483 @@
       </w:r>
     </w:p>
     <w:p/>
+    <w:tbl>
+      <w:tblPr>
+        <w:tblStyle w:val="Zwykatabela1"/>
+        <w:tblW w:w="9924" w:type="dxa"/>
+        <w:tblLayout w:type="fixed"/>
+        <w:tblLook w:val="04A0" w:firstRow="1" w:lastRow="0" w:firstColumn="1" w:lastColumn="0" w:noHBand="0" w:noVBand="1"/>
+      </w:tblPr>
+      <w:tblGrid>
+        <w:gridCol w:w="284"/>
+        <w:gridCol w:w="1276"/>
+        <w:gridCol w:w="2552"/>
+        <w:gridCol w:w="2268"/>
+        <w:gridCol w:w="3544"/>
+      </w:tblGrid>
+      <w:tr>
+        <w:trPr>
+          <w:cnfStyle w:val="100000000000" w:firstRow="1" w:lastRow="0" w:firstColumn="0" w:lastColumn="0" w:oddVBand="0" w:evenVBand="0" w:oddHBand="0" w:evenHBand="0" w:firstRowFirstColumn="0" w:firstRowLastColumn="0" w:lastRowFirstColumn="0" w:lastRowLastColumn="0"/>
+          <w:trHeight w:val="454"/>
+        </w:trPr>
+        <w:tc>
+          <w:tcPr>
+            <w:cnfStyle w:val="001000000000" w:firstRow="0" w:lastRow="0" w:firstColumn="1" w:lastColumn="0" w:oddVBand="0" w:evenVBand="0" w:oddHBand="0" w:evenHBand="0" w:firstRowFirstColumn="0" w:firstRowLastColumn="0" w:lastRowFirstColumn="0" w:lastRowLastColumn="0"/>
+            <w:tcW w:w="284" w:type="dxa"/>
+            <w:hideMark/>
+          </w:tcPr>
+          <w:p>
+            <w:pPr>
+              <w:spacing w:after="160" w:line="278" w:lineRule="auto"/>
+            </w:pPr>
+            <w:r>
+              <w:t>#</w:t>
+            </w:r>
+          </w:p>
+        </w:tc>
+        <w:tc>
+          <w:tcPr>
+            <w:tcW w:w="1276" w:type="dxa"/>
+            <w:hideMark/>
+          </w:tcPr>
+          <w:p>
+            <w:pPr>
+              <w:spacing w:after="160" w:line="278" w:lineRule="auto"/>
+              <w:cnfStyle w:val="100000000000" w:firstRow="1" w:lastRow="0" w:firstColumn="0" w:lastColumn="0" w:oddVBand="0" w:evenVBand="0" w:oddHBand="0" w:evenHBand="0" w:firstRowFirstColumn="0" w:firstRowLastColumn="0" w:lastRowFirstColumn="0" w:lastRowLastColumn="0"/>
+            </w:pPr>
+            <w:r>
+              <w:t>Typ</w:t>
+            </w:r>
+          </w:p>
+        </w:tc>
+        <w:tc>
+          <w:tcPr>
+            <w:tcW w:w="2552" w:type="dxa"/>
+            <w:hideMark/>
+          </w:tcPr>
+          <w:p>
+            <w:pPr>
+              <w:spacing w:after="160" w:line="278" w:lineRule="auto"/>
+              <w:cnfStyle w:val="100000000000" w:firstRow="1" w:lastRow="0" w:firstColumn="0" w:lastColumn="0" w:oddVBand="0" w:evenVBand="0" w:oddHBand="0" w:evenHBand="0" w:firstRowFirstColumn="0" w:firstRowLastColumn="0" w:lastRowFirstColumn="0" w:lastRowLastColumn="0"/>
+            </w:pPr>
+            <w:r>
+              <w:t>Metoda testowa</w:t>
+            </w:r>
+          </w:p>
+        </w:tc>
+        <w:tc>
+          <w:tcPr>
+            <w:tcW w:w="2268" w:type="dxa"/>
+            <w:hideMark/>
+          </w:tcPr>
+          <w:p>
+            <w:pPr>
+              <w:spacing w:after="160" w:line="278" w:lineRule="auto"/>
+              <w:cnfStyle w:val="100000000000" w:firstRow="1" w:lastRow="0" w:firstColumn="0" w:lastColumn="0" w:oddVBand="0" w:evenVBand="0" w:oddHBand="0" w:evenHBand="0" w:firstRowFirstColumn="0" w:firstRowLastColumn="0" w:lastRowFirstColumn="0" w:lastRowLastColumn="0"/>
+            </w:pPr>
+            <w:r>
+              <w:t>Opis</w:t>
+            </w:r>
+          </w:p>
+        </w:tc>
+        <w:tc>
+          <w:tcPr>
+            <w:tcW w:w="3544" w:type="dxa"/>
+            <w:hideMark/>
+          </w:tcPr>
+          <w:p>
+            <w:pPr>
+              <w:spacing w:after="160" w:line="278" w:lineRule="auto"/>
+              <w:cnfStyle w:val="100000000000" w:firstRow="1" w:lastRow="0" w:firstColumn="0" w:lastColumn="0" w:oddVBand="0" w:evenVBand="0" w:oddHBand="0" w:evenHBand="0" w:firstRowFirstColumn="0" w:firstRowLastColumn="0" w:lastRowFirstColumn="0" w:lastRowLastColumn="0"/>
+            </w:pPr>
+            <w:r>
+              <w:t>Oczekiwany wynik</w:t>
+            </w:r>
+          </w:p>
+        </w:tc>
+      </w:tr>
+      <w:tr>
+        <w:trPr>
+          <w:cnfStyle w:val="000000100000" w:firstRow="0" w:lastRow="0" w:firstColumn="0" w:lastColumn="0" w:oddVBand="0" w:evenVBand="0" w:oddHBand="1" w:evenHBand="0" w:firstRowFirstColumn="0" w:firstRowLastColumn="0" w:lastRowFirstColumn="0" w:lastRowLastColumn="0"/>
+        </w:trPr>
+        <w:tc>
+          <w:tcPr>
+            <w:cnfStyle w:val="001000000000" w:firstRow="0" w:lastRow="0" w:firstColumn="1" w:lastColumn="0" w:oddVBand="0" w:evenVBand="0" w:oddHBand="0" w:evenHBand="0" w:firstRowFirstColumn="0" w:firstRowLastColumn="0" w:lastRowFirstColumn="0" w:lastRowLastColumn="0"/>
+            <w:tcW w:w="284" w:type="dxa"/>
+            <w:hideMark/>
+          </w:tcPr>
+          <w:p>
+            <w:pPr>
+              <w:spacing w:after="160" w:line="278" w:lineRule="auto"/>
+            </w:pPr>
+            <w:r>
+              <w:t>1</w:t>
+            </w:r>
+          </w:p>
+        </w:tc>
+        <w:tc>
+          <w:tcPr>
+            <w:tcW w:w="1276" w:type="dxa"/>
+            <w:hideMark/>
+          </w:tcPr>
+          <w:p>
+            <w:pPr>
+              <w:spacing w:after="160" w:line="278" w:lineRule="auto"/>
+              <w:cnfStyle w:val="000000100000" w:firstRow="0" w:lastRow="0" w:firstColumn="0" w:lastColumn="0" w:oddVBand="0" w:evenVBand="0" w:oddHBand="1" w:evenHBand="0" w:firstRowFirstColumn="0" w:firstRowLastColumn="0" w:lastRowFirstColumn="0" w:lastRowLastColumn="0"/>
+            </w:pPr>
+            <w:r>
+              <w:t>poprawny</w:t>
+            </w:r>
+          </w:p>
+        </w:tc>
+        <w:tc>
+          <w:tcPr>
+            <w:tcW w:w="2552" w:type="dxa"/>
+            <w:hideMark/>
+          </w:tcPr>
+          <w:p>
+            <w:pPr>
+              <w:spacing w:after="160" w:line="278" w:lineRule="auto"/>
+              <w:cnfStyle w:val="000000100000" w:firstRow="0" w:lastRow="0" w:firstColumn="0" w:lastColumn="0" w:oddVBand="0" w:evenVBand="0" w:oddHBand="1" w:evenHBand="0" w:firstRowFirstColumn="0" w:firstRowLastColumn="0" w:lastRowFirstColumn="0" w:lastRowLastColumn="0"/>
+            </w:pPr>
+            <w:r>
+              <w:t>Akceptacyjny_UzytkownikGenerujeZestawy_OtrzymujePrawidlowaLiczbeLosowan</w:t>
+            </w:r>
+          </w:p>
+        </w:tc>
+        <w:tc>
+          <w:tcPr>
+            <w:tcW w:w="2268" w:type="dxa"/>
+            <w:hideMark/>
+          </w:tcPr>
+          <w:p>
+            <w:pPr>
+              <w:spacing w:after="160" w:line="278" w:lineRule="auto"/>
+              <w:cnfStyle w:val="000000100000" w:firstRow="0" w:lastRow="0" w:firstColumn="0" w:lastColumn="0" w:oddVBand="0" w:evenVBand="0" w:oddHBand="1" w:evenHBand="0" w:firstRowFirstColumn="0" w:firstRowLastColumn="0" w:lastRowFirstColumn="0" w:lastRowLastColumn="0"/>
+            </w:pPr>
+            <w:r>
+              <w:t>Symuluje scenariusz, w którym użytkownik zamawia wygenerowanie 3 zestawów losowań.</w:t>
+            </w:r>
+          </w:p>
+        </w:tc>
+        <w:tc>
+          <w:tcPr>
+            <w:tcW w:w="3544" w:type="dxa"/>
+            <w:hideMark/>
+          </w:tcPr>
+          <w:p>
+            <w:pPr>
+              <w:spacing w:after="160" w:line="278" w:lineRule="auto"/>
+              <w:cnfStyle w:val="000000100000" w:firstRow="0" w:lastRow="0" w:firstColumn="0" w:lastColumn="0" w:oddVBand="0" w:evenVBand="0" w:oddHBand="1" w:evenHBand="0" w:firstRowFirstColumn="0" w:firstRowLastColumn="0" w:lastRowFirstColumn="0" w:lastRowLastColumn="0"/>
+            </w:pPr>
+            <w:r>
+              <w:t>Aplikacja generuje i wyświetla dokładnie 3 zestawy losowań z nagłówkami Losowanie</w:t>
+            </w:r>
+            <w:r>
+              <w:t xml:space="preserve"> </w:t>
+            </w:r>
+            <w:r>
+              <w:t>1</w:t>
+            </w:r>
+            <w:proofErr w:type="gramStart"/>
+            <w:r>
+              <w:t xml:space="preserve">: </w:t>
+            </w:r>
+            <w:r>
+              <w:t>,</w:t>
+            </w:r>
+            <w:proofErr w:type="gramEnd"/>
+            <w:r>
+              <w:t xml:space="preserve"> Losowanie 2</w:t>
+            </w:r>
+            <w:proofErr w:type="gramStart"/>
+            <w:r>
+              <w:t>:</w:t>
+            </w:r>
+            <w:r>
+              <w:t xml:space="preserve"> </w:t>
+            </w:r>
+            <w:r>
+              <w:t>,</w:t>
+            </w:r>
+            <w:proofErr w:type="gramEnd"/>
+            <w:r>
+              <w:t xml:space="preserve"> Losowanie 3</w:t>
+            </w:r>
+            <w:proofErr w:type="gramStart"/>
+            <w:r>
+              <w:t>:</w:t>
+            </w:r>
+            <w:r>
+              <w:t xml:space="preserve"> </w:t>
+            </w:r>
+            <w:r>
+              <w:t>.</w:t>
+            </w:r>
+            <w:proofErr w:type="gramEnd"/>
+            <w:r>
+              <w:t xml:space="preserve"> Test zdany.</w:t>
+            </w:r>
+          </w:p>
+        </w:tc>
+      </w:tr>
+      <w:tr>
+        <w:tc>
+          <w:tcPr>
+            <w:cnfStyle w:val="001000000000" w:firstRow="0" w:lastRow="0" w:firstColumn="1" w:lastColumn="0" w:oddVBand="0" w:evenVBand="0" w:oddHBand="0" w:evenHBand="0" w:firstRowFirstColumn="0" w:firstRowLastColumn="0" w:lastRowFirstColumn="0" w:lastRowLastColumn="0"/>
+            <w:tcW w:w="284" w:type="dxa"/>
+            <w:hideMark/>
+          </w:tcPr>
+          <w:p>
+            <w:pPr>
+              <w:spacing w:after="160" w:line="278" w:lineRule="auto"/>
+            </w:pPr>
+            <w:r>
+              <w:t>2</w:t>
+            </w:r>
+          </w:p>
+        </w:tc>
+        <w:tc>
+          <w:tcPr>
+            <w:tcW w:w="1276" w:type="dxa"/>
+            <w:hideMark/>
+          </w:tcPr>
+          <w:p>
+            <w:pPr>
+              <w:spacing w:after="160" w:line="278" w:lineRule="auto"/>
+              <w:cnfStyle w:val="000000000000" w:firstRow="0" w:lastRow="0" w:firstColumn="0" w:lastColumn="0" w:oddVBand="0" w:evenVBand="0" w:oddHBand="0" w:evenHBand="0" w:firstRowFirstColumn="0" w:firstRowLastColumn="0" w:lastRowFirstColumn="0" w:lastRowLastColumn="0"/>
+            </w:pPr>
+            <w:r>
+              <w:t>poprawny</w:t>
+            </w:r>
+          </w:p>
+        </w:tc>
+        <w:tc>
+          <w:tcPr>
+            <w:tcW w:w="2552" w:type="dxa"/>
+            <w:hideMark/>
+          </w:tcPr>
+          <w:p>
+            <w:pPr>
+              <w:spacing w:after="160" w:line="278" w:lineRule="auto"/>
+              <w:cnfStyle w:val="000000000000" w:firstRow="0" w:lastRow="0" w:firstColumn="0" w:lastColumn="0" w:oddVBand="0" w:evenVBand="0" w:oddHBand="0" w:evenHBand="0" w:firstRowFirstColumn="0" w:firstRowLastColumn="0" w:lastRowFirstColumn="0" w:lastRowLastColumn="0"/>
+            </w:pPr>
+            <w:proofErr w:type="spellStart"/>
+            <w:r>
+              <w:t>Akceptacyjny_ZestawyLiczb_KazdyZestawRoznyIUnikalneLiczby</w:t>
+            </w:r>
+            <w:proofErr w:type="spellEnd"/>
+          </w:p>
+        </w:tc>
+        <w:tc>
+          <w:tcPr>
+            <w:tcW w:w="2268" w:type="dxa"/>
+            <w:hideMark/>
+          </w:tcPr>
+          <w:p>
+            <w:pPr>
+              <w:spacing w:after="160" w:line="278" w:lineRule="auto"/>
+              <w:cnfStyle w:val="000000000000" w:firstRow="0" w:lastRow="0" w:firstColumn="0" w:lastColumn="0" w:oddVBand="0" w:evenVBand="0" w:oddHBand="0" w:evenHBand="0" w:firstRowFirstColumn="0" w:firstRowLastColumn="0" w:lastRowFirstColumn="0" w:lastRowLastColumn="0"/>
+            </w:pPr>
+            <w:r>
+              <w:t>Weryfikuje biznesowy wymóg loterii: każdy zestaw zawiera 6 unikalnych liczb.</w:t>
+            </w:r>
+          </w:p>
+        </w:tc>
+        <w:tc>
+          <w:tcPr>
+            <w:tcW w:w="3544" w:type="dxa"/>
+            <w:hideMark/>
+          </w:tcPr>
+          <w:p>
+            <w:pPr>
+              <w:spacing w:after="160" w:line="278" w:lineRule="auto"/>
+              <w:cnfStyle w:val="000000000000" w:firstRow="0" w:lastRow="0" w:firstColumn="0" w:lastColumn="0" w:oddVBand="0" w:evenVBand="0" w:oddHBand="0" w:evenHBand="0" w:firstRowFirstColumn="0" w:firstRowLastColumn="0" w:lastRowFirstColumn="0" w:lastRowLastColumn="0"/>
+            </w:pPr>
+            <w:r>
+              <w:t>Każdy wylosowany zestaw zawiera dokładnie 6 niepowtarzających się wartości. Test zdany.</w:t>
+            </w:r>
+          </w:p>
+        </w:tc>
+      </w:tr>
+      <w:tr>
+        <w:trPr>
+          <w:cnfStyle w:val="000000100000" w:firstRow="0" w:lastRow="0" w:firstColumn="0" w:lastColumn="0" w:oddVBand="0" w:evenVBand="0" w:oddHBand="1" w:evenHBand="0" w:firstRowFirstColumn="0" w:firstRowLastColumn="0" w:lastRowFirstColumn="0" w:lastRowLastColumn="0"/>
+        </w:trPr>
+        <w:tc>
+          <w:tcPr>
+            <w:cnfStyle w:val="001000000000" w:firstRow="0" w:lastRow="0" w:firstColumn="1" w:lastColumn="0" w:oddVBand="0" w:evenVBand="0" w:oddHBand="0" w:evenHBand="0" w:firstRowFirstColumn="0" w:firstRowLastColumn="0" w:lastRowFirstColumn="0" w:lastRowLastColumn="0"/>
+            <w:tcW w:w="284" w:type="dxa"/>
+          </w:tcPr>
+          <w:p>
+            <w:pPr>
+              <w:rPr>
+                <w:b w:val="0"/>
+                <w:bCs w:val="0"/>
+              </w:rPr>
+            </w:pPr>
+            <w:r>
+              <w:rPr>
+                <w:b w:val="0"/>
+                <w:bCs w:val="0"/>
+              </w:rPr>
+              <w:t>3</w:t>
+            </w:r>
+          </w:p>
+        </w:tc>
+        <w:tc>
+          <w:tcPr>
+            <w:tcW w:w="1276" w:type="dxa"/>
+          </w:tcPr>
+          <w:p>
+            <w:pPr>
+              <w:cnfStyle w:val="000000100000" w:firstRow="0" w:lastRow="0" w:firstColumn="0" w:lastColumn="0" w:oddVBand="0" w:evenVBand="0" w:oddHBand="1" w:evenHBand="0" w:firstRowFirstColumn="0" w:firstRowLastColumn="0" w:lastRowFirstColumn="0" w:lastRowLastColumn="0"/>
+            </w:pPr>
+            <w:r>
+              <w:t>poprawny</w:t>
+            </w:r>
+          </w:p>
+        </w:tc>
+        <w:tc>
+          <w:tcPr>
+            <w:tcW w:w="2552" w:type="dxa"/>
+          </w:tcPr>
+          <w:p>
+            <w:pPr>
+              <w:cnfStyle w:val="000000100000" w:firstRow="0" w:lastRow="0" w:firstColumn="0" w:lastColumn="0" w:oddVBand="0" w:evenVBand="0" w:oddHBand="1" w:evenHBand="0" w:firstRowFirstColumn="0" w:firstRowLastColumn="0" w:lastRowFirstColumn="0" w:lastRowLastColumn="0"/>
+            </w:pPr>
+            <w:r>
+              <w:t>Akceptacyjny_PodsumowanieWystapien_ZawieraWszystkieLiczbyOd1Do49</w:t>
+            </w:r>
+          </w:p>
+        </w:tc>
+        <w:tc>
+          <w:tcPr>
+            <w:tcW w:w="2268" w:type="dxa"/>
+          </w:tcPr>
+          <w:p>
+            <w:pPr>
+              <w:cnfStyle w:val="000000100000" w:firstRow="0" w:lastRow="0" w:firstColumn="0" w:lastColumn="0" w:oddVBand="0" w:evenVBand="0" w:oddHBand="1" w:evenHBand="0" w:firstRowFirstColumn="0" w:firstRowLastColumn="0" w:lastRowFirstColumn="0" w:lastRowLastColumn="0"/>
+            </w:pPr>
+            <w:r>
+              <w:t>Sprawdza, czy po wyświetleniu zestawów użytkownik otrzymuje pełne zestawienie statystyk dla wszystkich 49 liczb z zakresu loterii.</w:t>
+            </w:r>
+          </w:p>
+        </w:tc>
+        <w:tc>
+          <w:tcPr>
+            <w:tcW w:w="3544" w:type="dxa"/>
+          </w:tcPr>
+          <w:p>
+            <w:pPr>
+              <w:cnfStyle w:val="000000100000" w:firstRow="0" w:lastRow="0" w:firstColumn="0" w:lastColumn="0" w:oddVBand="0" w:evenVBand="0" w:oddHBand="1" w:evenHBand="0" w:firstRowFirstColumn="0" w:firstRowLastColumn="0" w:lastRowFirstColumn="0" w:lastRowLastColumn="0"/>
+            </w:pPr>
+            <w:r>
+              <w:t xml:space="preserve">Wynik zawiera kompletne statystyki od Wystąpienia liczby 1: do Wystąpienia liczby </w:t>
+            </w:r>
+            <w:proofErr w:type="gramStart"/>
+            <w:r>
+              <w:t>49:.</w:t>
+            </w:r>
+            <w:proofErr w:type="gramEnd"/>
+            <w:r>
+              <w:t xml:space="preserve"> Test zdany.</w:t>
+            </w:r>
+          </w:p>
+        </w:tc>
+      </w:tr>
+      <w:tr>
+        <w:tc>
+          <w:tcPr>
+            <w:cnfStyle w:val="001000000000" w:firstRow="0" w:lastRow="0" w:firstColumn="1" w:lastColumn="0" w:oddVBand="0" w:evenVBand="0" w:oddHBand="0" w:evenHBand="0" w:firstRowFirstColumn="0" w:firstRowLastColumn="0" w:lastRowFirstColumn="0" w:lastRowLastColumn="0"/>
+            <w:tcW w:w="284" w:type="dxa"/>
+          </w:tcPr>
+          <w:p>
+            <w:pPr>
+              <w:rPr>
+                <w:b w:val="0"/>
+                <w:bCs w:val="0"/>
+              </w:rPr>
+            </w:pPr>
+            <w:r>
+              <w:rPr>
+                <w:b w:val="0"/>
+                <w:bCs w:val="0"/>
+              </w:rPr>
+              <w:t>4</w:t>
+            </w:r>
+          </w:p>
+        </w:tc>
+        <w:tc>
+          <w:tcPr>
+            <w:tcW w:w="1276" w:type="dxa"/>
+          </w:tcPr>
+          <w:p>
+            <w:pPr>
+              <w:cnfStyle w:val="000000000000" w:firstRow="0" w:lastRow="0" w:firstColumn="0" w:lastColumn="0" w:oddVBand="0" w:evenVBand="0" w:oddHBand="0" w:evenHBand="0" w:firstRowFirstColumn="0" w:firstRowLastColumn="0" w:lastRowFirstColumn="0" w:lastRowLastColumn="0"/>
+            </w:pPr>
+          </w:p>
+        </w:tc>
+        <w:tc>
+          <w:tcPr>
+            <w:tcW w:w="2552" w:type="dxa"/>
+          </w:tcPr>
+          <w:p>
+            <w:pPr>
+              <w:cnfStyle w:val="000000000000" w:firstRow="0" w:lastRow="0" w:firstColumn="0" w:lastColumn="0" w:oddVBand="0" w:evenVBand="0" w:oddHBand="0" w:evenHBand="0" w:firstRowFirstColumn="0" w:firstRowLastColumn="0" w:lastRowFirstColumn="0" w:lastRowLastColumn="0"/>
+            </w:pPr>
+          </w:p>
+        </w:tc>
+        <w:tc>
+          <w:tcPr>
+            <w:tcW w:w="2268" w:type="dxa"/>
+          </w:tcPr>
+          <w:p>
+            <w:pPr>
+              <w:cnfStyle w:val="000000000000" w:firstRow="0" w:lastRow="0" w:firstColumn="0" w:lastColumn="0" w:oddVBand="0" w:evenVBand="0" w:oddHBand="0" w:evenHBand="0" w:firstRowFirstColumn="0" w:firstRowLastColumn="0" w:lastRowFirstColumn="0" w:lastRowLastColumn="0"/>
+            </w:pPr>
+          </w:p>
+        </w:tc>
+        <w:tc>
+          <w:tcPr>
+            <w:tcW w:w="3544" w:type="dxa"/>
+          </w:tcPr>
+          <w:p>
+            <w:pPr>
+              <w:cnfStyle w:val="000000000000" w:firstRow="0" w:lastRow="0" w:firstColumn="0" w:lastColumn="0" w:oddVBand="0" w:evenVBand="0" w:oddHBand="0" w:evenHBand="0" w:firstRowFirstColumn="0" w:firstRowLastColumn="0" w:lastRowFirstColumn="0" w:lastRowLastColumn="0"/>
+            </w:pPr>
+          </w:p>
+        </w:tc>
+      </w:tr>
+    </w:tbl>
     <w:p/>
     <w:p/>
-    <w:p>
-      <w:pPr>
-        <w:jc w:val="center"/>
-      </w:pPr>
-    </w:p>
+    <w:p/>
+    <w:p/>
+    <w:p/>
+    <w:p/>
+    <w:p/>
+    <w:p>
+      <w:pPr>
+        <w:pStyle w:val="Nagwek1"/>
+        <w:numPr>
+          <w:ilvl w:val="1"/>
+          <w:numId w:val="27"/>
+        </w:numPr>
+      </w:pPr>
+      <w:r>
+        <w:t>GIT</w:t>
+      </w:r>
+    </w:p>
+    <w:p>
+      <w:r>
+        <w:t>Screen z git log commitów wprowadzających przypadki testowe</w:t>
+      </w:r>
+      <w:r>
+        <w:t>:</w:t>
+      </w:r>
+    </w:p>
+    <w:p/>
     <w:sectPr>
       <w:footerReference w:type="default" r:id="rId21"/>
       <w:pgSz w:w="11906" w:h="16838"/>

</xml_diff>

<commit_message>
Utworzenie czwartego testu akceptacyjnego - sprawdzania przyjaznej obsługi błędów wejściowych wprowadzonych przez użytkownika
</commit_message>
<xml_diff>
--- a/Testowanie aplikacji - Marcin_Migacz_5P2.docx
+++ b/Testowanie aplikacji - Marcin_Migacz_5P2.docx
@@ -283,20 +283,8 @@
           <w:sz w:val="28"/>
           <w:szCs w:val="28"/>
         </w:rPr>
-        <w:t xml:space="preserve">NOWY SĄCZ </w:t>
-      </w:r>
-      <w:proofErr w:type="gramStart"/>
-      <w:r>
-        <w:rPr>
-          <w:rFonts w:asciiTheme="majorHAnsi" w:hAnsiTheme="majorHAnsi"/>
-          <w:b/>
-          <w:bCs/>
-          <w:sz w:val="28"/>
-          <w:szCs w:val="28"/>
-        </w:rPr>
-        <w:t>2026r.</w:t>
-      </w:r>
-      <w:proofErr w:type="gramEnd"/>
+        <w:t>NOWY SĄCZ 2026r.</w:t>
+      </w:r>
     </w:p>
     <w:p>
       <w:pPr>
@@ -1628,15 +1616,7 @@
         <w:ind w:firstLine="360"/>
       </w:pPr>
       <w:r>
-        <w:t xml:space="preserve">Testowanie oprogramowania to proces </w:t>
-      </w:r>
-      <w:proofErr w:type="gramStart"/>
-      <w:r>
-        <w:t>sprawdzania,</w:t>
-      </w:r>
-      <w:proofErr w:type="gramEnd"/>
-      <w:r>
-        <w:t xml:space="preserve"> czy program działa zgodnie z wymaganiami oraz wykrywania w nim błędów przed przekazaniem go użytkownikom. Błąd (defekt) to wada w kodzie, która może doprowadzić do awarii, czyli widocznego niepoprawnego działania systemu. </w:t>
+        <w:t xml:space="preserve">Testowanie oprogramowania to proces sprawdzania, czy program działa zgodnie z wymaganiami oraz wykrywania w nim błędów przed przekazaniem go użytkownikom. Błąd (defekt) to wada w kodzie, która może doprowadzić do awarii, czyli widocznego niepoprawnego działania systemu. </w:t>
       </w:r>
     </w:p>
     <w:p>
@@ -2376,7 +2356,6 @@
         </w:rPr>
       </w:pPr>
       <w:proofErr w:type="spellStart"/>
-      <w:proofErr w:type="gramStart"/>
       <w:r>
         <w:rPr>
           <w:rFonts w:asciiTheme="majorHAnsi" w:hAnsiTheme="majorHAnsi"/>
@@ -2388,7 +2367,6 @@
         <w:t>int.TryParse</w:t>
       </w:r>
       <w:proofErr w:type="spellEnd"/>
-      <w:proofErr w:type="gramEnd"/>
       <w:r>
         <w:rPr>
           <w:rFonts w:asciiTheme="majorHAnsi" w:hAnsiTheme="majorHAnsi"/>
@@ -2444,7 +2422,6 @@
         <w:t xml:space="preserve"> </w:t>
       </w:r>
       <w:proofErr w:type="spellStart"/>
-      <w:proofErr w:type="gramStart"/>
       <w:r>
         <w:rPr>
           <w:rFonts w:asciiTheme="majorHAnsi" w:hAnsiTheme="majorHAnsi"/>
@@ -2479,15 +2456,7 @@
           <w:rFonts w:asciiTheme="majorHAnsi" w:hAnsiTheme="majorHAnsi"/>
           <w:szCs w:val="22"/>
         </w:rPr>
-        <w:t xml:space="preserve"> -</w:t>
-      </w:r>
-      <w:proofErr w:type="gramEnd"/>
-      <w:r>
-        <w:rPr>
-          <w:rFonts w:asciiTheme="majorHAnsi" w:hAnsiTheme="majorHAnsi"/>
-          <w:szCs w:val="22"/>
-        </w:rPr>
-        <w:t xml:space="preserve"> wczytuje tekst z klawiatury i próbuje zamienić go na liczbę całkowitą. Jeśli się uda, zwraca </w:t>
+        <w:t xml:space="preserve"> - wczytuje tekst z klawiatury i próbuje zamienić go na liczbę całkowitą. Jeśli się uda, zwraca </w:t>
       </w:r>
       <w:proofErr w:type="spellStart"/>
       <w:r>
@@ -2608,7 +2577,6 @@
         <w:t xml:space="preserve"> </w:t>
       </w:r>
       <w:proofErr w:type="spellStart"/>
-      <w:proofErr w:type="gramStart"/>
       <w:r>
         <w:rPr>
           <w:rFonts w:asciiTheme="majorHAnsi" w:hAnsiTheme="majorHAnsi"/>
@@ -2631,7 +2599,6 @@
         <w:t>[</w:t>
       </w:r>
       <w:proofErr w:type="spellStart"/>
-      <w:proofErr w:type="gramEnd"/>
       <w:r>
         <w:rPr>
           <w:rFonts w:asciiTheme="majorHAnsi" w:hAnsiTheme="majorHAnsi"/>
@@ -2708,26 +2675,9 @@
           <w:rFonts w:asciiTheme="majorHAnsi" w:hAnsiTheme="majorHAnsi"/>
           <w:szCs w:val="22"/>
         </w:rPr>
-        <w:t>Pętla zewnętrzna for (</w:t>
-      </w:r>
-      <w:proofErr w:type="gramStart"/>
-      <w:r>
-        <w:rPr>
-          <w:rFonts w:asciiTheme="majorHAnsi" w:hAnsiTheme="majorHAnsi"/>
-          <w:szCs w:val="22"/>
-        </w:rPr>
-        <w:t>i...</w:t>
-      </w:r>
-      <w:proofErr w:type="gramEnd"/>
-      <w:r>
-        <w:rPr>
-          <w:rFonts w:asciiTheme="majorHAnsi" w:hAnsiTheme="majorHAnsi"/>
-          <w:szCs w:val="22"/>
-        </w:rPr>
-        <w:t xml:space="preserve">) wykonuje się raz dla każdego zestawu. W każdym obiegu wywołuje </w:t>
+        <w:t xml:space="preserve">Pętla zewnętrzna for (i...) wykonuje się raz dla każdego zestawu. W każdym obiegu wywołuje </w:t>
       </w:r>
       <w:proofErr w:type="spellStart"/>
-      <w:proofErr w:type="gramStart"/>
       <w:r>
         <w:rPr>
           <w:rFonts w:asciiTheme="majorHAnsi" w:hAnsiTheme="majorHAnsi"/>
@@ -2741,15 +2691,7 @@
           <w:rFonts w:asciiTheme="majorHAnsi" w:hAnsiTheme="majorHAnsi"/>
           <w:szCs w:val="22"/>
         </w:rPr>
-        <w:t>(</w:t>
-      </w:r>
-      <w:proofErr w:type="gramEnd"/>
-      <w:r>
-        <w:rPr>
-          <w:rFonts w:asciiTheme="majorHAnsi" w:hAnsiTheme="majorHAnsi"/>
-          <w:szCs w:val="22"/>
-        </w:rPr>
-        <w:t>), która zwraca 6-elementową tablicę.</w:t>
+        <w:t>(), która zwraca 6-elementową tablicę.</w:t>
       </w:r>
     </w:p>
     <w:p>
@@ -2769,23 +2711,7 @@
           <w:rFonts w:asciiTheme="majorHAnsi" w:hAnsiTheme="majorHAnsi"/>
           <w:szCs w:val="22"/>
         </w:rPr>
-        <w:t>Pętla wewnętrzna for (</w:t>
-      </w:r>
-      <w:proofErr w:type="gramStart"/>
-      <w:r>
-        <w:rPr>
-          <w:rFonts w:asciiTheme="majorHAnsi" w:hAnsiTheme="majorHAnsi"/>
-          <w:szCs w:val="22"/>
-        </w:rPr>
-        <w:t>j...</w:t>
-      </w:r>
-      <w:proofErr w:type="gramEnd"/>
-      <w:r>
-        <w:rPr>
-          <w:rFonts w:asciiTheme="majorHAnsi" w:hAnsiTheme="majorHAnsi"/>
-          <w:szCs w:val="22"/>
-        </w:rPr>
-        <w:t>) przepisuje 6 wylosowanych liczb do wiersza i tablicy losowania.</w:t>
+        <w:t>Pętla wewnętrzna for (j...) przepisuje 6 wylosowanych liczb do wiersza i tablicy losowania.</w:t>
       </w:r>
     </w:p>
     <w:p>
@@ -2801,7 +2727,6 @@
         </w:rPr>
       </w:pPr>
       <w:proofErr w:type="spellStart"/>
-      <w:proofErr w:type="gramStart"/>
       <w:r>
         <w:rPr>
           <w:rFonts w:asciiTheme="majorHAnsi" w:hAnsiTheme="majorHAnsi"/>
@@ -2824,7 +2749,6 @@
         <w:t>(</w:t>
       </w:r>
       <w:proofErr w:type="spellStart"/>
-      <w:proofErr w:type="gramEnd"/>
       <w:r>
         <w:rPr>
           <w:rFonts w:asciiTheme="majorHAnsi" w:hAnsiTheme="majorHAnsi"/>
@@ -2961,7 +2885,6 @@
         <w:t xml:space="preserve">Funkcja </w:t>
       </w:r>
       <w:proofErr w:type="spellStart"/>
-      <w:proofErr w:type="gramStart"/>
       <w:r>
         <w:rPr>
           <w:rFonts w:asciiTheme="majorHAnsi" w:hAnsiTheme="majorHAnsi"/>
@@ -2979,23 +2902,13 @@
           <w:bCs/>
           <w:color w:val="BF4E14" w:themeColor="accent2" w:themeShade="BF"/>
         </w:rPr>
-        <w:t>(</w:t>
-      </w:r>
-      <w:proofErr w:type="gramEnd"/>
-      <w:r>
-        <w:rPr>
-          <w:rFonts w:asciiTheme="majorHAnsi" w:hAnsiTheme="majorHAnsi"/>
-          <w:b/>
-          <w:bCs/>
+        <w:t>()</w:t>
+      </w:r>
+      <w:r>
+        <w:rPr>
+          <w:rFonts w:asciiTheme="majorHAnsi" w:hAnsiTheme="majorHAnsi"/>
           <w:color w:val="BF4E14" w:themeColor="accent2" w:themeShade="BF"/>
         </w:rPr>
-        <w:t>)</w:t>
-      </w:r>
-      <w:r>
-        <w:rPr>
-          <w:rFonts w:asciiTheme="majorHAnsi" w:hAnsiTheme="majorHAnsi"/>
-          <w:color w:val="BF4E14" w:themeColor="accent2" w:themeShade="BF"/>
-        </w:rPr>
         <w:t xml:space="preserve"> </w:t>
       </w:r>
       <w:r>
@@ -3012,7 +2925,6 @@
         <w:t xml:space="preserve">losuje jeden zestaw 6 różnych liczb z przedziału 1–49. Nie przyjmuje argumentów i zwraca tablicę </w:t>
       </w:r>
       <w:proofErr w:type="spellStart"/>
-      <w:proofErr w:type="gramStart"/>
       <w:r>
         <w:rPr>
           <w:rFonts w:asciiTheme="majorHAnsi" w:hAnsiTheme="majorHAnsi"/>
@@ -3026,15 +2938,7 @@
           <w:rFonts w:asciiTheme="majorHAnsi" w:hAnsiTheme="majorHAnsi"/>
           <w:lang w:eastAsia="pl-PL"/>
         </w:rPr>
-        <w:t>[</w:t>
-      </w:r>
-      <w:proofErr w:type="gramEnd"/>
-      <w:r>
-        <w:rPr>
-          <w:rFonts w:asciiTheme="majorHAnsi" w:hAnsiTheme="majorHAnsi"/>
-          <w:lang w:eastAsia="pl-PL"/>
-        </w:rPr>
-        <w:t>] z wylosowanymi liczbami.</w:t>
+        <w:t>[] z wylosowanymi liczbami.</w:t>
       </w:r>
     </w:p>
     <w:p>
@@ -3051,7 +2955,6 @@
         </w:rPr>
       </w:pPr>
       <w:proofErr w:type="spellStart"/>
-      <w:proofErr w:type="gramStart"/>
       <w:r>
         <w:rPr>
           <w:rFonts w:asciiTheme="majorHAnsi" w:hAnsiTheme="majorHAnsi"/>
@@ -3073,9 +2976,57 @@
           <w:szCs w:val="22"/>
           <w:lang w:eastAsia="pl-PL"/>
         </w:rPr>
+        <w:t xml:space="preserve">[] zestaw = </w:t>
+      </w:r>
+      <w:proofErr w:type="spellStart"/>
+      <w:r>
+        <w:rPr>
+          <w:rFonts w:asciiTheme="majorHAnsi" w:hAnsiTheme="majorHAnsi"/>
+          <w:b/>
+          <w:bCs/>
+          <w:color w:val="BF4E14" w:themeColor="accent2" w:themeShade="BF"/>
+          <w:szCs w:val="22"/>
+          <w:lang w:eastAsia="pl-PL"/>
+        </w:rPr>
+        <w:t>new</w:t>
+      </w:r>
+      <w:proofErr w:type="spellEnd"/>
+      <w:r>
+        <w:rPr>
+          <w:rFonts w:asciiTheme="majorHAnsi" w:hAnsiTheme="majorHAnsi"/>
+          <w:b/>
+          <w:bCs/>
+          <w:color w:val="BF4E14" w:themeColor="accent2" w:themeShade="BF"/>
+          <w:szCs w:val="22"/>
+          <w:lang w:eastAsia="pl-PL"/>
+        </w:rPr>
+        <w:t xml:space="preserve"> </w:t>
+      </w:r>
+      <w:proofErr w:type="spellStart"/>
+      <w:r>
+        <w:rPr>
+          <w:rFonts w:asciiTheme="majorHAnsi" w:hAnsiTheme="majorHAnsi"/>
+          <w:b/>
+          <w:bCs/>
+          <w:color w:val="BF4E14" w:themeColor="accent2" w:themeShade="BF"/>
+          <w:szCs w:val="22"/>
+          <w:lang w:eastAsia="pl-PL"/>
+        </w:rPr>
+        <w:t>int</w:t>
+      </w:r>
+      <w:proofErr w:type="spellEnd"/>
+      <w:r>
+        <w:rPr>
+          <w:rFonts w:asciiTheme="majorHAnsi" w:hAnsiTheme="majorHAnsi"/>
+          <w:b/>
+          <w:bCs/>
+          <w:color w:val="BF4E14" w:themeColor="accent2" w:themeShade="BF"/>
+          <w:szCs w:val="22"/>
+          <w:lang w:eastAsia="pl-PL"/>
+        </w:rPr>
         <w:t>[</w:t>
       </w:r>
-      <w:proofErr w:type="gramEnd"/>
+      <w:proofErr w:type="spellStart"/>
       <w:r>
         <w:rPr>
           <w:rFonts w:asciiTheme="majorHAnsi" w:hAnsiTheme="majorHAnsi"/>
@@ -3085,9 +3036,9 @@
           <w:szCs w:val="22"/>
           <w:lang w:eastAsia="pl-PL"/>
         </w:rPr>
-        <w:t xml:space="preserve">] zestaw = </w:t>
-      </w:r>
-      <w:proofErr w:type="spellStart"/>
+        <w:t>LiczbWZestawie</w:t>
+      </w:r>
+      <w:proofErr w:type="spellEnd"/>
       <w:r>
         <w:rPr>
           <w:rFonts w:asciiTheme="majorHAnsi" w:hAnsiTheme="majorHAnsi"/>
@@ -3097,103 +3048,33 @@
           <w:szCs w:val="22"/>
           <w:lang w:eastAsia="pl-PL"/>
         </w:rPr>
-        <w:t>new</w:t>
-      </w:r>
-      <w:proofErr w:type="spellEnd"/>
-      <w:r>
-        <w:rPr>
-          <w:rFonts w:asciiTheme="majorHAnsi" w:hAnsiTheme="majorHAnsi"/>
-          <w:b/>
-          <w:bCs/>
+        <w:t>]</w:t>
+      </w:r>
+      <w:r>
+        <w:rPr>
+          <w:rFonts w:asciiTheme="majorHAnsi" w:hAnsiTheme="majorHAnsi"/>
           <w:color w:val="BF4E14" w:themeColor="accent2" w:themeShade="BF"/>
           <w:szCs w:val="22"/>
           <w:lang w:eastAsia="pl-PL"/>
         </w:rPr>
         <w:t xml:space="preserve"> </w:t>
       </w:r>
-      <w:proofErr w:type="spellStart"/>
-      <w:proofErr w:type="gramStart"/>
-      <w:r>
-        <w:rPr>
-          <w:rFonts w:asciiTheme="majorHAnsi" w:hAnsiTheme="majorHAnsi"/>
-          <w:b/>
-          <w:bCs/>
+      <w:r>
+        <w:rPr>
+          <w:rFonts w:asciiTheme="majorHAnsi" w:hAnsiTheme="majorHAnsi"/>
           <w:color w:val="BF4E14" w:themeColor="accent2" w:themeShade="BF"/>
           <w:szCs w:val="22"/>
           <w:lang w:eastAsia="pl-PL"/>
         </w:rPr>
-        <w:t>int</w:t>
-      </w:r>
-      <w:proofErr w:type="spellEnd"/>
-      <w:r>
-        <w:rPr>
-          <w:rFonts w:asciiTheme="majorHAnsi" w:hAnsiTheme="majorHAnsi"/>
-          <w:b/>
-          <w:bCs/>
-          <w:color w:val="BF4E14" w:themeColor="accent2" w:themeShade="BF"/>
+        <w:t xml:space="preserve"> </w:t>
+      </w:r>
+      <w:r>
+        <w:rPr>
+          <w:rFonts w:asciiTheme="majorHAnsi" w:hAnsiTheme="majorHAnsi"/>
           <w:szCs w:val="22"/>
           <w:lang w:eastAsia="pl-PL"/>
         </w:rPr>
-        <w:t>[</w:t>
-      </w:r>
-      <w:proofErr w:type="spellStart"/>
-      <w:r>
-        <w:rPr>
-          <w:rFonts w:asciiTheme="majorHAnsi" w:hAnsiTheme="majorHAnsi"/>
-          <w:b/>
-          <w:bCs/>
-          <w:color w:val="BF4E14" w:themeColor="accent2" w:themeShade="BF"/>
-          <w:szCs w:val="22"/>
-          <w:lang w:eastAsia="pl-PL"/>
-        </w:rPr>
-        <w:t>LiczbWZestawie</w:t>
-      </w:r>
-      <w:proofErr w:type="spellEnd"/>
-      <w:r>
-        <w:rPr>
-          <w:rFonts w:asciiTheme="majorHAnsi" w:hAnsiTheme="majorHAnsi"/>
-          <w:b/>
-          <w:bCs/>
-          <w:color w:val="BF4E14" w:themeColor="accent2" w:themeShade="BF"/>
-          <w:szCs w:val="22"/>
-          <w:lang w:eastAsia="pl-PL"/>
-        </w:rPr>
-        <w:t>]</w:t>
-      </w:r>
-      <w:r>
-        <w:rPr>
-          <w:rFonts w:asciiTheme="majorHAnsi" w:hAnsiTheme="majorHAnsi"/>
-          <w:color w:val="BF4E14" w:themeColor="accent2" w:themeShade="BF"/>
-          <w:szCs w:val="22"/>
-          <w:lang w:eastAsia="pl-PL"/>
-        </w:rPr>
-        <w:t xml:space="preserve"> </w:t>
-      </w:r>
-      <w:r>
-        <w:rPr>
-          <w:rFonts w:asciiTheme="majorHAnsi" w:hAnsiTheme="majorHAnsi"/>
-          <w:color w:val="BF4E14" w:themeColor="accent2" w:themeShade="BF"/>
-          <w:szCs w:val="22"/>
-          <w:lang w:eastAsia="pl-PL"/>
-        </w:rPr>
-        <w:t xml:space="preserve"> </w:t>
-      </w:r>
-      <w:r>
-        <w:rPr>
-          <w:rFonts w:asciiTheme="majorHAnsi" w:hAnsiTheme="majorHAnsi"/>
-          <w:szCs w:val="22"/>
-          <w:lang w:eastAsia="pl-PL"/>
-        </w:rPr>
-        <w:t>-</w:t>
-      </w:r>
-      <w:proofErr w:type="gramEnd"/>
-      <w:r>
-        <w:rPr>
-          <w:rFonts w:asciiTheme="majorHAnsi" w:hAnsiTheme="majorHAnsi"/>
-          <w:szCs w:val="22"/>
-          <w:lang w:eastAsia="pl-PL"/>
-        </w:rPr>
-        <w:t xml:space="preserve"> t</w:t>
+        <w:t>- t</w:t>
       </w:r>
       <w:r>
         <w:rPr>
@@ -3266,7 +3147,6 @@
         <w:t xml:space="preserve"> </w:t>
       </w:r>
       <w:proofErr w:type="spellStart"/>
-      <w:proofErr w:type="gramStart"/>
       <w:r>
         <w:rPr>
           <w:rFonts w:asciiTheme="majorHAnsi" w:hAnsiTheme="majorHAnsi"/>
@@ -3288,19 +3168,7 @@
           <w:szCs w:val="22"/>
           <w:lang w:eastAsia="pl-PL"/>
         </w:rPr>
-        <w:t>(</w:t>
-      </w:r>
-      <w:proofErr w:type="gramEnd"/>
-      <w:r>
-        <w:rPr>
-          <w:rFonts w:asciiTheme="majorHAnsi" w:hAnsiTheme="majorHAnsi"/>
-          <w:b/>
-          <w:bCs/>
-          <w:color w:val="BF4E14" w:themeColor="accent2" w:themeShade="BF"/>
-          <w:szCs w:val="22"/>
-          <w:lang w:eastAsia="pl-PL"/>
-        </w:rPr>
-        <w:t>)</w:t>
+        <w:t>()</w:t>
       </w:r>
       <w:r>
         <w:rPr>
@@ -3483,7 +3351,6 @@
         </w:rPr>
       </w:pPr>
       <w:proofErr w:type="spellStart"/>
-      <w:proofErr w:type="gramStart"/>
       <w:r>
         <w:rPr>
           <w:rFonts w:asciiTheme="majorHAnsi" w:hAnsiTheme="majorHAnsi"/>
@@ -3496,7 +3363,6 @@
         <w:t>generator.Next</w:t>
       </w:r>
       <w:proofErr w:type="spellEnd"/>
-      <w:proofErr w:type="gramEnd"/>
       <w:r>
         <w:rPr>
           <w:rFonts w:asciiTheme="majorHAnsi" w:hAnsiTheme="majorHAnsi"/>
@@ -3622,7 +3488,6 @@
         </w:rPr>
       </w:pPr>
       <w:proofErr w:type="spellStart"/>
-      <w:proofErr w:type="gramStart"/>
       <w:r>
         <w:rPr>
           <w:rFonts w:asciiTheme="majorHAnsi" w:hAnsiTheme="majorHAnsi"/>
@@ -3635,7 +3500,6 @@
         <w:t>zestaw.Contains</w:t>
       </w:r>
       <w:proofErr w:type="spellEnd"/>
-      <w:proofErr w:type="gramEnd"/>
       <w:r>
         <w:rPr>
           <w:rFonts w:asciiTheme="majorHAnsi" w:hAnsiTheme="majorHAnsi"/>
@@ -3719,25 +3583,7 @@
           <w:szCs w:val="22"/>
           <w:lang w:eastAsia="pl-PL"/>
         </w:rPr>
-        <w:t xml:space="preserve">jeśli nie, liczba zostaje zapisana pod indeksem </w:t>
-      </w:r>
-      <w:proofErr w:type="gramStart"/>
-      <w:r>
-        <w:rPr>
-          <w:rFonts w:asciiTheme="majorHAnsi" w:hAnsiTheme="majorHAnsi"/>
-          <w:szCs w:val="22"/>
-          <w:lang w:eastAsia="pl-PL"/>
-        </w:rPr>
-        <w:t>i,</w:t>
-      </w:r>
-      <w:proofErr w:type="gramEnd"/>
-      <w:r>
-        <w:rPr>
-          <w:rFonts w:asciiTheme="majorHAnsi" w:hAnsiTheme="majorHAnsi"/>
-          <w:szCs w:val="22"/>
-          <w:lang w:eastAsia="pl-PL"/>
-        </w:rPr>
-        <w:t xml:space="preserve"> a następnie i++ przesuwa licznik.</w:t>
+        <w:t>jeśli nie, liczba zostaje zapisana pod indeksem i, a następnie i++ przesuwa licznik.</w:t>
       </w:r>
     </w:p>
     <w:p>
@@ -3814,7 +3660,6 @@
         <w:t xml:space="preserve">Funkcja </w:t>
       </w:r>
       <w:proofErr w:type="spellStart"/>
-      <w:proofErr w:type="gramStart"/>
       <w:r>
         <w:rPr>
           <w:rFonts w:asciiTheme="majorHAnsi" w:hAnsiTheme="majorHAnsi"/>
@@ -3832,17 +3677,7 @@
           <w:bCs/>
           <w:color w:val="BF4E14" w:themeColor="accent2" w:themeShade="BF"/>
         </w:rPr>
-        <w:t>(</w:t>
-      </w:r>
-      <w:proofErr w:type="gramEnd"/>
-      <w:r>
-        <w:rPr>
-          <w:rFonts w:asciiTheme="majorHAnsi" w:hAnsiTheme="majorHAnsi"/>
-          <w:b/>
-          <w:bCs/>
-          <w:color w:val="BF4E14" w:themeColor="accent2" w:themeShade="BF"/>
-        </w:rPr>
-        <w:t>)</w:t>
+        <w:t>()</w:t>
       </w:r>
       <w:r>
         <w:rPr>
@@ -3884,7 +3719,6 @@
         </w:rPr>
       </w:pPr>
       <w:proofErr w:type="spellStart"/>
-      <w:proofErr w:type="gramStart"/>
       <w:r>
         <w:rPr>
           <w:rFonts w:asciiTheme="majorHAnsi" w:hAnsiTheme="majorHAnsi"/>
@@ -3904,88 +3738,75 @@
           <w:color w:val="BF4E14" w:themeColor="accent2" w:themeShade="BF"/>
           <w:szCs w:val="22"/>
         </w:rPr>
+        <w:t xml:space="preserve">[] </w:t>
+      </w:r>
+      <w:proofErr w:type="spellStart"/>
+      <w:r>
+        <w:rPr>
+          <w:rFonts w:asciiTheme="majorHAnsi" w:hAnsiTheme="majorHAnsi"/>
+          <w:b/>
+          <w:bCs/>
+          <w:color w:val="BF4E14" w:themeColor="accent2" w:themeShade="BF"/>
+          <w:szCs w:val="22"/>
+        </w:rPr>
+        <w:t>wystapienia</w:t>
+      </w:r>
+      <w:proofErr w:type="spellEnd"/>
+      <w:r>
+        <w:rPr>
+          <w:rFonts w:asciiTheme="majorHAnsi" w:hAnsiTheme="majorHAnsi"/>
+          <w:b/>
+          <w:bCs/>
+          <w:color w:val="BF4E14" w:themeColor="accent2" w:themeShade="BF"/>
+          <w:szCs w:val="22"/>
+        </w:rPr>
+        <w:t xml:space="preserve"> = </w:t>
+      </w:r>
+      <w:proofErr w:type="spellStart"/>
+      <w:r>
+        <w:rPr>
+          <w:rFonts w:asciiTheme="majorHAnsi" w:hAnsiTheme="majorHAnsi"/>
+          <w:b/>
+          <w:bCs/>
+          <w:color w:val="BF4E14" w:themeColor="accent2" w:themeShade="BF"/>
+          <w:szCs w:val="22"/>
+        </w:rPr>
+        <w:t>new</w:t>
+      </w:r>
+      <w:proofErr w:type="spellEnd"/>
+      <w:r>
+        <w:rPr>
+          <w:rFonts w:asciiTheme="majorHAnsi" w:hAnsiTheme="majorHAnsi"/>
+          <w:b/>
+          <w:bCs/>
+          <w:color w:val="BF4E14" w:themeColor="accent2" w:themeShade="BF"/>
+          <w:szCs w:val="22"/>
+        </w:rPr>
+        <w:t xml:space="preserve"> </w:t>
+      </w:r>
+      <w:proofErr w:type="spellStart"/>
+      <w:r>
+        <w:rPr>
+          <w:rFonts w:asciiTheme="majorHAnsi" w:hAnsiTheme="majorHAnsi"/>
+          <w:b/>
+          <w:bCs/>
+          <w:color w:val="BF4E14" w:themeColor="accent2" w:themeShade="BF"/>
+          <w:szCs w:val="22"/>
+        </w:rPr>
+        <w:t>int</w:t>
+      </w:r>
+      <w:proofErr w:type="spellEnd"/>
+      <w:r>
+        <w:rPr>
+          <w:rFonts w:asciiTheme="majorHAnsi" w:hAnsiTheme="majorHAnsi"/>
+          <w:b/>
+          <w:bCs/>
+          <w:color w:val="BF4E14" w:themeColor="accent2" w:themeShade="BF"/>
+          <w:szCs w:val="22"/>
+        </w:rPr>
         <w:t>[</w:t>
       </w:r>
-      <w:proofErr w:type="gramEnd"/>
-      <w:r>
-        <w:rPr>
-          <w:rFonts w:asciiTheme="majorHAnsi" w:hAnsiTheme="majorHAnsi"/>
-          <w:b/>
-          <w:bCs/>
-          <w:color w:val="BF4E14" w:themeColor="accent2" w:themeShade="BF"/>
-          <w:szCs w:val="22"/>
-        </w:rPr>
-        <w:t xml:space="preserve">] </w:t>
-      </w:r>
       <w:proofErr w:type="spellStart"/>
-      <w:r>
-        <w:rPr>
-          <w:rFonts w:asciiTheme="majorHAnsi" w:hAnsiTheme="majorHAnsi"/>
-          <w:b/>
-          <w:bCs/>
-          <w:color w:val="BF4E14" w:themeColor="accent2" w:themeShade="BF"/>
-          <w:szCs w:val="22"/>
-        </w:rPr>
-        <w:t>wystapienia</w:t>
-      </w:r>
-      <w:proofErr w:type="spellEnd"/>
-      <w:r>
-        <w:rPr>
-          <w:rFonts w:asciiTheme="majorHAnsi" w:hAnsiTheme="majorHAnsi"/>
-          <w:b/>
-          <w:bCs/>
-          <w:color w:val="BF4E14" w:themeColor="accent2" w:themeShade="BF"/>
-          <w:szCs w:val="22"/>
-        </w:rPr>
-        <w:t xml:space="preserve"> = </w:t>
-      </w:r>
-      <w:proofErr w:type="spellStart"/>
-      <w:r>
-        <w:rPr>
-          <w:rFonts w:asciiTheme="majorHAnsi" w:hAnsiTheme="majorHAnsi"/>
-          <w:b/>
-          <w:bCs/>
-          <w:color w:val="BF4E14" w:themeColor="accent2" w:themeShade="BF"/>
-          <w:szCs w:val="22"/>
-        </w:rPr>
-        <w:t>new</w:t>
-      </w:r>
-      <w:proofErr w:type="spellEnd"/>
-      <w:r>
-        <w:rPr>
-          <w:rFonts w:asciiTheme="majorHAnsi" w:hAnsiTheme="majorHAnsi"/>
-          <w:b/>
-          <w:bCs/>
-          <w:color w:val="BF4E14" w:themeColor="accent2" w:themeShade="BF"/>
-          <w:szCs w:val="22"/>
-        </w:rPr>
-        <w:t xml:space="preserve"> </w:t>
-      </w:r>
-      <w:proofErr w:type="spellStart"/>
-      <w:proofErr w:type="gramStart"/>
-      <w:r>
-        <w:rPr>
-          <w:rFonts w:asciiTheme="majorHAnsi" w:hAnsiTheme="majorHAnsi"/>
-          <w:b/>
-          <w:bCs/>
-          <w:color w:val="BF4E14" w:themeColor="accent2" w:themeShade="BF"/>
-          <w:szCs w:val="22"/>
-        </w:rPr>
-        <w:t>int</w:t>
-      </w:r>
-      <w:proofErr w:type="spellEnd"/>
-      <w:r>
-        <w:rPr>
-          <w:rFonts w:asciiTheme="majorHAnsi" w:hAnsiTheme="majorHAnsi"/>
-          <w:b/>
-          <w:bCs/>
-          <w:color w:val="BF4E14" w:themeColor="accent2" w:themeShade="BF"/>
-          <w:szCs w:val="22"/>
-        </w:rPr>
-        <w:t>[</w:t>
-      </w:r>
-      <w:proofErr w:type="spellStart"/>
-      <w:proofErr w:type="gramEnd"/>
       <w:r>
         <w:rPr>
           <w:rFonts w:asciiTheme="majorHAnsi" w:hAnsiTheme="majorHAnsi"/>
@@ -4140,7 +3961,6 @@
         </w:rPr>
       </w:pPr>
       <w:proofErr w:type="spellStart"/>
-      <w:proofErr w:type="gramStart"/>
       <w:r>
         <w:rPr>
           <w:rFonts w:asciiTheme="majorHAnsi" w:hAnsiTheme="majorHAnsi"/>
@@ -4160,40 +3980,7 @@
           <w:color w:val="BF4E14" w:themeColor="accent2" w:themeShade="BF"/>
           <w:szCs w:val="22"/>
         </w:rPr>
-        <w:t>[losowania[i,</w:t>
-      </w:r>
-      <w:proofErr w:type="gramEnd"/>
-      <w:r>
-        <w:rPr>
-          <w:rFonts w:asciiTheme="majorHAnsi" w:hAnsiTheme="majorHAnsi"/>
-          <w:b/>
-          <w:bCs/>
-          <w:color w:val="BF4E14" w:themeColor="accent2" w:themeShade="BF"/>
-          <w:szCs w:val="22"/>
-        </w:rPr>
-        <w:t xml:space="preserve"> j] - </w:t>
-      </w:r>
-      <w:proofErr w:type="gramStart"/>
-      <w:r>
-        <w:rPr>
-          <w:rFonts w:asciiTheme="majorHAnsi" w:hAnsiTheme="majorHAnsi"/>
-          <w:b/>
-          <w:bCs/>
-          <w:color w:val="BF4E14" w:themeColor="accent2" w:themeShade="BF"/>
-          <w:szCs w:val="22"/>
-        </w:rPr>
-        <w:t>1]+</w:t>
-      </w:r>
-      <w:proofErr w:type="gramEnd"/>
-      <w:r>
-        <w:rPr>
-          <w:rFonts w:asciiTheme="majorHAnsi" w:hAnsiTheme="majorHAnsi"/>
-          <w:b/>
-          <w:bCs/>
-          <w:color w:val="BF4E14" w:themeColor="accent2" w:themeShade="BF"/>
-          <w:szCs w:val="22"/>
-        </w:rPr>
-        <w:t xml:space="preserve">+ </w:t>
+        <w:t xml:space="preserve">[losowania[i, j] - 1]++ </w:t>
       </w:r>
       <w:r>
         <w:rPr>
@@ -4252,29 +4039,7 @@
           <w:color w:val="BF4E14" w:themeColor="accent2" w:themeShade="BF"/>
           <w:szCs w:val="22"/>
         </w:rPr>
-        <w:t>(</w:t>
-      </w:r>
-      <w:proofErr w:type="gramStart"/>
-      <w:r>
-        <w:rPr>
-          <w:rFonts w:asciiTheme="majorHAnsi" w:hAnsiTheme="majorHAnsi"/>
-          <w:b/>
-          <w:bCs/>
-          <w:color w:val="BF4E14" w:themeColor="accent2" w:themeShade="BF"/>
-          <w:szCs w:val="22"/>
-        </w:rPr>
-        <w:t>losowania[i,</w:t>
-      </w:r>
-      <w:proofErr w:type="gramEnd"/>
-      <w:r>
-        <w:rPr>
-          <w:rFonts w:asciiTheme="majorHAnsi" w:hAnsiTheme="majorHAnsi"/>
-          <w:b/>
-          <w:bCs/>
-          <w:color w:val="BF4E14" w:themeColor="accent2" w:themeShade="BF"/>
-          <w:szCs w:val="22"/>
-        </w:rPr>
-        <w:t xml:space="preserve"> j] + " ")</w:t>
+        <w:t>(losowania[i, j] + " ")</w:t>
       </w:r>
       <w:r>
         <w:rPr>
@@ -4962,17 +4727,12 @@
               <w:t xml:space="preserve">Wywołuje </w:t>
             </w:r>
             <w:proofErr w:type="spellStart"/>
-            <w:proofErr w:type="gramStart"/>
             <w:r>
               <w:t>LosujZestaw</w:t>
             </w:r>
             <w:proofErr w:type="spellEnd"/>
             <w:r>
-              <w:t>(</w:t>
-            </w:r>
-            <w:proofErr w:type="gramEnd"/>
-            <w:r>
-              <w:t xml:space="preserve">) i sprawdza </w:t>
+              <w:t xml:space="preserve">() i sprawdza </w:t>
             </w:r>
             <w:proofErr w:type="spellStart"/>
             <w:r>
@@ -4983,12 +4743,10 @@
               <w:t xml:space="preserve">(6, </w:t>
             </w:r>
             <w:proofErr w:type="spellStart"/>
-            <w:proofErr w:type="gramStart"/>
             <w:r>
               <w:t>zestaw.Length</w:t>
             </w:r>
             <w:proofErr w:type="spellEnd"/>
-            <w:proofErr w:type="gramEnd"/>
             <w:r>
               <w:t>).</w:t>
             </w:r>
@@ -5078,17 +4836,12 @@
               <w:t xml:space="preserve">Losuje 1000 zestawów. </w:t>
             </w:r>
             <w:proofErr w:type="spellStart"/>
-            <w:proofErr w:type="gramStart"/>
             <w:r>
               <w:t>Distinct</w:t>
             </w:r>
             <w:proofErr w:type="spellEnd"/>
             <w:r>
-              <w:t>(</w:t>
-            </w:r>
-            <w:proofErr w:type="gramEnd"/>
-            <w:r>
-              <w:t>) usuwa powtórzenia, więc liczba elementów po jego zastosowaniu musi być równa długości zestawu.</w:t>
+              <w:t>() usuwa powtórzenia, więc liczba elementów po jego zastosowaniu musi być równa długości zestawu.</w:t>
             </w:r>
           </w:p>
         </w:tc>
@@ -5272,17 +5025,12 @@
               <w:t xml:space="preserve">Dane zawierają liczbę 50, spoza zakresu. Metoda próbuje zwiększyć </w:t>
             </w:r>
             <w:proofErr w:type="spellStart"/>
-            <w:proofErr w:type="gramStart"/>
             <w:r>
               <w:t>wystapienia</w:t>
             </w:r>
             <w:proofErr w:type="spellEnd"/>
             <w:r>
-              <w:t>[</w:t>
-            </w:r>
-            <w:proofErr w:type="gramEnd"/>
-            <w:r>
-              <w:t xml:space="preserve">49], ale tablica ma indeksy 0–48. </w:t>
+              <w:t xml:space="preserve">[49], ale tablica ma indeksy 0–48. </w:t>
             </w:r>
             <w:proofErr w:type="spellStart"/>
             <w:r>
@@ -5876,30 +5624,20 @@
               <w:t xml:space="preserve">Wywołuje </w:t>
             </w:r>
             <w:proofErr w:type="spellStart"/>
-            <w:proofErr w:type="gramStart"/>
             <w:r>
               <w:t>LosujZestaw</w:t>
             </w:r>
             <w:proofErr w:type="spellEnd"/>
             <w:r>
-              <w:t>(</w:t>
-            </w:r>
-            <w:proofErr w:type="gramEnd"/>
-            <w:r>
-              <w:t xml:space="preserve">) wielokrotnie, przekazuje uzyskane dane do </w:t>
+              <w:t xml:space="preserve">() wielokrotnie, przekazuje uzyskane dane do </w:t>
             </w:r>
             <w:proofErr w:type="spellStart"/>
-            <w:proofErr w:type="gramStart"/>
             <w:r>
               <w:t>WyswietlLosowania</w:t>
             </w:r>
             <w:proofErr w:type="spellEnd"/>
             <w:r>
-              <w:t>(</w:t>
-            </w:r>
-            <w:proofErr w:type="gramEnd"/>
-            <w:r>
-              <w:t xml:space="preserve">) i przechwytuje wyjście konsoli za pomocą </w:t>
+              <w:t xml:space="preserve">() i przechwytuje wyjście konsoli za pomocą </w:t>
             </w:r>
             <w:proofErr w:type="spellStart"/>
             <w:r>
@@ -6092,15 +5830,7 @@
               <w:cnfStyle w:val="000000100000" w:firstRow="0" w:lastRow="0" w:firstColumn="0" w:lastColumn="0" w:oddVBand="0" w:evenVBand="0" w:oddHBand="1" w:evenHBand="0" w:firstRowFirstColumn="0" w:firstRowLastColumn="0" w:lastRowFirstColumn="0" w:lastRowLastColumn="0"/>
             </w:pPr>
             <w:r>
-              <w:t xml:space="preserve">Generuje znaną liczbę zestawów (np. 5) i weryfikuje w wypisanym strumieniu </w:t>
-            </w:r>
-            <w:proofErr w:type="gramStart"/>
-            <w:r>
-              <w:t>wyjściowym,</w:t>
-            </w:r>
-            <w:proofErr w:type="gramEnd"/>
-            <w:r>
-              <w:t xml:space="preserve"> czy łączna suma wystąpień wszystkich liczb wynosi dokładnie </w:t>
+              <w:t xml:space="preserve">Generuje znaną liczbę zestawów (np. 5) i weryfikuje w wypisanym strumieniu wyjściowym, czy łączna suma wystąpień wszystkich liczb wynosi dokładnie </w:t>
             </w:r>
             <m:oMath>
               <m:r>
@@ -6815,23 +6545,7 @@
               <w:cnfStyle w:val="000000000000" w:firstRow="0" w:lastRow="0" w:firstColumn="0" w:lastColumn="0" w:oddVBand="0" w:evenVBand="0" w:oddHBand="0" w:evenHBand="0" w:firstRowFirstColumn="0" w:firstRowLastColumn="0" w:lastRowFirstColumn="0" w:lastRowLastColumn="0"/>
             </w:pPr>
             <w:r>
-              <w:t xml:space="preserve">Wyjście systemu zawiera dokładnie 3 linie z nagłówkami Losowanie </w:t>
-            </w:r>
-            <w:proofErr w:type="gramStart"/>
-            <w:r>
-              <w:t>1:,</w:t>
-            </w:r>
-            <w:proofErr w:type="gramEnd"/>
-            <w:r>
-              <w:t xml:space="preserve"> Losowanie </w:t>
-            </w:r>
-            <w:proofErr w:type="gramStart"/>
-            <w:r>
-              <w:t>2:,</w:t>
-            </w:r>
-            <w:proofErr w:type="gramEnd"/>
-            <w:r>
-              <w:t xml:space="preserve"> Losowanie 3: oraz pełną listę 49 statystyk. Test zdany.</w:t>
+              <w:t>Wyjście systemu zawiera dokładnie 3 linie z nagłówkami Losowanie 1:, Losowanie 2:, Losowanie 3: oraz pełną listę 49 statystyk. Test zdany.</w:t>
             </w:r>
           </w:p>
         </w:tc>
@@ -7378,16 +7092,17 @@
     <w:tbl>
       <w:tblPr>
         <w:tblStyle w:val="Zwykatabela1"/>
-        <w:tblW w:w="9924" w:type="dxa"/>
+        <w:tblW w:w="10206" w:type="dxa"/>
+        <w:tblInd w:w="-572" w:type="dxa"/>
         <w:tblLayout w:type="fixed"/>
         <w:tblLook w:val="04A0" w:firstRow="1" w:lastRow="0" w:firstColumn="1" w:lastColumn="0" w:noHBand="0" w:noVBand="1"/>
       </w:tblPr>
       <w:tblGrid>
-        <w:gridCol w:w="284"/>
-        <w:gridCol w:w="1276"/>
-        <w:gridCol w:w="2552"/>
-        <w:gridCol w:w="2268"/>
-        <w:gridCol w:w="3544"/>
+        <w:gridCol w:w="283"/>
+        <w:gridCol w:w="1277"/>
+        <w:gridCol w:w="2409"/>
+        <w:gridCol w:w="3119"/>
+        <w:gridCol w:w="3118"/>
       </w:tblGrid>
       <w:tr>
         <w:trPr>
@@ -7397,7 +7112,7 @@
         <w:tc>
           <w:tcPr>
             <w:cnfStyle w:val="001000000000" w:firstRow="0" w:lastRow="0" w:firstColumn="1" w:lastColumn="0" w:oddVBand="0" w:evenVBand="0" w:oddHBand="0" w:evenHBand="0" w:firstRowFirstColumn="0" w:firstRowLastColumn="0" w:lastRowFirstColumn="0" w:lastRowLastColumn="0"/>
-            <w:tcW w:w="284" w:type="dxa"/>
+            <w:tcW w:w="283" w:type="dxa"/>
             <w:hideMark/>
           </w:tcPr>
           <w:p>
@@ -7411,7 +7126,7 @@
         </w:tc>
         <w:tc>
           <w:tcPr>
-            <w:tcW w:w="1276" w:type="dxa"/>
+            <w:tcW w:w="1277" w:type="dxa"/>
             <w:hideMark/>
           </w:tcPr>
           <w:p>
@@ -7426,7 +7141,7 @@
         </w:tc>
         <w:tc>
           <w:tcPr>
-            <w:tcW w:w="2552" w:type="dxa"/>
+            <w:tcW w:w="2409" w:type="dxa"/>
             <w:hideMark/>
           </w:tcPr>
           <w:p>
@@ -7441,7 +7156,7 @@
         </w:tc>
         <w:tc>
           <w:tcPr>
-            <w:tcW w:w="2268" w:type="dxa"/>
+            <w:tcW w:w="3119" w:type="dxa"/>
             <w:hideMark/>
           </w:tcPr>
           <w:p>
@@ -7456,7 +7171,7 @@
         </w:tc>
         <w:tc>
           <w:tcPr>
-            <w:tcW w:w="3544" w:type="dxa"/>
+            <w:tcW w:w="3118" w:type="dxa"/>
             <w:hideMark/>
           </w:tcPr>
           <w:p>
@@ -7477,7 +7192,7 @@
         <w:tc>
           <w:tcPr>
             <w:cnfStyle w:val="001000000000" w:firstRow="0" w:lastRow="0" w:firstColumn="1" w:lastColumn="0" w:oddVBand="0" w:evenVBand="0" w:oddHBand="0" w:evenHBand="0" w:firstRowFirstColumn="0" w:firstRowLastColumn="0" w:lastRowFirstColumn="0" w:lastRowLastColumn="0"/>
-            <w:tcW w:w="284" w:type="dxa"/>
+            <w:tcW w:w="283" w:type="dxa"/>
             <w:hideMark/>
           </w:tcPr>
           <w:p>
@@ -7491,7 +7206,7 @@
         </w:tc>
         <w:tc>
           <w:tcPr>
-            <w:tcW w:w="1276" w:type="dxa"/>
+            <w:tcW w:w="1277" w:type="dxa"/>
             <w:hideMark/>
           </w:tcPr>
           <w:p>
@@ -7506,7 +7221,7 @@
         </w:tc>
         <w:tc>
           <w:tcPr>
-            <w:tcW w:w="2552" w:type="dxa"/>
+            <w:tcW w:w="2409" w:type="dxa"/>
             <w:hideMark/>
           </w:tcPr>
           <w:p>
@@ -7521,7 +7236,7 @@
         </w:tc>
         <w:tc>
           <w:tcPr>
-            <w:tcW w:w="2268" w:type="dxa"/>
+            <w:tcW w:w="3119" w:type="dxa"/>
             <w:hideMark/>
           </w:tcPr>
           <w:p>
@@ -7536,7 +7251,7 @@
         </w:tc>
         <w:tc>
           <w:tcPr>
-            <w:tcW w:w="3544" w:type="dxa"/>
+            <w:tcW w:w="3118" w:type="dxa"/>
             <w:hideMark/>
           </w:tcPr>
           <w:p>
@@ -7553,44 +7268,23 @@
             <w:r>
               <w:t>1</w:t>
             </w:r>
-            <w:proofErr w:type="gramStart"/>
             <w:r>
               <w:t xml:space="preserve">: </w:t>
             </w:r>
             <w:r>
-              <w:t>,</w:t>
-            </w:r>
-            <w:proofErr w:type="gramEnd"/>
-            <w:r>
-              <w:t xml:space="preserve"> Losowanie 2</w:t>
-            </w:r>
-            <w:proofErr w:type="gramStart"/>
-            <w:r>
-              <w:t>:</w:t>
+              <w:t>, Losowanie 2:</w:t>
             </w:r>
             <w:r>
               <w:t xml:space="preserve"> </w:t>
             </w:r>
             <w:r>
-              <w:t>,</w:t>
-            </w:r>
-            <w:proofErr w:type="gramEnd"/>
-            <w:r>
-              <w:t xml:space="preserve"> Losowanie 3</w:t>
-            </w:r>
-            <w:proofErr w:type="gramStart"/>
-            <w:r>
-              <w:t>:</w:t>
+              <w:t>, Losowanie 3:</w:t>
             </w:r>
             <w:r>
               <w:t xml:space="preserve"> </w:t>
             </w:r>
             <w:r>
-              <w:t>.</w:t>
-            </w:r>
-            <w:proofErr w:type="gramEnd"/>
-            <w:r>
-              <w:t xml:space="preserve"> Test zdany.</w:t>
+              <w:t>. Test zdany.</w:t>
             </w:r>
           </w:p>
         </w:tc>
@@ -7599,7 +7293,7 @@
         <w:tc>
           <w:tcPr>
             <w:cnfStyle w:val="001000000000" w:firstRow="0" w:lastRow="0" w:firstColumn="1" w:lastColumn="0" w:oddVBand="0" w:evenVBand="0" w:oddHBand="0" w:evenHBand="0" w:firstRowFirstColumn="0" w:firstRowLastColumn="0" w:lastRowFirstColumn="0" w:lastRowLastColumn="0"/>
-            <w:tcW w:w="284" w:type="dxa"/>
+            <w:tcW w:w="283" w:type="dxa"/>
             <w:hideMark/>
           </w:tcPr>
           <w:p>
@@ -7613,7 +7307,7 @@
         </w:tc>
         <w:tc>
           <w:tcPr>
-            <w:tcW w:w="1276" w:type="dxa"/>
+            <w:tcW w:w="1277" w:type="dxa"/>
             <w:hideMark/>
           </w:tcPr>
           <w:p>
@@ -7628,7 +7322,7 @@
         </w:tc>
         <w:tc>
           <w:tcPr>
-            <w:tcW w:w="2552" w:type="dxa"/>
+            <w:tcW w:w="2409" w:type="dxa"/>
             <w:hideMark/>
           </w:tcPr>
           <w:p>
@@ -7645,7 +7339,7 @@
         </w:tc>
         <w:tc>
           <w:tcPr>
-            <w:tcW w:w="2268" w:type="dxa"/>
+            <w:tcW w:w="3119" w:type="dxa"/>
             <w:hideMark/>
           </w:tcPr>
           <w:p>
@@ -7660,7 +7354,7 @@
         </w:tc>
         <w:tc>
           <w:tcPr>
-            <w:tcW w:w="3544" w:type="dxa"/>
+            <w:tcW w:w="3118" w:type="dxa"/>
             <w:hideMark/>
           </w:tcPr>
           <w:p>
@@ -7681,7 +7375,7 @@
         <w:tc>
           <w:tcPr>
             <w:cnfStyle w:val="001000000000" w:firstRow="0" w:lastRow="0" w:firstColumn="1" w:lastColumn="0" w:oddVBand="0" w:evenVBand="0" w:oddHBand="0" w:evenHBand="0" w:firstRowFirstColumn="0" w:firstRowLastColumn="0" w:lastRowFirstColumn="0" w:lastRowLastColumn="0"/>
-            <w:tcW w:w="284" w:type="dxa"/>
+            <w:tcW w:w="283" w:type="dxa"/>
           </w:tcPr>
           <w:p>
             <w:pPr>
@@ -7701,7 +7395,7 @@
         </w:tc>
         <w:tc>
           <w:tcPr>
-            <w:tcW w:w="1276" w:type="dxa"/>
+            <w:tcW w:w="1277" w:type="dxa"/>
           </w:tcPr>
           <w:p>
             <w:pPr>
@@ -7714,7 +7408,7 @@
         </w:tc>
         <w:tc>
           <w:tcPr>
-            <w:tcW w:w="2552" w:type="dxa"/>
+            <w:tcW w:w="2409" w:type="dxa"/>
           </w:tcPr>
           <w:p>
             <w:pPr>
@@ -7727,7 +7421,7 @@
         </w:tc>
         <w:tc>
           <w:tcPr>
-            <w:tcW w:w="2268" w:type="dxa"/>
+            <w:tcW w:w="3119" w:type="dxa"/>
           </w:tcPr>
           <w:p>
             <w:pPr>
@@ -7740,22 +7434,14 @@
         </w:tc>
         <w:tc>
           <w:tcPr>
-            <w:tcW w:w="3544" w:type="dxa"/>
+            <w:tcW w:w="3118" w:type="dxa"/>
           </w:tcPr>
           <w:p>
             <w:pPr>
               <w:cnfStyle w:val="000000100000" w:firstRow="0" w:lastRow="0" w:firstColumn="0" w:lastColumn="0" w:oddVBand="0" w:evenVBand="0" w:oddHBand="1" w:evenHBand="0" w:firstRowFirstColumn="0" w:firstRowLastColumn="0" w:lastRowFirstColumn="0" w:lastRowLastColumn="0"/>
             </w:pPr>
             <w:r>
-              <w:t xml:space="preserve">Wynik zawiera kompletne statystyki od Wystąpienia liczby 1: do Wystąpienia liczby </w:t>
-            </w:r>
-            <w:proofErr w:type="gramStart"/>
-            <w:r>
-              <w:t>49:.</w:t>
-            </w:r>
-            <w:proofErr w:type="gramEnd"/>
-            <w:r>
-              <w:t xml:space="preserve"> Test zdany.</w:t>
+              <w:t>Wynik zawiera kompletne statystyki od Wystąpienia liczby 1: do Wystąpienia liczby 49:. Test zdany.</w:t>
             </w:r>
           </w:p>
         </w:tc>
@@ -7764,7 +7450,7 @@
         <w:tc>
           <w:tcPr>
             <w:cnfStyle w:val="001000000000" w:firstRow="0" w:lastRow="0" w:firstColumn="1" w:lastColumn="0" w:oddVBand="0" w:evenVBand="0" w:oddHBand="0" w:evenHBand="0" w:firstRowFirstColumn="0" w:firstRowLastColumn="0" w:lastRowFirstColumn="0" w:lastRowLastColumn="0"/>
-            <w:tcW w:w="284" w:type="dxa"/>
+            <w:tcW w:w="283" w:type="dxa"/>
           </w:tcPr>
           <w:p>
             <w:pPr>
@@ -7784,52 +7470,180 @@
         </w:tc>
         <w:tc>
           <w:tcPr>
-            <w:tcW w:w="1276" w:type="dxa"/>
+            <w:tcW w:w="1277" w:type="dxa"/>
           </w:tcPr>
           <w:p>
             <w:pPr>
               <w:cnfStyle w:val="000000000000" w:firstRow="0" w:lastRow="0" w:firstColumn="0" w:lastColumn="0" w:oddVBand="0" w:evenVBand="0" w:oddHBand="0" w:evenHBand="0" w:firstRowFirstColumn="0" w:firstRowLastColumn="0" w:lastRowFirstColumn="0" w:lastRowLastColumn="0"/>
             </w:pPr>
+            <w:r>
+              <w:t>niepoprawny</w:t>
+            </w:r>
           </w:p>
         </w:tc>
         <w:tc>
           <w:tcPr>
-            <w:tcW w:w="2552" w:type="dxa"/>
+            <w:tcW w:w="2409" w:type="dxa"/>
           </w:tcPr>
           <w:p>
             <w:pPr>
               <w:cnfStyle w:val="000000000000" w:firstRow="0" w:lastRow="0" w:firstColumn="0" w:lastColumn="0" w:oddVBand="0" w:evenVBand="0" w:oddHBand="0" w:evenHBand="0" w:firstRowFirstColumn="0" w:firstRowLastColumn="0" w:lastRowFirstColumn="0" w:lastRowLastColumn="0"/>
             </w:pPr>
+            <w:r>
+              <w:t>Akceptacyjny_UzytkownikWpisujeBledneDane_OtrzymujeCzytelnyKomunikat</w:t>
+            </w:r>
           </w:p>
         </w:tc>
         <w:tc>
           <w:tcPr>
-            <w:tcW w:w="2268" w:type="dxa"/>
+            <w:tcW w:w="3119" w:type="dxa"/>
           </w:tcPr>
           <w:p>
             <w:pPr>
               <w:cnfStyle w:val="000000000000" w:firstRow="0" w:lastRow="0" w:firstColumn="0" w:lastColumn="0" w:oddVBand="0" w:evenVBand="0" w:oddHBand="0" w:evenHBand="0" w:firstRowFirstColumn="0" w:firstRowLastColumn="0" w:lastRowFirstColumn="0" w:lastRowLastColumn="0"/>
             </w:pPr>
+            <w:r>
+              <w:t>Symuluje sytuację, w której użytkownik wpisuje niepoprawne dane (np. tekst "zero" lub liczbę 0).</w:t>
+            </w:r>
           </w:p>
         </w:tc>
         <w:tc>
           <w:tcPr>
-            <w:tcW w:w="3544" w:type="dxa"/>
+            <w:tcW w:w="3118" w:type="dxa"/>
           </w:tcPr>
           <w:p>
             <w:pPr>
               <w:cnfStyle w:val="000000000000" w:firstRow="0" w:lastRow="0" w:firstColumn="0" w:lastColumn="0" w:oddVBand="0" w:evenVBand="0" w:oddHBand="0" w:evenHBand="0" w:firstRowFirstColumn="0" w:firstRowLastColumn="0" w:lastRowFirstColumn="0" w:lastRowLastColumn="0"/>
             </w:pPr>
+            <w:r>
+              <w:t>Aplikacja wyświetla zrozumiały komunikat o błędzie i nie generuje błędnych losowań. Test zdany.</w:t>
+            </w:r>
           </w:p>
         </w:tc>
       </w:tr>
     </w:tbl>
     <w:p/>
     <w:p/>
-    <w:p/>
-    <w:p/>
-    <w:p/>
-    <w:p/>
+    <w:p>
+      <w:pPr>
+        <w:jc w:val="center"/>
+      </w:pPr>
+      <w:r>
+        <w:lastRenderedPageBreak/>
+        <w:drawing>
+          <wp:inline distT="0" distB="0" distL="0" distR="0" wp14:anchorId="0F67D1E6" wp14:editId="1ADD720C">
+            <wp:extent cx="4400550" cy="2302510"/>
+            <wp:effectExtent l="0" t="0" r="0" b="2540"/>
+            <wp:docPr id="673305311" name="Obraz 1"/>
+            <wp:cNvGraphicFramePr>
+              <a:graphicFrameLocks xmlns:a="http://schemas.openxmlformats.org/drawingml/2006/main" noChangeAspect="1"/>
+            </wp:cNvGraphicFramePr>
+            <a:graphic xmlns:a="http://schemas.openxmlformats.org/drawingml/2006/main">
+              <a:graphicData uri="http://schemas.openxmlformats.org/drawingml/2006/picture">
+                <pic:pic xmlns:pic="http://schemas.openxmlformats.org/drawingml/2006/picture">
+                  <pic:nvPicPr>
+                    <pic:cNvPr id="673305311" name=""/>
+                    <pic:cNvPicPr/>
+                  </pic:nvPicPr>
+                  <pic:blipFill>
+                    <a:blip r:embed="rId21"/>
+                    <a:stretch>
+                      <a:fillRect/>
+                    </a:stretch>
+                  </pic:blipFill>
+                  <pic:spPr>
+                    <a:xfrm>
+                      <a:off x="0" y="0"/>
+                      <a:ext cx="4414450" cy="2309783"/>
+                    </a:xfrm>
+                    <a:prstGeom prst="rect">
+                      <a:avLst/>
+                    </a:prstGeom>
+                  </pic:spPr>
+                </pic:pic>
+              </a:graphicData>
+            </a:graphic>
+          </wp:inline>
+        </w:drawing>
+      </w:r>
+      <w:r>
+        <w:drawing>
+          <wp:inline distT="0" distB="0" distL="0" distR="0" wp14:anchorId="72F20CB4" wp14:editId="23BE8D93">
+            <wp:extent cx="5114925" cy="6476079"/>
+            <wp:effectExtent l="0" t="0" r="0" b="1270"/>
+            <wp:docPr id="2114917434" name="Obraz 1"/>
+            <wp:cNvGraphicFramePr>
+              <a:graphicFrameLocks xmlns:a="http://schemas.openxmlformats.org/drawingml/2006/main" noChangeAspect="1"/>
+            </wp:cNvGraphicFramePr>
+            <a:graphic xmlns:a="http://schemas.openxmlformats.org/drawingml/2006/main">
+              <a:graphicData uri="http://schemas.openxmlformats.org/drawingml/2006/picture">
+                <pic:pic xmlns:pic="http://schemas.openxmlformats.org/drawingml/2006/picture">
+                  <pic:nvPicPr>
+                    <pic:cNvPr id="2114917434" name=""/>
+                    <pic:cNvPicPr/>
+                  </pic:nvPicPr>
+                  <pic:blipFill>
+                    <a:blip r:embed="rId22"/>
+                    <a:stretch>
+                      <a:fillRect/>
+                    </a:stretch>
+                  </pic:blipFill>
+                  <pic:spPr>
+                    <a:xfrm>
+                      <a:off x="0" y="0"/>
+                      <a:ext cx="5190342" cy="6571566"/>
+                    </a:xfrm>
+                    <a:prstGeom prst="rect">
+                      <a:avLst/>
+                    </a:prstGeom>
+                  </pic:spPr>
+                </pic:pic>
+              </a:graphicData>
+            </a:graphic>
+          </wp:inline>
+        </w:drawing>
+      </w:r>
+    </w:p>
+    <w:p>
+      <w:r>
+        <w:lastRenderedPageBreak/>
+        <w:drawing>
+          <wp:inline distT="0" distB="0" distL="0" distR="0" wp14:anchorId="405D3F12" wp14:editId="742F1AC3">
+            <wp:extent cx="5760720" cy="4472940"/>
+            <wp:effectExtent l="0" t="0" r="0" b="3810"/>
+            <wp:docPr id="2145640888" name="Obraz 1"/>
+            <wp:cNvGraphicFramePr>
+              <a:graphicFrameLocks xmlns:a="http://schemas.openxmlformats.org/drawingml/2006/main" noChangeAspect="1"/>
+            </wp:cNvGraphicFramePr>
+            <a:graphic xmlns:a="http://schemas.openxmlformats.org/drawingml/2006/main">
+              <a:graphicData uri="http://schemas.openxmlformats.org/drawingml/2006/picture">
+                <pic:pic xmlns:pic="http://schemas.openxmlformats.org/drawingml/2006/picture">
+                  <pic:nvPicPr>
+                    <pic:cNvPr id="2145640888" name=""/>
+                    <pic:cNvPicPr/>
+                  </pic:nvPicPr>
+                  <pic:blipFill>
+                    <a:blip r:embed="rId23"/>
+                    <a:stretch>
+                      <a:fillRect/>
+                    </a:stretch>
+                  </pic:blipFill>
+                  <pic:spPr>
+                    <a:xfrm>
+                      <a:off x="0" y="0"/>
+                      <a:ext cx="5760720" cy="4472940"/>
+                    </a:xfrm>
+                    <a:prstGeom prst="rect">
+                      <a:avLst/>
+                    </a:prstGeom>
+                  </pic:spPr>
+                </pic:pic>
+              </a:graphicData>
+            </a:graphic>
+          </wp:inline>
+        </w:drawing>
+      </w:r>
+    </w:p>
     <w:p/>
     <w:p>
       <w:pPr>
@@ -7853,7 +7667,7 @@
     </w:p>
     <w:p/>
     <w:sectPr>
-      <w:footerReference w:type="default" r:id="rId21"/>
+      <w:footerReference w:type="default" r:id="rId24"/>
       <w:pgSz w:w="11906" w:h="16838"/>
       <w:pgMar w:top="1417" w:right="1417" w:bottom="1417" w:left="1417" w:header="708" w:footer="708" w:gutter="0"/>
       <w:cols w:space="708"/>

</xml_diff>